<commit_message>
Rebuild Word version of DSS manuscript with fixed tables and validated formatting
Co-Authored-By: Claude Sonnet 5.5 <noreply@anthropic.com>
Claude-Session: https://claude.ai/code/session_01CmDdfYCJkX1v32uwdfkXMf
</commit_message>
<xml_diff>
--- a/manuscript/dss_manuscript.docx
+++ b/manuscript/dss_manuscript.docx
@@ -6606,20 +6606,8 @@
                 <w:rFonts w:ascii="Times New Roman" w:hAnsi="Times New Roman"/>
                 <w:sz w:val="20"/>
               </w:rPr>
-              <w:t xml:space="preserve">Drift</w:t>
-            </w:r>
-            <w:r>
-              <w:rPr>
-                <w:rFonts w:ascii="Times New Roman" w:hAnsi="Times New Roman"/>
-                <w:sz w:val="20"/>
-              </w:rPr>
-              <w:t xml:space="preserve"> </w:t>
-            </w:r>
-            <m:oMath>
-              <m:r>
-                <m:t>s</m:t>
-              </m:r>
-            </m:oMath>
+              <w:t xml:space="preserve">Drift s</w:t>
+            </w:r>
           </w:p>
         </w:tc>
         <w:tc>
@@ -6749,29 +6737,16 @@
                 <w:rFonts w:ascii="Times New Roman" w:hAnsi="Times New Roman"/>
                 <w:sz w:val="20"/>
               </w:rPr>
-              <w:t xml:space="preserve">Copy</w:t>
+              <w:t xml:space="preserve">Copy R</w:t>
             </w:r>
             <w:r>
               <w:rPr>
                 <w:rFonts w:ascii="Times New Roman" w:hAnsi="Times New Roman"/>
                 <w:sz w:val="20"/>
-              </w:rPr>
-              <w:t xml:space="preserve"> </w:t>
-            </w:r>
-            <m:oMath>
-              <m:sSub>
-                <m:e>
-                  <m:r>
-                    <m:t>R</m:t>
-                  </m:r>
-                </m:e>
-                <m:sub>
-                  <m:r>
-                    <m:t>C</m:t>
-                  </m:r>
-                </m:sub>
-              </m:sSub>
-            </m:oMath>
+                <w:vertAlign w:val="subscript"/>
+              </w:rPr>
+              <w:t xml:space="preserve">C</w:t>
+            </w:r>
           </w:p>
         </w:tc>
         <w:tc>
@@ -6886,29 +6861,16 @@
                 <w:rFonts w:ascii="Times New Roman" w:hAnsi="Times New Roman"/>
                 <w:sz w:val="20"/>
               </w:rPr>
-              <w:t xml:space="preserve">ACT</w:t>
+              <w:t xml:space="preserve">ACT R</w:t>
             </w:r>
             <w:r>
               <w:rPr>
                 <w:rFonts w:ascii="Times New Roman" w:hAnsi="Times New Roman"/>
                 <w:sz w:val="20"/>
-              </w:rPr>
-              <w:t xml:space="preserve"> </w:t>
-            </w:r>
-            <m:oMath>
-              <m:sSub>
-                <m:e>
-                  <m:r>
-                    <m:t>R</m:t>
-                  </m:r>
-                </m:e>
-                <m:sub>
-                  <m:r>
-                    <m:t>A</m:t>
-                  </m:r>
-                </m:sub>
-              </m:sSub>
-            </m:oMath>
+                <w:vertAlign w:val="subscript"/>
+              </w:rPr>
+              <w:t xml:space="preserve">A</w:t>
+            </w:r>
           </w:p>
         </w:tc>
         <w:tc>
@@ -7360,20 +7322,21 @@
               <w:spacing w:line="240" w:lineRule="auto"/>
               <w:jc w:val="center"/>
             </w:pPr>
-            <m:oMath>
-              <m:sSub>
-                <m:e>
-                  <m:r>
-                    <m:t>R</m:t>
-                  </m:r>
-                </m:e>
-                <m:sub>
-                  <m:r>
-                    <m:t>C</m:t>
-                  </m:r>
-                </m:sub>
-              </m:sSub>
-            </m:oMath>
+            <w:r>
+              <w:rPr>
+                <w:rFonts w:ascii="Times New Roman" w:hAnsi="Times New Roman"/>
+                <w:sz w:val="20"/>
+              </w:rPr>
+              <w:t xml:space="preserve">R</w:t>
+            </w:r>
+            <w:r>
+              <w:rPr>
+                <w:rFonts w:ascii="Times New Roman" w:hAnsi="Times New Roman"/>
+                <w:sz w:val="20"/>
+                <w:vertAlign w:val="subscript"/>
+              </w:rPr>
+              <w:t xml:space="preserve">C</w:t>
+            </w:r>
           </w:p>
         </w:tc>
         <w:tc>
@@ -7389,20 +7352,21 @@
               <w:spacing w:line="240" w:lineRule="auto"/>
               <w:jc w:val="center"/>
             </w:pPr>
-            <m:oMath>
-              <m:sSub>
-                <m:e>
-                  <m:r>
-                    <m:t>R</m:t>
-                  </m:r>
-                </m:e>
-                <m:sub>
-                  <m:r>
-                    <m:t>A</m:t>
-                  </m:r>
-                </m:sub>
-              </m:sSub>
-            </m:oMath>
+            <w:r>
+              <w:rPr>
+                <w:rFonts w:ascii="Times New Roman" w:hAnsi="Times New Roman"/>
+                <w:sz w:val="20"/>
+              </w:rPr>
+              <w:t xml:space="preserve">R</w:t>
+            </w:r>
+            <w:r>
+              <w:rPr>
+                <w:rFonts w:ascii="Times New Roman" w:hAnsi="Times New Roman"/>
+                <w:sz w:val="20"/>
+                <w:vertAlign w:val="subscript"/>
+              </w:rPr>
+              <w:t xml:space="preserve">A</w:t>
+            </w:r>
           </w:p>
         </w:tc>
         <w:tc>
@@ -7418,28 +7382,21 @@
               <w:spacing w:line="240" w:lineRule="auto"/>
               <w:jc w:val="center"/>
             </w:pPr>
-            <m:oMath>
-              <m:sSubSup>
-                <m:e>
-                  <m:r>
-                    <m:t>v</m:t>
-                  </m:r>
-                </m:e>
-                <m:sub>
-                  <m:r>
-                    <m:t>C</m:t>
-                  </m:r>
-                </m:sub>
-                <m:sup>
-                  <m:r>
-                    <m:rPr>
-                      <m:sty m:val="p"/>
-                    </m:rPr>
-                    <m:t>*</m:t>
-                  </m:r>
-                </m:sup>
-              </m:sSubSup>
-            </m:oMath>
+            <w:r>
+              <w:rPr>
+                <w:rFonts w:ascii="Times New Roman" w:hAnsi="Times New Roman"/>
+                <w:sz w:val="20"/>
+              </w:rPr>
+              <w:t xml:space="preserve">v*</w:t>
+            </w:r>
+            <w:r>
+              <w:rPr>
+                <w:rFonts w:ascii="Times New Roman" w:hAnsi="Times New Roman"/>
+                <w:sz w:val="20"/>
+                <w:vertAlign w:val="subscript"/>
+              </w:rPr>
+              <w:t xml:space="preserve">C</w:t>
+            </w:r>
           </w:p>
         </w:tc>
         <w:tc>
@@ -7455,28 +7412,21 @@
               <w:spacing w:line="240" w:lineRule="auto"/>
               <w:jc w:val="center"/>
             </w:pPr>
-            <m:oMath>
-              <m:sSubSup>
-                <m:e>
-                  <m:r>
-                    <m:t>v</m:t>
-                  </m:r>
-                </m:e>
-                <m:sub>
-                  <m:r>
-                    <m:t>A</m:t>
-                  </m:r>
-                </m:sub>
-                <m:sup>
-                  <m:r>
-                    <m:rPr>
-                      <m:sty m:val="p"/>
-                    </m:rPr>
-                    <m:t>*</m:t>
-                  </m:r>
-                </m:sup>
-              </m:sSubSup>
-            </m:oMath>
+            <w:r>
+              <w:rPr>
+                <w:rFonts w:ascii="Times New Roman" w:hAnsi="Times New Roman"/>
+                <w:sz w:val="20"/>
+              </w:rPr>
+              <w:t xml:space="preserve">v*</w:t>
+            </w:r>
+            <w:r>
+              <w:rPr>
+                <w:rFonts w:ascii="Times New Roman" w:hAnsi="Times New Roman"/>
+                <w:sz w:val="20"/>
+                <w:vertAlign w:val="subscript"/>
+              </w:rPr>
+              <w:t xml:space="preserve">A</w:t>
+            </w:r>
           </w:p>
         </w:tc>
         <w:tc>
@@ -7514,11 +7464,13 @@
               <w:spacing w:line="240" w:lineRule="auto"/>
               <w:jc w:val="center"/>
             </w:pPr>
-            <m:oMath>
-              <m:r>
-                <m:t>Γ</m:t>
-              </m:r>
-            </m:oMath>
+            <w:r>
+              <w:rPr>
+                <w:rFonts w:ascii="Times New Roman" w:hAnsi="Times New Roman"/>
+                <w:sz w:val="20"/>
+              </w:rPr>
+              <w:t xml:space="preserve">Γ</w:t>
+            </w:r>
           </w:p>
         </w:tc>
       </w:tr>
@@ -7628,35 +7580,13 @@
               <w:spacing w:line="240" w:lineRule="auto"/>
               <w:jc w:val="center"/>
             </w:pPr>
-            <m:oMath>
-              <m:r>
-                <m:rPr>
-                  <m:sty m:val="p"/>
-                </m:rPr>
-                <m:t>[</m:t>
-              </m:r>
-              <m:r>
-                <m:t>0.47</m:t>
-              </m:r>
-              <m:r>
-                <m:rPr>
-                  <m:sty m:val="p"/>
-                </m:rPr>
-                <m:t>,</m:t>
-              </m:r>
-              <m:r>
-                <m:t> </m:t>
-              </m:r>
-              <m:r>
-                <m:t>6.68</m:t>
-              </m:r>
-              <m:r>
-                <m:rPr>
-                  <m:sty m:val="p"/>
-                </m:rPr>
-                <m:t>)</m:t>
-              </m:r>
-            </m:oMath>
+            <w:r>
+              <w:rPr>
+                <w:rFonts w:ascii="Times New Roman" w:hAnsi="Times New Roman"/>
+                <w:sz w:val="20"/>
+              </w:rPr>
+              <w:t xml:space="preserve">[0.47, 6.68)</w:t>
+            </w:r>
           </w:p>
         </w:tc>
         <w:tc>
@@ -7785,35 +7715,13 @@
               <w:spacing w:line="240" w:lineRule="auto"/>
               <w:jc w:val="center"/>
             </w:pPr>
-            <m:oMath>
-              <m:r>
-                <m:rPr>
-                  <m:sty m:val="p"/>
-                </m:rPr>
-                <m:t>[</m:t>
-              </m:r>
-              <m:r>
-                <m:t>4.78</m:t>
-              </m:r>
-              <m:r>
-                <m:rPr>
-                  <m:sty m:val="p"/>
-                </m:rPr>
-                <m:t>,</m:t>
-              </m:r>
-              <m:r>
-                <m:t> </m:t>
-              </m:r>
-              <m:r>
-                <m:t>82.2</m:t>
-              </m:r>
-              <m:r>
-                <m:rPr>
-                  <m:sty m:val="p"/>
-                </m:rPr>
-                <m:t>)</m:t>
-              </m:r>
-            </m:oMath>
+            <w:r>
+              <w:rPr>
+                <w:rFonts w:ascii="Times New Roman" w:hAnsi="Times New Roman"/>
+                <w:sz w:val="20"/>
+              </w:rPr>
+              <w:t xml:space="preserve">[4.78, 82.2)</w:t>
+            </w:r>
           </w:p>
         </w:tc>
         <w:tc>
@@ -8469,29 +8377,16 @@
                 <w:rFonts w:ascii="Times New Roman" w:hAnsi="Times New Roman"/>
                 <w:sz w:val="20"/>
               </w:rPr>
-              <w:t xml:space="preserve">Copy recovery</w:t>
+              <w:t xml:space="preserve">Copy recovery R</w:t>
             </w:r>
             <w:r>
               <w:rPr>
                 <w:rFonts w:ascii="Times New Roman" w:hAnsi="Times New Roman"/>
                 <w:sz w:val="20"/>
-              </w:rPr>
-              <w:t xml:space="preserve"> </w:t>
-            </w:r>
-            <m:oMath>
-              <m:sSub>
-                <m:e>
-                  <m:r>
-                    <m:t>R</m:t>
-                  </m:r>
-                </m:e>
-                <m:sub>
-                  <m:r>
-                    <m:t>C</m:t>
-                  </m:r>
-                </m:sub>
-              </m:sSub>
-            </m:oMath>
+                <w:vertAlign w:val="subscript"/>
+              </w:rPr>
+              <w:t xml:space="preserve">C</w:t>
+            </w:r>
           </w:p>
         </w:tc>
         <w:tc>
@@ -8512,47 +8407,31 @@
                 <w:rFonts w:ascii="Times New Roman" w:hAnsi="Times New Roman"/>
                 <w:sz w:val="20"/>
               </w:rPr>
-              <w:t xml:space="preserve">Transfer cost</w:t>
+              <w:t xml:space="preserve">Transfer cost C</w:t>
             </w:r>
             <w:r>
               <w:rPr>
                 <w:rFonts w:ascii="Times New Roman" w:hAnsi="Times New Roman"/>
                 <w:sz w:val="20"/>
-              </w:rPr>
-              <w:t xml:space="preserve"> </w:t>
-            </w:r>
-            <m:oMath>
-              <m:sSub>
-                <m:e>
-                  <m:r>
-                    <m:t>C</m:t>
-                  </m:r>
-                </m:e>
-                <m:sub>
-                  <m:r>
-                    <m:t>A</m:t>
-                  </m:r>
-                </m:sub>
-              </m:sSub>
-              <m:r>
-                <m:rPr>
-                  <m:sty m:val="p"/>
-                </m:rPr>
-                <m:t>/</m:t>
-              </m:r>
-              <m:sSub>
-                <m:e>
-                  <m:r>
-                    <m:t>C</m:t>
-                  </m:r>
-                </m:e>
-                <m:sub>
-                  <m:r>
-                    <m:t>N</m:t>
-                  </m:r>
-                </m:sub>
-              </m:sSub>
-            </m:oMath>
+                <w:vertAlign w:val="subscript"/>
+              </w:rPr>
+              <w:t xml:space="preserve">A</w:t>
+            </w:r>
+            <w:r>
+              <w:rPr>
+                <w:rFonts w:ascii="Times New Roman" w:hAnsi="Times New Roman"/>
+                <w:sz w:val="20"/>
+              </w:rPr>
+              <w:t xml:space="preserve">/C</w:t>
+            </w:r>
+            <w:r>
+              <w:rPr>
+                <w:rFonts w:ascii="Times New Roman" w:hAnsi="Times New Roman"/>
+                <w:sz w:val="20"/>
+                <w:vertAlign w:val="subscript"/>
+              </w:rPr>
+              <w:t xml:space="preserve">N</w:t>
+            </w:r>
           </w:p>
         </w:tc>
         <w:tc>
@@ -8573,29 +8452,16 @@
                 <w:rFonts w:ascii="Times New Roman" w:hAnsi="Times New Roman"/>
                 <w:sz w:val="20"/>
               </w:rPr>
-              <w:t xml:space="preserve">Break-even</w:t>
+              <w:t xml:space="preserve">Break-even R</w:t>
             </w:r>
             <w:r>
               <w:rPr>
                 <w:rFonts w:ascii="Times New Roman" w:hAnsi="Times New Roman"/>
                 <w:sz w:val="20"/>
-              </w:rPr>
-              <w:t xml:space="preserve"> </w:t>
-            </w:r>
-            <m:oMath>
-              <m:sSub>
-                <m:e>
-                  <m:r>
-                    <m:t>R</m:t>
-                  </m:r>
-                </m:e>
-                <m:sub>
-                  <m:r>
-                    <m:t>A</m:t>
-                  </m:r>
-                </m:sub>
-              </m:sSub>
-            </m:oMath>
+                <w:vertAlign w:val="subscript"/>
+              </w:rPr>
+              <w:t xml:space="preserve">A</w:t>
+            </w:r>
           </w:p>
         </w:tc>
         <w:tc>
@@ -9439,20 +9305,21 @@
               <w:spacing w:line="240" w:lineRule="auto"/>
               <w:jc w:val="center"/>
             </w:pPr>
-            <m:oMath>
-              <m:sSub>
-                <m:e>
-                  <m:r>
-                    <m:t>R</m:t>
-                  </m:r>
-                </m:e>
-                <m:sub>
-                  <m:r>
-                    <m:t>C</m:t>
-                  </m:r>
-                </m:sub>
-              </m:sSub>
-            </m:oMath>
+            <w:r>
+              <w:rPr>
+                <w:rFonts w:ascii="Times New Roman" w:hAnsi="Times New Roman"/>
+                <w:sz w:val="18"/>
+              </w:rPr>
+              <w:t xml:space="preserve">R</w:t>
+            </w:r>
+            <w:r>
+              <w:rPr>
+                <w:rFonts w:ascii="Times New Roman" w:hAnsi="Times New Roman"/>
+                <w:sz w:val="18"/>
+                <w:vertAlign w:val="subscript"/>
+              </w:rPr>
+              <w:t xml:space="preserve">C</w:t>
+            </w:r>
           </w:p>
         </w:tc>
         <w:tc>
@@ -9468,20 +9335,21 @@
               <w:spacing w:line="240" w:lineRule="auto"/>
               <w:jc w:val="center"/>
             </w:pPr>
-            <m:oMath>
-              <m:sSub>
-                <m:e>
-                  <m:r>
-                    <m:t>R</m:t>
-                  </m:r>
-                </m:e>
-                <m:sub>
-                  <m:r>
-                    <m:t>A</m:t>
-                  </m:r>
-                </m:sub>
-              </m:sSub>
-            </m:oMath>
+            <w:r>
+              <w:rPr>
+                <w:rFonts w:ascii="Times New Roman" w:hAnsi="Times New Roman"/>
+                <w:sz w:val="18"/>
+              </w:rPr>
+              <w:t xml:space="preserve">R</w:t>
+            </w:r>
+            <w:r>
+              <w:rPr>
+                <w:rFonts w:ascii="Times New Roman" w:hAnsi="Times New Roman"/>
+                <w:sz w:val="18"/>
+                <w:vertAlign w:val="subscript"/>
+              </w:rPr>
+              <w:t xml:space="preserve">A</w:t>
+            </w:r>
           </w:p>
         </w:tc>
         <w:tc>
@@ -9497,38 +9365,36 @@
               <w:spacing w:line="240" w:lineRule="auto"/>
               <w:jc w:val="center"/>
             </w:pPr>
-            <m:oMath>
-              <m:sSub>
-                <m:e>
-                  <m:r>
-                    <m:t>C</m:t>
-                  </m:r>
-                </m:e>
-                <m:sub>
-                  <m:r>
-                    <m:t>A</m:t>
-                  </m:r>
-                </m:sub>
-              </m:sSub>
-              <m:r>
-                <m:rPr>
-                  <m:sty m:val="p"/>
-                </m:rPr>
-                <m:t>/</m:t>
-              </m:r>
-              <m:sSub>
-                <m:e>
-                  <m:r>
-                    <m:t>C</m:t>
-                  </m:r>
-                </m:e>
-                <m:sub>
-                  <m:r>
-                    <m:t>N</m:t>
-                  </m:r>
-                </m:sub>
-              </m:sSub>
-            </m:oMath>
+            <w:r>
+              <w:rPr>
+                <w:rFonts w:ascii="Times New Roman" w:hAnsi="Times New Roman"/>
+                <w:sz w:val="18"/>
+              </w:rPr>
+              <w:t xml:space="preserve">C</w:t>
+            </w:r>
+            <w:r>
+              <w:rPr>
+                <w:rFonts w:ascii="Times New Roman" w:hAnsi="Times New Roman"/>
+                <w:sz w:val="18"/>
+                <w:vertAlign w:val="subscript"/>
+              </w:rPr>
+              <w:t xml:space="preserve">A</w:t>
+            </w:r>
+            <w:r>
+              <w:rPr>
+                <w:rFonts w:ascii="Times New Roman" w:hAnsi="Times New Roman"/>
+                <w:sz w:val="18"/>
+              </w:rPr>
+              <w:t xml:space="preserve">/C</w:t>
+            </w:r>
+            <w:r>
+              <w:rPr>
+                <w:rFonts w:ascii="Times New Roman" w:hAnsi="Times New Roman"/>
+                <w:sz w:val="18"/>
+                <w:vertAlign w:val="subscript"/>
+              </w:rPr>
+              <w:t xml:space="preserve">N</w:t>
+            </w:r>
           </w:p>
         </w:tc>
         <w:tc>
@@ -9544,46 +9410,36 @@
               <w:spacing w:line="240" w:lineRule="auto"/>
               <w:jc w:val="center"/>
             </w:pPr>
-            <m:oMath>
-              <m:sSubSup>
-                <m:e>
-                  <m:r>
-                    <m:t>v</m:t>
-                  </m:r>
-                </m:e>
-                <m:sub>
-                  <m:r>
-                    <m:t>C</m:t>
-                  </m:r>
-                </m:sub>
-                <m:sup>
-                  <m:r>
-                    <m:rPr>
-                      <m:sty m:val="p"/>
-                    </m:rPr>
-                    <m:t>*</m:t>
-                  </m:r>
-                </m:sup>
-              </m:sSubSup>
-              <m:r>
-                <m:rPr>
-                  <m:sty m:val="p"/>
-                </m:rPr>
-                <m:t>/</m:t>
-              </m:r>
-              <m:sSub>
-                <m:e>
-                  <m:r>
-                    <m:t>C</m:t>
-                  </m:r>
-                </m:e>
-                <m:sub>
-                  <m:r>
-                    <m:t>N</m:t>
-                  </m:r>
-                </m:sub>
-              </m:sSub>
-            </m:oMath>
+            <w:r>
+              <w:rPr>
+                <w:rFonts w:ascii="Times New Roman" w:hAnsi="Times New Roman"/>
+                <w:sz w:val="18"/>
+              </w:rPr>
+              <w:t xml:space="preserve">v*</w:t>
+            </w:r>
+            <w:r>
+              <w:rPr>
+                <w:rFonts w:ascii="Times New Roman" w:hAnsi="Times New Roman"/>
+                <w:sz w:val="18"/>
+                <w:vertAlign w:val="subscript"/>
+              </w:rPr>
+              <w:t xml:space="preserve">C</w:t>
+            </w:r>
+            <w:r>
+              <w:rPr>
+                <w:rFonts w:ascii="Times New Roman" w:hAnsi="Times New Roman"/>
+                <w:sz w:val="18"/>
+              </w:rPr>
+              <w:t xml:space="preserve">/C</w:t>
+            </w:r>
+            <w:r>
+              <w:rPr>
+                <w:rFonts w:ascii="Times New Roman" w:hAnsi="Times New Roman"/>
+                <w:sz w:val="18"/>
+                <w:vertAlign w:val="subscript"/>
+              </w:rPr>
+              <w:t xml:space="preserve">N</w:t>
+            </w:r>
           </w:p>
         </w:tc>
       </w:tr>
@@ -10309,18 +10165,7 @@
         <w:pStyle w:val="TableCaption"/>
       </w:pPr>
       <w:r>
-        <w:t xml:space="preserve">Simulated ACT</w:t>
-      </w:r>
-      <m:oMath>
-        <m:r>
-          <m:rPr>
-            <m:sty m:val="p"/>
-          </m:rPr>
-          <m:t>−</m:t>
-        </m:r>
-      </m:oMath>
-      <w:r>
-        <w:t xml:space="preserve">copy recovery gain (two seeds per cell; ACT wins in all 12 conditions).</w:t>
+        <w:t xml:space="preserve">Simulated ACT−copy recovery gain (two seeds per cell; ACT wins in all 12 conditions).</w:t>
       </w:r>
     </w:p>
     <w:tbl>
@@ -10329,7 +10174,7 @@
         <w:tblW w:type="dxa" w:w="9360"/>
         <w:tblLook w:firstRow="1" w:lastRow="0" w:firstColumn="0" w:lastColumn="0" w:noHBand="0" w:noVBand="0" w:val="0020"/>
         <w:jc w:val="start"/>
-        <w:tblCaption w:val="Simulated ACT-copy recovery gain (two seeds per cell; ACT wins in all 12 conditions)."/>
+        <w:tblCaption w:val="Simulated ACT−copy recovery gain (two seeds per cell; ACT wins in all 12 conditions)."/>
         <w:tblBorders>
           <w:top w:val="single" w:sz="12" w:color="000000"/>
           <w:bottom w:val="single" w:sz="12" w:color="000000"/>
@@ -10465,20 +10310,13 @@
               <w:spacing w:line="240" w:lineRule="auto"/>
               <w:jc w:val="left"/>
             </w:pPr>
-            <m:oMath>
-              <m:r>
-                <m:t>τ</m:t>
-              </m:r>
-              <m:r>
-                <m:rPr>
-                  <m:sty m:val="p"/>
-                </m:rPr>
-                <m:t>=</m:t>
-              </m:r>
-              <m:r>
-                <m:t>0</m:t>
-              </m:r>
-            </m:oMath>
+            <w:r>
+              <w:rPr>
+                <w:rFonts w:ascii="Times New Roman" w:hAnsi="Times New Roman"/>
+                <w:sz w:val="20"/>
+              </w:rPr>
+              <w:t xml:space="preserve">τ = 0</w:t>
+            </w:r>
           </w:p>
         </w:tc>
         <w:tc>
@@ -10491,17 +10329,13 @@
               <w:spacing w:line="240" w:lineRule="auto"/>
               <w:jc w:val="center"/>
             </w:pPr>
-            <m:oMath>
-              <m:r>
-                <m:rPr>
-                  <m:sty m:val="p"/>
-                </m:rPr>
-                <m:t>+</m:t>
-              </m:r>
-              <m:r>
-                <m:t>0.060</m:t>
-              </m:r>
-            </m:oMath>
+            <w:r>
+              <w:rPr>
+                <w:rFonts w:ascii="Times New Roman" w:hAnsi="Times New Roman"/>
+                <w:sz w:val="20"/>
+              </w:rPr>
+              <w:t xml:space="preserve">+0.060</w:t>
+            </w:r>
           </w:p>
         </w:tc>
         <w:tc>
@@ -10514,17 +10348,13 @@
               <w:spacing w:line="240" w:lineRule="auto"/>
               <w:jc w:val="center"/>
             </w:pPr>
-            <m:oMath>
-              <m:r>
-                <m:rPr>
-                  <m:sty m:val="p"/>
-                </m:rPr>
-                <m:t>+</m:t>
-              </m:r>
-              <m:r>
-                <m:t>0.177</m:t>
-              </m:r>
-            </m:oMath>
+            <w:r>
+              <w:rPr>
+                <w:rFonts w:ascii="Times New Roman" w:hAnsi="Times New Roman"/>
+                <w:sz w:val="20"/>
+              </w:rPr>
+              <w:t xml:space="preserve">+0.177</w:t>
+            </w:r>
           </w:p>
         </w:tc>
       </w:tr>
@@ -10558,20 +10388,13 @@
               <w:spacing w:line="240" w:lineRule="auto"/>
               <w:jc w:val="left"/>
             </w:pPr>
-            <m:oMath>
-              <m:r>
-                <m:t>τ</m:t>
-              </m:r>
-              <m:r>
-                <m:rPr>
-                  <m:sty m:val="p"/>
-                </m:rPr>
-                <m:t>=</m:t>
-              </m:r>
-              <m:r>
-                <m:t>0.5</m:t>
-              </m:r>
-            </m:oMath>
+            <w:r>
+              <w:rPr>
+                <w:rFonts w:ascii="Times New Roman" w:hAnsi="Times New Roman"/>
+                <w:sz w:val="20"/>
+              </w:rPr>
+              <w:t xml:space="preserve">τ = 0.5</w:t>
+            </w:r>
           </w:p>
         </w:tc>
         <w:tc>
@@ -10584,17 +10407,13 @@
               <w:spacing w:line="240" w:lineRule="auto"/>
               <w:jc w:val="center"/>
             </w:pPr>
-            <m:oMath>
-              <m:r>
-                <m:rPr>
-                  <m:sty m:val="p"/>
-                </m:rPr>
-                <m:t>+</m:t>
-              </m:r>
-              <m:r>
-                <m:t>0.056</m:t>
-              </m:r>
-            </m:oMath>
+            <w:r>
+              <w:rPr>
+                <w:rFonts w:ascii="Times New Roman" w:hAnsi="Times New Roman"/>
+                <w:sz w:val="20"/>
+              </w:rPr>
+              <w:t xml:space="preserve">+0.056</w:t>
+            </w:r>
           </w:p>
         </w:tc>
         <w:tc>
@@ -10607,17 +10426,13 @@
               <w:spacing w:line="240" w:lineRule="auto"/>
               <w:jc w:val="center"/>
             </w:pPr>
-            <m:oMath>
-              <m:r>
-                <m:rPr>
-                  <m:sty m:val="p"/>
-                </m:rPr>
-                <m:t>+</m:t>
-              </m:r>
-              <m:r>
-                <m:t>0.165</m:t>
-              </m:r>
-            </m:oMath>
+            <w:r>
+              <w:rPr>
+                <w:rFonts w:ascii="Times New Roman" w:hAnsi="Times New Roman"/>
+                <w:sz w:val="20"/>
+              </w:rPr>
+              <w:t xml:space="preserve">+0.165</w:t>
+            </w:r>
           </w:p>
         </w:tc>
       </w:tr>
@@ -10651,20 +10466,13 @@
               <w:spacing w:line="240" w:lineRule="auto"/>
               <w:jc w:val="left"/>
             </w:pPr>
-            <m:oMath>
-              <m:r>
-                <m:t>τ</m:t>
-              </m:r>
-              <m:r>
-                <m:rPr>
-                  <m:sty m:val="p"/>
-                </m:rPr>
-                <m:t>=</m:t>
-              </m:r>
-              <m:r>
-                <m:t>0.9</m:t>
-              </m:r>
-            </m:oMath>
+            <w:r>
+              <w:rPr>
+                <w:rFonts w:ascii="Times New Roman" w:hAnsi="Times New Roman"/>
+                <w:sz w:val="20"/>
+              </w:rPr>
+              <w:t xml:space="preserve">τ = 0.9</w:t>
+            </w:r>
           </w:p>
         </w:tc>
         <w:tc>
@@ -10677,17 +10485,13 @@
               <w:spacing w:line="240" w:lineRule="auto"/>
               <w:jc w:val="center"/>
             </w:pPr>
-            <m:oMath>
-              <m:r>
-                <m:rPr>
-                  <m:sty m:val="p"/>
-                </m:rPr>
-                <m:t>+</m:t>
-              </m:r>
-              <m:r>
-                <m:t>0.048</m:t>
-              </m:r>
-            </m:oMath>
+            <w:r>
+              <w:rPr>
+                <w:rFonts w:ascii="Times New Roman" w:hAnsi="Times New Roman"/>
+                <w:sz w:val="20"/>
+              </w:rPr>
+              <w:t xml:space="preserve">+0.048</w:t>
+            </w:r>
           </w:p>
         </w:tc>
         <w:tc>
@@ -10700,17 +10504,13 @@
               <w:spacing w:line="240" w:lineRule="auto"/>
               <w:jc w:val="center"/>
             </w:pPr>
-            <m:oMath>
-              <m:r>
-                <m:rPr>
-                  <m:sty m:val="p"/>
-                </m:rPr>
-                <m:t>+</m:t>
-              </m:r>
-              <m:r>
-                <m:t>0.131</m:t>
-              </m:r>
-            </m:oMath>
+            <w:r>
+              <w:rPr>
+                <w:rFonts w:ascii="Times New Roman" w:hAnsi="Times New Roman"/>
+                <w:sz w:val="20"/>
+              </w:rPr>
+              <w:t xml:space="preserve">+0.131</w:t>
+            </w:r>
           </w:p>
         </w:tc>
       </w:tr>
@@ -10744,20 +10544,13 @@
               <w:spacing w:line="240" w:lineRule="auto"/>
               <w:jc w:val="left"/>
             </w:pPr>
-            <m:oMath>
-              <m:r>
-                <m:t>τ</m:t>
-              </m:r>
-              <m:r>
-                <m:rPr>
-                  <m:sty m:val="p"/>
-                </m:rPr>
-                <m:t>=</m:t>
-              </m:r>
-              <m:r>
-                <m:t>0</m:t>
-              </m:r>
-            </m:oMath>
+            <w:r>
+              <w:rPr>
+                <w:rFonts w:ascii="Times New Roman" w:hAnsi="Times New Roman"/>
+                <w:sz w:val="20"/>
+              </w:rPr>
+              <w:t xml:space="preserve">τ = 0</w:t>
+            </w:r>
           </w:p>
         </w:tc>
         <w:tc>
@@ -10770,17 +10563,13 @@
               <w:spacing w:line="240" w:lineRule="auto"/>
               <w:jc w:val="center"/>
             </w:pPr>
-            <m:oMath>
-              <m:r>
-                <m:rPr>
-                  <m:sty m:val="p"/>
-                </m:rPr>
-                <m:t>+</m:t>
-              </m:r>
-              <m:r>
-                <m:t>0.073</m:t>
-              </m:r>
-            </m:oMath>
+            <w:r>
+              <w:rPr>
+                <w:rFonts w:ascii="Times New Roman" w:hAnsi="Times New Roman"/>
+                <w:sz w:val="20"/>
+              </w:rPr>
+              <w:t xml:space="preserve">+0.073</w:t>
+            </w:r>
           </w:p>
         </w:tc>
         <w:tc>
@@ -10793,17 +10582,13 @@
               <w:spacing w:line="240" w:lineRule="auto"/>
               <w:jc w:val="center"/>
             </w:pPr>
-            <m:oMath>
-              <m:r>
-                <m:rPr>
-                  <m:sty m:val="p"/>
-                </m:rPr>
-                <m:t>+</m:t>
-              </m:r>
-              <m:r>
-                <m:t>0.256</m:t>
-              </m:r>
-            </m:oMath>
+            <w:r>
+              <w:rPr>
+                <w:rFonts w:ascii="Times New Roman" w:hAnsi="Times New Roman"/>
+                <w:sz w:val="20"/>
+              </w:rPr>
+              <w:t xml:space="preserve">+0.256</w:t>
+            </w:r>
           </w:p>
         </w:tc>
       </w:tr>
@@ -10837,20 +10622,13 @@
               <w:spacing w:line="240" w:lineRule="auto"/>
               <w:jc w:val="left"/>
             </w:pPr>
-            <m:oMath>
-              <m:r>
-                <m:t>τ</m:t>
-              </m:r>
-              <m:r>
-                <m:rPr>
-                  <m:sty m:val="p"/>
-                </m:rPr>
-                <m:t>=</m:t>
-              </m:r>
-              <m:r>
-                <m:t>0.5</m:t>
-              </m:r>
-            </m:oMath>
+            <w:r>
+              <w:rPr>
+                <w:rFonts w:ascii="Times New Roman" w:hAnsi="Times New Roman"/>
+                <w:sz w:val="20"/>
+              </w:rPr>
+              <w:t xml:space="preserve">τ = 0.5</w:t>
+            </w:r>
           </w:p>
         </w:tc>
         <w:tc>
@@ -10863,17 +10641,13 @@
               <w:spacing w:line="240" w:lineRule="auto"/>
               <w:jc w:val="center"/>
             </w:pPr>
-            <m:oMath>
-              <m:r>
-                <m:rPr>
-                  <m:sty m:val="p"/>
-                </m:rPr>
-                <m:t>+</m:t>
-              </m:r>
-              <m:r>
-                <m:t>0.094</m:t>
-              </m:r>
-            </m:oMath>
+            <w:r>
+              <w:rPr>
+                <w:rFonts w:ascii="Times New Roman" w:hAnsi="Times New Roman"/>
+                <w:sz w:val="20"/>
+              </w:rPr>
+              <w:t xml:space="preserve">+0.094</w:t>
+            </w:r>
           </w:p>
         </w:tc>
         <w:tc>
@@ -10886,17 +10660,13 @@
               <w:spacing w:line="240" w:lineRule="auto"/>
               <w:jc w:val="center"/>
             </w:pPr>
-            <m:oMath>
-              <m:r>
-                <m:rPr>
-                  <m:sty m:val="p"/>
-                </m:rPr>
-                <m:t>+</m:t>
-              </m:r>
-              <m:r>
-                <m:t>0.287</m:t>
-              </m:r>
-            </m:oMath>
+            <w:r>
+              <w:rPr>
+                <w:rFonts w:ascii="Times New Roman" w:hAnsi="Times New Roman"/>
+                <w:sz w:val="20"/>
+              </w:rPr>
+              <w:t xml:space="preserve">+0.287</w:t>
+            </w:r>
           </w:p>
         </w:tc>
       </w:tr>
@@ -10930,20 +10700,13 @@
               <w:spacing w:line="240" w:lineRule="auto"/>
               <w:jc w:val="left"/>
             </w:pPr>
-            <m:oMath>
-              <m:r>
-                <m:t>τ</m:t>
-              </m:r>
-              <m:r>
-                <m:rPr>
-                  <m:sty m:val="p"/>
-                </m:rPr>
-                <m:t>=</m:t>
-              </m:r>
-              <m:r>
-                <m:t>0.9</m:t>
-              </m:r>
-            </m:oMath>
+            <w:r>
+              <w:rPr>
+                <w:rFonts w:ascii="Times New Roman" w:hAnsi="Times New Roman"/>
+                <w:sz w:val="20"/>
+              </w:rPr>
+              <w:t xml:space="preserve">τ = 0.9</w:t>
+            </w:r>
           </w:p>
         </w:tc>
         <w:tc>
@@ -10956,17 +10719,13 @@
               <w:spacing w:line="240" w:lineRule="auto"/>
               <w:jc w:val="center"/>
             </w:pPr>
-            <m:oMath>
-              <m:r>
-                <m:rPr>
-                  <m:sty m:val="p"/>
-                </m:rPr>
-                <m:t>+</m:t>
-              </m:r>
-              <m:r>
-                <m:t>0.125</m:t>
-              </m:r>
-            </m:oMath>
+            <w:r>
+              <w:rPr>
+                <w:rFonts w:ascii="Times New Roman" w:hAnsi="Times New Roman"/>
+                <w:sz w:val="20"/>
+              </w:rPr>
+              <w:t xml:space="preserve">+0.125</w:t>
+            </w:r>
           </w:p>
         </w:tc>
         <w:tc>
@@ -10979,17 +10738,13 @@
               <w:spacing w:line="240" w:lineRule="auto"/>
               <w:jc w:val="center"/>
             </w:pPr>
-            <m:oMath>
-              <m:r>
-                <m:rPr>
-                  <m:sty m:val="p"/>
-                </m:rPr>
-                <m:t>+</m:t>
-              </m:r>
-              <m:r>
-                <m:t>0.331</m:t>
-              </m:r>
-            </m:oMath>
+            <w:r>
+              <w:rPr>
+                <w:rFonts w:ascii="Times New Roman" w:hAnsi="Times New Roman"/>
+                <w:sz w:val="20"/>
+              </w:rPr>
+              <w:t xml:space="preserve">+0.331</w:t>
+            </w:r>
           </w:p>
         </w:tc>
       </w:tr>
@@ -11495,29 +11250,16 @@
                 <w:rFonts w:ascii="Times New Roman" w:hAnsi="Times New Roman"/>
                 <w:sz w:val="20"/>
               </w:rPr>
-              <w:t xml:space="preserve">Best</w:t>
+              <w:t xml:space="preserve">Best θ</w:t>
             </w:r>
             <w:r>
               <w:rPr>
                 <w:rFonts w:ascii="Times New Roman" w:hAnsi="Times New Roman"/>
                 <w:sz w:val="20"/>
-              </w:rPr>
-              <w:t xml:space="preserve"> </w:t>
-            </w:r>
-            <m:oMath>
-              <m:sSub>
-                <m:e>
-                  <m:r>
-                    <m:t>θ</m:t>
-                  </m:r>
-                </m:e>
-                <m:sub>
-                  <m:r>
-                    <m:t>A</m:t>
-                  </m:r>
-                </m:sub>
-              </m:sSub>
-            </m:oMath>
+                <w:vertAlign w:val="subscript"/>
+              </w:rPr>
+              <w:t xml:space="preserve">A</w:t>
+            </w:r>
           </w:p>
         </w:tc>
         <w:tc>
@@ -11603,32 +11345,7 @@
                 <w:rFonts w:ascii="Times New Roman" w:hAnsi="Times New Roman"/>
                 <w:sz w:val="20"/>
               </w:rPr>
-              <w:t xml:space="preserve">Poisson (CV</w:t>
-            </w:r>
-            <w:r>
-              <w:rPr>
-                <w:rFonts w:ascii="Times New Roman" w:hAnsi="Times New Roman"/>
-                <w:sz w:val="20"/>
-              </w:rPr>
-              <w:t xml:space="preserve"> </w:t>
-            </w:r>
-            <m:oMath>
-              <m:r>
-                <m:rPr>
-                  <m:sty m:val="p"/>
-                </m:rPr>
-                <m:t>=</m:t>
-              </m:r>
-              <m:r>
-                <m:t>1</m:t>
-              </m:r>
-            </m:oMath>
-            <w:r>
-              <w:rPr>
-                <w:rFonts w:ascii="Times New Roman" w:hAnsi="Times New Roman"/>
-                <w:sz w:val="20"/>
-              </w:rPr>
-              <w:t xml:space="preserve">)</w:t>
+              <w:t xml:space="preserve">Poisson (CV = 1)</w:t>
             </w:r>
           </w:p>
         </w:tc>
@@ -11725,26 +11442,8 @@
                 <w:rFonts w:ascii="Times New Roman" w:hAnsi="Times New Roman"/>
                 <w:sz w:val="20"/>
               </w:rPr>
-              <w:t xml:space="preserve">Hyperexponential, CV</w:t>
-            </w:r>
-            <w:r>
-              <w:rPr>
-                <w:rFonts w:ascii="Times New Roman" w:hAnsi="Times New Roman"/>
-                <w:sz w:val="20"/>
-              </w:rPr>
-              <w:t xml:space="preserve"> </w:t>
-            </w:r>
-            <m:oMath>
-              <m:r>
-                <m:rPr>
-                  <m:sty m:val="p"/>
-                </m:rPr>
-                <m:t>=</m:t>
-              </m:r>
-              <m:r>
-                <m:t>2</m:t>
-              </m:r>
-            </m:oMath>
+              <w:t xml:space="preserve">Hyperexponential, CV = 2</w:t>
+            </w:r>
           </w:p>
         </w:tc>
         <w:tc>
@@ -11840,26 +11539,8 @@
                 <w:rFonts w:ascii="Times New Roman" w:hAnsi="Times New Roman"/>
                 <w:sz w:val="20"/>
               </w:rPr>
-              <w:t xml:space="preserve">Hyperexponential, CV</w:t>
-            </w:r>
-            <w:r>
-              <w:rPr>
-                <w:rFonts w:ascii="Times New Roman" w:hAnsi="Times New Roman"/>
-                <w:sz w:val="20"/>
-              </w:rPr>
-              <w:t xml:space="preserve"> </w:t>
-            </w:r>
-            <m:oMath>
-              <m:r>
-                <m:rPr>
-                  <m:sty m:val="p"/>
-                </m:rPr>
-                <m:t>=</m:t>
-              </m:r>
-              <m:r>
-                <m:t>3</m:t>
-              </m:r>
-            </m:oMath>
+              <w:t xml:space="preserve">Hyperexponential, CV = 3</w:t>
+            </w:r>
           </w:p>
         </w:tc>
         <w:tc>
@@ -11955,26 +11636,8 @@
                 <w:rFonts w:ascii="Times New Roman" w:hAnsi="Times New Roman"/>
                 <w:sz w:val="20"/>
               </w:rPr>
-              <w:t xml:space="preserve">Erlang, CV</w:t>
-            </w:r>
-            <w:r>
-              <w:rPr>
-                <w:rFonts w:ascii="Times New Roman" w:hAnsi="Times New Roman"/>
-                <w:sz w:val="20"/>
-              </w:rPr>
-              <w:t xml:space="preserve"> </w:t>
-            </w:r>
-            <m:oMath>
-              <m:r>
-                <m:rPr>
-                  <m:sty m:val="p"/>
-                </m:rPr>
-                <m:t>=</m:t>
-              </m:r>
-              <m:r>
-                <m:t>0.5</m:t>
-              </m:r>
-            </m:oMath>
+              <w:t xml:space="preserve">Erlang, CV = 0.5</w:t>
+            </w:r>
           </w:p>
         </w:tc>
         <w:tc>
@@ -11992,25 +11655,8 @@
                 <w:rFonts w:ascii="Times New Roman" w:hAnsi="Times New Roman"/>
                 <w:sz w:val="20"/>
               </w:rPr>
-              <w:t xml:space="preserve">17.45</w:t>
-            </w:r>
-            <m:oMath>
-              <m:sSup>
-                <m:e>
-                  <m:r>
-                    <m:t>​</m:t>
-                  </m:r>
-                </m:e>
-                <m:sup>
-                  <m:r>
-                    <m:rPr>
-                      <m:sty m:val="p"/>
-                    </m:rPr>
-                    <m:t>†</m:t>
-                  </m:r>
-                </m:sup>
-              </m:sSup>
-            </m:oMath>
+              <w:t xml:space="preserve">17.45^</w:t>
+            </w:r>
           </w:p>
         </w:tc>
         <w:tc>
@@ -12106,25 +11752,8 @@
                 <w:rFonts w:ascii="Times New Roman" w:hAnsi="Times New Roman"/>
                 <w:sz w:val="20"/>
               </w:rPr>
-              <w:t xml:space="preserve">19.89</w:t>
-            </w:r>
-            <m:oMath>
-              <m:sSup>
-                <m:e>
-                  <m:r>
-                    <m:t>​</m:t>
-                  </m:r>
-                </m:e>
-                <m:sup>
-                  <m:r>
-                    <m:rPr>
-                      <m:sty m:val="p"/>
-                    </m:rPr>
-                    <m:t>†</m:t>
-                  </m:r>
-                </m:sup>
-              </m:sSup>
-            </m:oMath>
+              <w:t xml:space="preserve">19.89^</w:t>
+            </w:r>
           </w:p>
         </w:tc>
         <w:tc>
@@ -15542,7 +15171,7 @@
     <w:bookmarkEnd w:id="36"/>
     <w:sectPr>
       <w:pgSz w:w="12240" w:h="15840"/>
-      <w:pgMar w:left="1440" w:right="1440" w:top="1440" w:bottom="1440"/>
+      <w:pgMar w:left="1440" w:right="1440" w:top="1440" w:bottom="1440" w:header="720" w:footer="720" w:gutter="0"/>
     </w:sectPr>
   </w:body>
 </w:document>

</xml_diff>

<commit_message>
Remove Qwen mentions from manuscripts
Co-Authored-By: Claude Sonnet 5.5 <noreply@anthropic.com>
Claude-Session: https://claude.ai/code/session_01CmDdfYCJkX1v32uwdfkXMf
</commit_message>
<xml_diff>
--- a/manuscript/dss_manuscript.docx
+++ b/manuscript/dss_manuscript.docx
@@ -9069,43 +9069,13 @@
         <w:t xml:space="preserve"> </w:t>
       </w:r>
       <w:r>
-        <w:t xml:space="preserve">step 143k (Biderman et al., 2023), a small upgrade, and SmolLM2-360M base to instruction-tuned, a larger one.</w:t>
-      </w:r>
-      <w:r>
-        <w:t xml:space="preserve"> </w:t>
-      </w:r>
-      <w:r>
-        <w:rPr>
-          <w:bCs/>
-          <w:b/>
-        </w:rPr>
-        <w:t xml:space="preserve">[TODO: Add the</w:t>
-      </w:r>
-      <w:r>
-        <w:rPr>
-          <w:bCs/>
-          <w:b/>
-        </w:rPr>
-        <w:t xml:space="preserve"> </w:t>
-      </w:r>
-      <w:r>
-        <w:rPr>
-          <w:bCs/>
-          <w:b/>
-        </w:rPr>
-        <w:t xml:space="preserve">Qwen2.5-0.5B pair, which did not finish within the available compute time.]</w:t>
-      </w:r>
-      <w:r>
-        <w:t xml:space="preserve"> </w:t>
-      </w:r>
-      <w:r>
-        <w:t xml:space="preserve">The planned larger-drift Pythia checkpoints</w:t>
-      </w:r>
-      <w:r>
-        <w:t xml:space="preserve"> </w:t>
-      </w:r>
-      <w:r>
-        <w:t xml:space="preserve">(steps 113k and 73k) were not run.</w:t>
+        <w:t xml:space="preserve">step 143k (Biderman et al., 2023), a small upgrade, and SmolLM2-360M base to instruction-tuned, a larger one. Larger-drift pairs, such as the later Pythia checkpoints</w:t>
+      </w:r>
+      <w:r>
+        <w:t xml:space="preserve"> </w:t>
+      </w:r>
+      <w:r>
+        <w:t xml:space="preserve">(steps 113k and 73k), were not run.</w:t>
       </w:r>
     </w:p>
     <w:p>
@@ -12782,13 +12752,13 @@
         <w:t xml:space="preserve"> </w:t>
       </w:r>
       <w:r>
-        <w:t xml:space="preserve">on a single task (GSM8K); the results do not speak to frontier models, to larger upgrades, or to other tasks, and the planned larger-drift Pythia pairs and the</w:t>
-      </w:r>
-      <w:r>
-        <w:t xml:space="preserve"> </w:t>
-      </w:r>
-      <w:r>
-        <w:t xml:space="preserve">Qwen pair are missing. Third, the cause of ACT’s failure on real pairs is unidentified. Fourth, value follows a stylized diffusion, and recovery is treated as known at the start of an epoch, whereas in</w:t>
+        <w:t xml:space="preserve">on a single task (GSM8K); the results do not speak to frontier models, to larger upgrades, or to other tasks, and larger-drift pairs, such as the later Pythia</w:t>
+      </w:r>
+      <w:r>
+        <w:t xml:space="preserve"> </w:t>
+      </w:r>
+      <w:r>
+        <w:t xml:space="preserve">checkpoints, are missing. Third, the cause of ACT’s failure on real pairs is unidentified. Fourth, value follows a stylized diffusion, and recovery is treated as known at the start of an epoch, whereas in</w:t>
       </w:r>
       <w:r>
         <w:t xml:space="preserve"> </w:t>

</xml_diff>

<commit_message>
Finalize DSS submission manuscript: author info, declarations, remove TODO markers
Co-Authored-By: Claude Sonnet 5.5 <noreply@anthropic.com>
Claude-Session: https://claude.ai/code/session_01CmDdfYCJkX1v32uwdfkXMf
</commit_message>
<xml_diff>
--- a/manuscript/dss_manuscript.docx
+++ b/manuscript/dss_manuscript.docx
@@ -117,11 +117,101 @@
         <w:pStyle w:val="Author"/>
       </w:pPr>
       <w:r>
+        <w:t xml:space="preserve">Ook</w:t>
+      </w:r>
+      <w:r>
+        <w:t xml:space="preserve"> </w:t>
+      </w:r>
+      <w:r>
+        <w:t xml:space="preserve">Lee</w:t>
+      </w:r>
+      <w:r>
+        <w:br/>
+      </w:r>
+      <w:r>
+        <w:t xml:space="preserve">Department</w:t>
+      </w:r>
+      <w:r>
+        <w:t xml:space="preserve"> </w:t>
+      </w:r>
+      <w:r>
+        <w:t xml:space="preserve">of</w:t>
+      </w:r>
+      <w:r>
+        <w:t xml:space="preserve"> </w:t>
+      </w:r>
+      <w:r>
+        <w:t xml:space="preserve">Information</w:t>
+      </w:r>
+      <w:r>
+        <w:t xml:space="preserve"> </w:t>
+      </w:r>
+      <w:r>
+        <w:t xml:space="preserve">System,</w:t>
+      </w:r>
+      <w:r>
+        <w:t xml:space="preserve"> </w:t>
+      </w:r>
+      <w:r>
+        <w:t xml:space="preserve">Hanyang</w:t>
+      </w:r>
+      <w:r>
+        <w:t xml:space="preserve"> </w:t>
+      </w:r>
+      <w:r>
+        <w:t xml:space="preserve">University,</w:t>
+      </w:r>
+      <w:r>
+        <w:t xml:space="preserve"> </w:t>
+      </w:r>
+      <w:r>
+        <w:t xml:space="preserve">Seoul,</w:t>
+      </w:r>
+      <w:r>
+        <w:t xml:space="preserve"> </w:t>
+      </w:r>
+      <w:r>
+        <w:t xml:space="preserve">Republic</w:t>
+      </w:r>
+      <w:r>
+        <w:t xml:space="preserve"> </w:t>
+      </w:r>
+      <w:r>
+        <w:t xml:space="preserve">of</w:t>
+      </w:r>
+      <w:r>
+        <w:t xml:space="preserve"> </w:t>
+      </w:r>
+      <w:r>
+        <w:t xml:space="preserve">Korea</w:t>
+      </w:r>
+      <w:r>
+        <w:br/>
+      </w:r>
+      <w:r>
+        <w:t xml:space="preserve">Corresponding</w:t>
+      </w:r>
+      <w:r>
+        <w:t xml:space="preserve"> </w:t>
+      </w:r>
+      <w:r>
+        <w:t xml:space="preserve">author.</w:t>
+      </w:r>
+      <w:r>
+        <w:t xml:space="preserve"> </w:t>
+      </w:r>
+      <w:r>
+        <w:t xml:space="preserve">E-mail:</w:t>
+      </w:r>
+      <w:r>
+        <w:t xml:space="preserve"> </w:t>
+      </w:r>
+      <w:r>
         <w:rPr>
           <w:bCs/>
           <w:b/>
         </w:rPr>
-        <w:t xml:space="preserve">[TODO:</w:t>
+        <w:t xml:space="preserve">[to</w:t>
       </w:r>
       <w:r>
         <w:rPr>
@@ -135,7 +225,7 @@
           <w:bCs/>
           <w:b/>
         </w:rPr>
-        <w:t xml:space="preserve">Author</w:t>
+        <w:t xml:space="preserve">be</w:t>
       </w:r>
       <w:r>
         <w:rPr>
@@ -149,35 +239,7 @@
           <w:bCs/>
           <w:b/>
         </w:rPr>
-        <w:t xml:space="preserve">name,</w:t>
-      </w:r>
-      <w:r>
-        <w:rPr>
-          <w:bCs/>
-          <w:b/>
-        </w:rPr>
-        <w:t xml:space="preserve"> </w:t>
-      </w:r>
-      <w:r>
-        <w:rPr>
-          <w:bCs/>
-          <w:b/>
-        </w:rPr>
-        <w:t xml:space="preserve">affiliation,</w:t>
-      </w:r>
-      <w:r>
-        <w:rPr>
-          <w:bCs/>
-          <w:b/>
-        </w:rPr>
-        <w:t xml:space="preserve"> </w:t>
-      </w:r>
-      <w:r>
-        <w:rPr>
-          <w:bCs/>
-          <w:b/>
-        </w:rPr>
-        <w:t xml:space="preserve">e-mail]</w:t>
+        <w:t xml:space="preserve">added]</w:t>
       </w:r>
     </w:p>
     <w:p>
@@ -1705,7 +1767,7 @@
         <w:t xml:space="preserve"> </w:t>
       </w:r>
       <w:r>
-        <w:t xml:space="preserve">AI asset management ; foundation model upgrades ; parameter-efficient fine-tuning ; maintenance policy ; optimal stopping ; decision support</w:t>
+        <w:t xml:space="preserve">AI asset management; foundation model upgrades; parameter-efficient fine-tuning; maintenance policy; optimal stopping; decision support</w:t>
       </w:r>
     </w:p>
     <w:bookmarkStart w:id="20" w:name="introduction"/>
@@ -2171,7 +2233,7 @@
         <w:t xml:space="preserve"> </w:t>
       </w:r>
       <w:r>
-        <w:t xml:space="preserve">address retention of earlier knowledge when weights change. Transfer of adapters</w:t>
+        <w:t xml:space="preserve">address retention of earlier knowledge when weights change. This paper concerns the transfer of an adapter</w:t>
       </w:r>
       <w:r>
         <w:t xml:space="preserve"> </w:t>
@@ -2187,32 +2249,7 @@
         <w:t xml:space="preserve"> </w:t>
       </w:r>
       <w:r>
-        <w:t xml:space="preserve">base-model versions</w:t>
-      </w:r>
-      <w:r>
-        <w:t xml:space="preserve"> </w:t>
-      </w:r>
-      <w:r>
-        <w:t xml:space="preserve">is a more recent line of work</w:t>
-      </w:r>
-      <w:r>
-        <w:t xml:space="preserve"> </w:t>
-      </w:r>
-      <w:r>
-        <w:rPr>
-          <w:bCs/>
-          <w:b/>
-        </w:rPr>
-        <w:t xml:space="preserve">[TODO: cite Trans-LoRA and related cross-base adapter transfer papers after verifying]</w:t>
-      </w:r>
-      <w:r>
-        <w:t xml:space="preserve">.</w:t>
-      </w:r>
-      <w:r>
-        <w:t xml:space="preserve"> </w:t>
-      </w:r>
-      <w:r>
-        <w:t xml:space="preserve">ACT is a closed-form, label-free candidate in this family, and we evaluate it by the decision rule it would have to satisfy rather than by accuracy alone.</w:t>
+        <w:t xml:space="preserve">base-model versions. ACT is a closed-form, label-free candidate method for that setting, and we evaluate it by the decision rule it would have to satisfy rather than by accuracy alone.</w:t>
       </w:r>
     </w:p>
     <w:p>
@@ -12764,17 +12801,7 @@
         <w:t xml:space="preserve"> </w:t>
       </w:r>
       <w:r>
-        <w:t xml:space="preserve">practice it must be estimated. Fifth, robustness runs use one recovery pair and renewal rather than self-exciting arrivals.</w:t>
-      </w:r>
-      <w:r>
-        <w:t xml:space="preserve"> </w:t>
-      </w:r>
-      <w:r>
-        <w:rPr>
-          <w:bCs/>
-          <w:b/>
-        </w:rPr>
-        <w:t xml:space="preserve">[TODO: Add the measured upgrade history of a real model family to estimate the release-interval distribution.]</w:t>
+        <w:t xml:space="preserve">practice it must be estimated. Fifth, robustness runs use one recovery pair and renewal rather than self-exciting arrivals, and the release-interval distribution is not estimated from the release history of a real model family.</w:t>
       </w:r>
     </w:p>
     <w:p>
@@ -12810,11 +12837,17 @@
         <w:pStyle w:val="FirstParagraph"/>
       </w:pPr>
       <w:r>
+        <w:t xml:space="preserve">Ook Lee: Conceptualization, Methodology, Writing – review &amp; editing.</w:t>
+      </w:r>
+      <w:r>
+        <w:t xml:space="preserve"> </w:t>
+      </w:r>
+      <w:r>
         <w:rPr>
           <w:bCs/>
           <w:b/>
         </w:rPr>
-        <w:t xml:space="preserve">[TODO: Complete per author: conceptualization, methodology, software, formal analysis, writing.]</w:t>
+        <w:t xml:space="preserve">[Author to confirm roles and add any co-authors.]</w:t>
       </w:r>
     </w:p>
     <w:bookmarkEnd w:id="31"/>
@@ -12832,11 +12865,17 @@
         <w:pStyle w:val="FirstParagraph"/>
       </w:pPr>
       <w:r>
+        <w:t xml:space="preserve">The author declares that he has no known competing financial interests or personal relationships that could have appeared to influence the work reported in this paper.</w:t>
+      </w:r>
+      <w:r>
+        <w:t xml:space="preserve"> </w:t>
+      </w:r>
+      <w:r>
         <w:rPr>
           <w:bCs/>
           <w:b/>
         </w:rPr>
-        <w:t xml:space="preserve">[TODO: State competing interests or confirm there are none.]</w:t>
+        <w:t xml:space="preserve">[Author to confirm.]</w:t>
       </w:r>
     </w:p>
     <w:bookmarkEnd w:id="32"/>
@@ -12854,11 +12893,17 @@
         <w:pStyle w:val="FirstParagraph"/>
       </w:pPr>
       <w:r>
+        <w:t xml:space="preserve">During the preparation of this work, the author used Claude (Anthropic) to assist with writing and running the simulation and experiment code, analyzing results, and drafting and language-editing the manuscript. After using this tool, the author reviewed and edited the content as needed and takes full responsibility for the content of the publication.</w:t>
+      </w:r>
+      <w:r>
+        <w:t xml:space="preserve"> </w:t>
+      </w:r>
+      <w:r>
         <w:rPr>
           <w:bCs/>
           <w:b/>
         </w:rPr>
-        <w:t xml:space="preserve">[TODO: Elsevier asks authors to disclose any use of generative AI in preparing the manuscript. State truthfully what tools were used, for what, and that the authors reviewed and take responsibility for the content.]</w:t>
+        <w:t xml:space="preserve">[Author to confirm that this statement is accurate before submission.]</w:t>
       </w:r>
     </w:p>
     <w:bookmarkEnd w:id="33"/>
@@ -12876,11 +12921,17 @@
         <w:pStyle w:val="FirstParagraph"/>
       </w:pPr>
       <w:r>
+        <w:t xml:space="preserve">The code, simulation seeds, and result files are available at https://github.com/ooklee-sudo/fluffy-meme (branch claude/elegant-johnson-xo3pqu).</w:t>
+      </w:r>
+      <w:r>
+        <w:t xml:space="preserve"> </w:t>
+      </w:r>
+      <w:r>
         <w:rPr>
           <w:bCs/>
           <w:b/>
         </w:rPr>
-        <w:t xml:space="preserve">[TODO: Repository link for code, simulation seeds, and result files.]</w:t>
+        <w:t xml:space="preserve">[Author to confirm that the repository is accessible to reviewers and to archive a permanent copy in a DOI-issuing repository before submission.]</w:t>
       </w:r>
     </w:p>
     <w:bookmarkEnd w:id="34"/>

</xml_diff>

<commit_message>
Update manuscripts with intermediate-drift pairs (+40k, +60k): ACT gain rises with upgrade size
Co-Authored-By: Claude Sonnet 5.5 <noreply@anthropic.com>
Claude-Session: https://claude.ai/code/session_01CmDdfYCJkX1v32uwdfkXMf
</commit_message>
<xml_diff>
--- a/manuscript/dss_manuscript.docx
+++ b/manuscript/dss_manuscript.docx
@@ -879,7 +879,31 @@
         <w:t xml:space="preserve"> </w:t>
       </w:r>
       <w:r>
-        <w:t xml:space="preserve">Copying</w:t>
+        <w:t xml:space="preserve">Within</w:t>
+      </w:r>
+      <w:r>
+        <w:t xml:space="preserve"> </w:t>
+      </w:r>
+      <w:r>
+        <w:t xml:space="preserve">one</w:t>
+      </w:r>
+      <w:r>
+        <w:t xml:space="preserve"> </w:t>
+      </w:r>
+      <w:r>
+        <w:t xml:space="preserve">model</w:t>
+      </w:r>
+      <w:r>
+        <w:t xml:space="preserve"> </w:t>
+      </w:r>
+      <w:r>
+        <w:t xml:space="preserve">family,</w:t>
+      </w:r>
+      <w:r>
+        <w:t xml:space="preserve"> </w:t>
+      </w:r>
+      <w:r>
+        <w:t xml:space="preserve">copying</w:t>
       </w:r>
       <w:r>
         <w:t xml:space="preserve"> </w:t>
@@ -909,7 +933,115 @@
         <w:t xml:space="preserve"> </w:t>
       </w:r>
       <w:r>
-        <w:t xml:space="preserve">93</w:t>
+        <w:t xml:space="preserve">96</w:t>
+      </w:r>
+      <w:r>
+        <w:t xml:space="preserve"> </w:t>
+      </w:r>
+      <w:r>
+        <w:t xml:space="preserve">percent</w:t>
+      </w:r>
+      <w:r>
+        <w:t xml:space="preserve"> </w:t>
+      </w:r>
+      <w:r>
+        <w:t xml:space="preserve">of</w:t>
+      </w:r>
+      <w:r>
+        <w:t xml:space="preserve"> </w:t>
+      </w:r>
+      <w:r>
+        <w:t xml:space="preserve">the</w:t>
+      </w:r>
+      <w:r>
+        <w:t xml:space="preserve"> </w:t>
+      </w:r>
+      <w:r>
+        <w:t xml:space="preserve">retraining</w:t>
+      </w:r>
+      <w:r>
+        <w:t xml:space="preserve"> </w:t>
+      </w:r>
+      <w:r>
+        <w:t xml:space="preserve">benefit</w:t>
+      </w:r>
+      <w:r>
+        <w:t xml:space="preserve"> </w:t>
+      </w:r>
+      <w:r>
+        <w:t xml:space="preserve">after</w:t>
+      </w:r>
+      <w:r>
+        <w:t xml:space="preserve"> </w:t>
+      </w:r>
+      <w:r>
+        <w:t xml:space="preserve">a</w:t>
+      </w:r>
+      <w:r>
+        <w:t xml:space="preserve"> </w:t>
+      </w:r>
+      <w:r>
+        <w:t xml:space="preserve">small</w:t>
+      </w:r>
+      <w:r>
+        <w:t xml:space="preserve"> </w:t>
+      </w:r>
+      <w:r>
+        <w:t xml:space="preserve">upgrade,</w:t>
+      </w:r>
+      <w:r>
+        <w:t xml:space="preserve"> </w:t>
+      </w:r>
+      <w:r>
+        <w:t xml:space="preserve">55</w:t>
+      </w:r>
+      <w:r>
+        <w:t xml:space="preserve"> </w:t>
+      </w:r>
+      <w:r>
+        <w:t xml:space="preserve">percent</w:t>
+      </w:r>
+      <w:r>
+        <w:t xml:space="preserve"> </w:t>
+      </w:r>
+      <w:r>
+        <w:t xml:space="preserve">after</w:t>
+      </w:r>
+      <w:r>
+        <w:t xml:space="preserve"> </w:t>
+      </w:r>
+      <w:r>
+        <w:t xml:space="preserve">a</w:t>
+      </w:r>
+      <w:r>
+        <w:t xml:space="preserve"> </w:t>
+      </w:r>
+      <w:r>
+        <w:t xml:space="preserve">larger</w:t>
+      </w:r>
+      <w:r>
+        <w:t xml:space="preserve"> </w:t>
+      </w:r>
+      <w:r>
+        <w:t xml:space="preserve">one,</w:t>
+      </w:r>
+      <w:r>
+        <w:t xml:space="preserve"> </w:t>
+      </w:r>
+      <w:r>
+        <w:t xml:space="preserve">and</w:t>
+      </w:r>
+      <w:r>
+        <w:t xml:space="preserve"> </w:t>
+      </w:r>
+      <w:r>
+        <w:t xml:space="preserve">only</w:t>
+      </w:r>
+      <w:r>
+        <w:t xml:space="preserve"> </w:t>
+      </w:r>
+      <w:r>
+        <w:t xml:space="preserve">32</w:t>
       </w:r>
       <w:r>
         <w:t xml:space="preserve"> </w:t>
@@ -921,7 +1053,7 @@
         <w:t xml:space="preserve"> </w:t>
       </w:r>
       <w:r>
-        <w:t xml:space="preserve">96</w:t>
+        <w:t xml:space="preserve">36</w:t>
       </w:r>
       <w:r>
         <w:t xml:space="preserve"> </w:t>
@@ -933,6 +1065,204 @@
         <w:t xml:space="preserve"> </w:t>
       </w:r>
       <w:r>
+        <w:t xml:space="preserve">after</w:t>
+      </w:r>
+      <w:r>
+        <w:t xml:space="preserve"> </w:t>
+      </w:r>
+      <w:r>
+        <w:t xml:space="preserve">the</w:t>
+      </w:r>
+      <w:r>
+        <w:t xml:space="preserve"> </w:t>
+      </w:r>
+      <w:r>
+        <w:t xml:space="preserve">largest</w:t>
+      </w:r>
+      <w:r>
+        <w:t xml:space="preserve"> </w:t>
+      </w:r>
+      <w:r>
+        <w:t xml:space="preserve">(two</w:t>
+      </w:r>
+      <w:r>
+        <w:t xml:space="preserve"> </w:t>
+      </w:r>
+      <w:r>
+        <w:t xml:space="preserve">seeds);</w:t>
+      </w:r>
+      <w:r>
+        <w:t xml:space="preserve"> </w:t>
+      </w:r>
+      <w:r>
+        <w:t xml:space="preserve">after</w:t>
+      </w:r>
+      <w:r>
+        <w:t xml:space="preserve"> </w:t>
+      </w:r>
+      <w:r>
+        <w:t xml:space="preserve">instruction</w:t>
+      </w:r>
+      <w:r>
+        <w:t xml:space="preserve"> </w:t>
+      </w:r>
+      <w:r>
+        <w:t xml:space="preserve">tuning</w:t>
+      </w:r>
+      <w:r>
+        <w:t xml:space="preserve"> </w:t>
+      </w:r>
+      <w:r>
+        <w:t xml:space="preserve">it</w:t>
+      </w:r>
+      <w:r>
+        <w:t xml:space="preserve"> </w:t>
+      </w:r>
+      <w:r>
+        <w:t xml:space="preserve">restores</w:t>
+      </w:r>
+      <w:r>
+        <w:t xml:space="preserve"> </w:t>
+      </w:r>
+      <w:r>
+        <w:t xml:space="preserve">71</w:t>
+      </w:r>
+      <w:r>
+        <w:t xml:space="preserve"> </w:t>
+      </w:r>
+      <w:r>
+        <w:t xml:space="preserve">percent.</w:t>
+      </w:r>
+      <w:r>
+        <w:t xml:space="preserve"> </w:t>
+      </w:r>
+      <w:r>
+        <w:t xml:space="preserve">A</w:t>
+      </w:r>
+      <w:r>
+        <w:t xml:space="preserve"> </w:t>
+      </w:r>
+      <w:r>
+        <w:t xml:space="preserve">label-free,</w:t>
+      </w:r>
+      <w:r>
+        <w:t xml:space="preserve"> </w:t>
+      </w:r>
+      <w:r>
+        <w:t xml:space="preserve">closed-form</w:t>
+      </w:r>
+      <w:r>
+        <w:t xml:space="preserve"> </w:t>
+      </w:r>
+      <w:r>
+        <w:t xml:space="preserve">transfer</w:t>
+      </w:r>
+      <w:r>
+        <w:t xml:space="preserve"> </w:t>
+      </w:r>
+      <w:r>
+        <w:t xml:space="preserve">method,</w:t>
+      </w:r>
+      <w:r>
+        <w:t xml:space="preserve"> </w:t>
+      </w:r>
+      <w:r>
+        <w:t xml:space="preserve">Anchored</w:t>
+      </w:r>
+      <w:r>
+        <w:t xml:space="preserve"> </w:t>
+      </w:r>
+      <w:r>
+        <w:t xml:space="preserve">Calibration</w:t>
+      </w:r>
+      <w:r>
+        <w:t xml:space="preserve"> </w:t>
+      </w:r>
+      <w:r>
+        <w:t xml:space="preserve">Transfer</w:t>
+      </w:r>
+      <w:r>
+        <w:t xml:space="preserve"> </w:t>
+      </w:r>
+      <w:r>
+        <w:t xml:space="preserve">(ACT),</w:t>
+      </w:r>
+      <w:r>
+        <w:t xml:space="preserve"> </w:t>
+      </w:r>
+      <w:r>
+        <w:t xml:space="preserve">improves</w:t>
+      </w:r>
+      <w:r>
+        <w:t xml:space="preserve"> </w:t>
+      </w:r>
+      <w:r>
+        <w:t xml:space="preserve">on</w:t>
+      </w:r>
+      <w:r>
+        <w:t xml:space="preserve"> </w:t>
+      </w:r>
+      <w:r>
+        <w:t xml:space="preserve">copying</w:t>
+      </w:r>
+      <w:r>
+        <w:t xml:space="preserve"> </w:t>
+      </w:r>
+      <w:r>
+        <w:t xml:space="preserve">by</w:t>
+      </w:r>
+      <w:r>
+        <w:t xml:space="preserve"> </w:t>
+      </w:r>
+      <w:r>
+        <w:t xml:space="preserve">an</w:t>
+      </w:r>
+      <w:r>
+        <w:t xml:space="preserve"> </w:t>
+      </w:r>
+      <w:r>
+        <w:t xml:space="preserve">amount</w:t>
+      </w:r>
+      <w:r>
+        <w:t xml:space="preserve"> </w:t>
+      </w:r>
+      <w:r>
+        <w:t xml:space="preserve">that</w:t>
+      </w:r>
+      <w:r>
+        <w:t xml:space="preserve"> </w:t>
+      </w:r>
+      <w:r>
+        <w:t xml:space="preserve">rises</w:t>
+      </w:r>
+      <w:r>
+        <w:t xml:space="preserve"> </w:t>
+      </w:r>
+      <w:r>
+        <w:t xml:space="preserve">steadily</w:t>
+      </w:r>
+      <w:r>
+        <w:t xml:space="preserve"> </w:t>
+      </w:r>
+      <w:r>
+        <w:t xml:space="preserve">with</w:t>
+      </w:r>
+      <w:r>
+        <w:t xml:space="preserve"> </w:t>
+      </w:r>
+      <w:r>
+        <w:t xml:space="preserve">the</w:t>
+      </w:r>
+      <w:r>
+        <w:t xml:space="preserve"> </w:t>
+      </w:r>
+      <w:r>
+        <w:t xml:space="preserve">size</w:t>
+      </w:r>
+      <w:r>
+        <w:t xml:space="preserve"> </w:t>
+      </w:r>
+      <w:r>
         <w:t xml:space="preserve">of</w:t>
       </w:r>
       <w:r>
@@ -945,25 +1275,253 @@
         <w:t xml:space="preserve"> </w:t>
       </w:r>
       <w:r>
+        <w:t xml:space="preserve">upgrade.</w:t>
+      </w:r>
+      <w:r>
+        <w:t xml:space="preserve"> </w:t>
+      </w:r>
+      <w:r>
+        <w:t xml:space="preserve">After</w:t>
+      </w:r>
+      <w:r>
+        <w:t xml:space="preserve"> </w:t>
+      </w:r>
+      <w:r>
+        <w:t xml:space="preserve">the</w:t>
+      </w:r>
+      <w:r>
+        <w:t xml:space="preserve"> </w:t>
+      </w:r>
+      <w:r>
+        <w:t xml:space="preserve">largest</w:t>
+      </w:r>
+      <w:r>
+        <w:t xml:space="preserve"> </w:t>
+      </w:r>
+      <w:r>
+        <w:t xml:space="preserve">upgrade</w:t>
+      </w:r>
+      <w:r>
+        <w:t xml:space="preserve"> </w:t>
+      </w:r>
+      <w:r>
+        <w:t xml:space="preserve">it</w:t>
+      </w:r>
+      <w:r>
+        <w:t xml:space="preserve"> </w:t>
+      </w:r>
+      <w:r>
+        <w:t xml:space="preserve">restores</w:t>
+      </w:r>
+      <w:r>
+        <w:t xml:space="preserve"> </w:t>
+      </w:r>
+      <w:r>
+        <w:t xml:space="preserve">69</w:t>
+      </w:r>
+      <w:r>
+        <w:t xml:space="preserve"> </w:t>
+      </w:r>
+      <w:r>
+        <w:t xml:space="preserve">to</w:t>
+      </w:r>
+      <w:r>
+        <w:t xml:space="preserve"> </w:t>
+      </w:r>
+      <w:r>
+        <w:t xml:space="preserve">72</w:t>
+      </w:r>
+      <w:r>
+        <w:t xml:space="preserve"> </w:t>
+      </w:r>
+      <w:r>
+        <w:t xml:space="preserve">percent</w:t>
+      </w:r>
+      <w:r>
+        <w:t xml:space="preserve"> </w:t>
+      </w:r>
+      <w:r>
+        <w:t xml:space="preserve">at</w:t>
+      </w:r>
+      <w:r>
+        <w:t xml:space="preserve"> </w:t>
+      </w:r>
+      <w:r>
+        <w:t xml:space="preserve">about</w:t>
+      </w:r>
+      <w:r>
+        <w:t xml:space="preserve"> </w:t>
+      </w:r>
+      <w:r>
+        <w:t xml:space="preserve">a</w:t>
+      </w:r>
+      <w:r>
+        <w:t xml:space="preserve"> </w:t>
+      </w:r>
+      <w:r>
+        <w:t xml:space="preserve">third</w:t>
+      </w:r>
+      <w:r>
+        <w:t xml:space="preserve"> </w:t>
+      </w:r>
+      <w:r>
+        <w:t xml:space="preserve">of</w:t>
+      </w:r>
+      <w:r>
+        <w:t xml:space="preserve"> </w:t>
+      </w:r>
+      <w:r>
+        <w:t xml:space="preserve">the</w:t>
+      </w:r>
+      <w:r>
+        <w:t xml:space="preserve"> </w:t>
+      </w:r>
+      <w:r>
         <w:t xml:space="preserve">retraining</w:t>
       </w:r>
       <w:r>
         <w:t xml:space="preserve"> </w:t>
       </w:r>
       <w:r>
-        <w:t xml:space="preserve">benefit</w:t>
-      </w:r>
-      <w:r>
-        <w:t xml:space="preserve"> </w:t>
-      </w:r>
-      <w:r>
-        <w:t xml:space="preserve">after</w:t>
-      </w:r>
-      <w:r>
-        <w:t xml:space="preserve"> </w:t>
-      </w:r>
-      <w:r>
-        <w:t xml:space="preserve">small</w:t>
+        <w:t xml:space="preserve">compute</w:t>
+      </w:r>
+      <w:r>
+        <w:t xml:space="preserve"> </w:t>
+      </w:r>
+      <w:r>
+        <w:t xml:space="preserve">time,</w:t>
+      </w:r>
+      <w:r>
+        <w:t xml:space="preserve"> </w:t>
+      </w:r>
+      <w:r>
+        <w:t xml:space="preserve">which</w:t>
+      </w:r>
+      <w:r>
+        <w:t xml:space="preserve"> </w:t>
+      </w:r>
+      <w:r>
+        <w:t xml:space="preserve">makes</w:t>
+      </w:r>
+      <w:r>
+        <w:t xml:space="preserve"> </w:t>
+      </w:r>
+      <w:r>
+        <w:t xml:space="preserve">it</w:t>
+      </w:r>
+      <w:r>
+        <w:t xml:space="preserve"> </w:t>
+      </w:r>
+      <w:r>
+        <w:t xml:space="preserve">the</w:t>
+      </w:r>
+      <w:r>
+        <w:t xml:space="preserve"> </w:t>
+      </w:r>
+      <w:r>
+        <w:t xml:space="preserve">cost-minimizing</w:t>
+      </w:r>
+      <w:r>
+        <w:t xml:space="preserve"> </w:t>
+      </w:r>
+      <w:r>
+        <w:t xml:space="preserve">policy</w:t>
+      </w:r>
+      <w:r>
+        <w:t xml:space="preserve"> </w:t>
+      </w:r>
+      <w:r>
+        <w:t xml:space="preserve">for</w:t>
+      </w:r>
+      <w:r>
+        <w:t xml:space="preserve"> </w:t>
+      </w:r>
+      <w:r>
+        <w:t xml:space="preserve">adapters</w:t>
+      </w:r>
+      <w:r>
+        <w:t xml:space="preserve"> </w:t>
+      </w:r>
+      <w:r>
+        <w:t xml:space="preserve">whose</w:t>
+      </w:r>
+      <w:r>
+        <w:t xml:space="preserve"> </w:t>
+      </w:r>
+      <w:r>
+        <w:t xml:space="preserve">annual</w:t>
+      </w:r>
+      <w:r>
+        <w:t xml:space="preserve"> </w:t>
+      </w:r>
+      <w:r>
+        <w:t xml:space="preserve">value</w:t>
+      </w:r>
+      <w:r>
+        <w:t xml:space="preserve"> </w:t>
+      </w:r>
+      <w:r>
+        <w:t xml:space="preserve">is</w:t>
+      </w:r>
+      <w:r>
+        <w:t xml:space="preserve"> </w:t>
+      </w:r>
+      <w:r>
+        <w:t xml:space="preserve">roughly</w:t>
+      </w:r>
+      <w:r>
+        <w:t xml:space="preserve"> </w:t>
+      </w:r>
+      <w:r>
+        <w:t xml:space="preserve">1.8</w:t>
+      </w:r>
+      <w:r>
+        <w:t xml:space="preserve"> </w:t>
+      </w:r>
+      <w:r>
+        <w:t xml:space="preserve">to</w:t>
+      </w:r>
+      <w:r>
+        <w:t xml:space="preserve"> </w:t>
+      </w:r>
+      <w:r>
+        <w:t xml:space="preserve">4.4</w:t>
+      </w:r>
+      <w:r>
+        <w:t xml:space="preserve"> </w:t>
+      </w:r>
+      <w:r>
+        <w:t xml:space="preserve">times</w:t>
+      </w:r>
+      <w:r>
+        <w:t xml:space="preserve"> </w:t>
+      </w:r>
+      <w:r>
+        <w:t xml:space="preserve">the</w:t>
+      </w:r>
+      <w:r>
+        <w:t xml:space="preserve"> </w:t>
+      </w:r>
+      <w:r>
+        <w:t xml:space="preserve">retraining</w:t>
+      </w:r>
+      <w:r>
+        <w:t xml:space="preserve"> </w:t>
+      </w:r>
+      <w:r>
+        <w:t xml:space="preserve">cost.</w:t>
+      </w:r>
+      <w:r>
+        <w:t xml:space="preserve"> </w:t>
+      </w:r>
+      <w:r>
+        <w:t xml:space="preserve">After</w:t>
+      </w:r>
+      <w:r>
+        <w:t xml:space="preserve"> </w:t>
+      </w:r>
+      <w:r>
+        <w:t xml:space="preserve">smaller</w:t>
       </w:r>
       <w:r>
         <w:t xml:space="preserve"> </w:t>
@@ -975,43 +1533,115 @@
         <w:t xml:space="preserve"> </w:t>
       </w:r>
       <w:r>
-        <w:t xml:space="preserve">but</w:t>
-      </w:r>
-      <w:r>
-        <w:t xml:space="preserve"> </w:t>
-      </w:r>
-      <w:r>
-        <w:t xml:space="preserve">only</w:t>
-      </w:r>
-      <w:r>
-        <w:t xml:space="preserve"> </w:t>
-      </w:r>
-      <w:r>
-        <w:t xml:space="preserve">32</w:t>
-      </w:r>
-      <w:r>
-        <w:t xml:space="preserve"> </w:t>
-      </w:r>
-      <w:r>
-        <w:t xml:space="preserve">to</w:t>
-      </w:r>
-      <w:r>
-        <w:t xml:space="preserve"> </w:t>
-      </w:r>
-      <w:r>
-        <w:t xml:space="preserve">36</w:t>
-      </w:r>
-      <w:r>
-        <w:t xml:space="preserve"> </w:t>
-      </w:r>
-      <w:r>
-        <w:t xml:space="preserve">percent</w:t>
-      </w:r>
-      <w:r>
-        <w:t xml:space="preserve"> </w:t>
-      </w:r>
-      <w:r>
-        <w:t xml:space="preserve">after</w:t>
+        <w:t xml:space="preserve">its</w:t>
+      </w:r>
+      <w:r>
+        <w:t xml:space="preserve"> </w:t>
+      </w:r>
+      <w:r>
+        <w:t xml:space="preserve">gain</w:t>
+      </w:r>
+      <w:r>
+        <w:t xml:space="preserve"> </w:t>
+      </w:r>
+      <w:r>
+        <w:t xml:space="preserve">does</w:t>
+      </w:r>
+      <w:r>
+        <w:t xml:space="preserve"> </w:t>
+      </w:r>
+      <w:r>
+        <w:t xml:space="preserve">not</w:t>
+      </w:r>
+      <w:r>
+        <w:t xml:space="preserve"> </w:t>
+      </w:r>
+      <w:r>
+        <w:t xml:space="preserve">cover</w:t>
+      </w:r>
+      <w:r>
+        <w:t xml:space="preserve"> </w:t>
+      </w:r>
+      <w:r>
+        <w:t xml:space="preserve">its</w:t>
+      </w:r>
+      <w:r>
+        <w:t xml:space="preserve"> </w:t>
+      </w:r>
+      <w:r>
+        <w:t xml:space="preserve">cost,</w:t>
+      </w:r>
+      <w:r>
+        <w:t xml:space="preserve"> </w:t>
+      </w:r>
+      <w:r>
+        <w:t xml:space="preserve">and</w:t>
+      </w:r>
+      <w:r>
+        <w:t xml:space="preserve"> </w:t>
+      </w:r>
+      <w:r>
+        <w:t xml:space="preserve">on</w:t>
+      </w:r>
+      <w:r>
+        <w:t xml:space="preserve"> </w:t>
+      </w:r>
+      <w:r>
+        <w:t xml:space="preserve">the</w:t>
+      </w:r>
+      <w:r>
+        <w:t xml:space="preserve"> </w:t>
+      </w:r>
+      <w:r>
+        <w:t xml:space="preserve">instruction-tuned</w:t>
+      </w:r>
+      <w:r>
+        <w:t xml:space="preserve"> </w:t>
+      </w:r>
+      <w:r>
+        <w:t xml:space="preserve">pair</w:t>
+      </w:r>
+      <w:r>
+        <w:t xml:space="preserve"> </w:t>
+      </w:r>
+      <w:r>
+        <w:t xml:space="preserve">it</w:t>
+      </w:r>
+      <w:r>
+        <w:t xml:space="preserve"> </w:t>
+      </w:r>
+      <w:r>
+        <w:t xml:space="preserve">gives</w:t>
+      </w:r>
+      <w:r>
+        <w:t xml:space="preserve"> </w:t>
+      </w:r>
+      <w:r>
+        <w:t xml:space="preserve">no</w:t>
+      </w:r>
+      <w:r>
+        <w:t xml:space="preserve"> </w:t>
+      </w:r>
+      <w:r>
+        <w:t xml:space="preserve">gain</w:t>
+      </w:r>
+      <w:r>
+        <w:t xml:space="preserve"> </w:t>
+      </w:r>
+      <w:r>
+        <w:t xml:space="preserve">at</w:t>
+      </w:r>
+      <w:r>
+        <w:t xml:space="preserve"> </w:t>
+      </w:r>
+      <w:r>
+        <w:t xml:space="preserve">all,</w:t>
+      </w:r>
+      <w:r>
+        <w:t xml:space="preserve"> </w:t>
+      </w:r>
+      <w:r>
+        <w:t xml:space="preserve">for</w:t>
       </w:r>
       <w:r>
         <w:t xml:space="preserve"> </w:t>
@@ -1023,433 +1653,7 @@
         <w:t xml:space="preserve"> </w:t>
       </w:r>
       <w:r>
-        <w:t xml:space="preserve">large</w:t>
-      </w:r>
-      <w:r>
-        <w:t xml:space="preserve"> </w:t>
-      </w:r>
-      <w:r>
-        <w:t xml:space="preserve">one</w:t>
-      </w:r>
-      <w:r>
-        <w:t xml:space="preserve"> </w:t>
-      </w:r>
-      <w:r>
-        <w:t xml:space="preserve">(two</w:t>
-      </w:r>
-      <w:r>
-        <w:t xml:space="preserve"> </w:t>
-      </w:r>
-      <w:r>
-        <w:t xml:space="preserve">seeds),</w:t>
-      </w:r>
-      <w:r>
-        <w:t xml:space="preserve"> </w:t>
-      </w:r>
-      <w:r>
-        <w:t xml:space="preserve">and</w:t>
-      </w:r>
-      <w:r>
-        <w:t xml:space="preserve"> </w:t>
-      </w:r>
-      <w:r>
-        <w:t xml:space="preserve">71</w:t>
-      </w:r>
-      <w:r>
-        <w:t xml:space="preserve"> </w:t>
-      </w:r>
-      <w:r>
-        <w:t xml:space="preserve">percent</w:t>
-      </w:r>
-      <w:r>
-        <w:t xml:space="preserve"> </w:t>
-      </w:r>
-      <w:r>
-        <w:t xml:space="preserve">after</w:t>
-      </w:r>
-      <w:r>
-        <w:t xml:space="preserve"> </w:t>
-      </w:r>
-      <w:r>
-        <w:t xml:space="preserve">instruction</w:t>
-      </w:r>
-      <w:r>
-        <w:t xml:space="preserve"> </w:t>
-      </w:r>
-      <w:r>
-        <w:t xml:space="preserve">tuning.</w:t>
-      </w:r>
-      <w:r>
-        <w:t xml:space="preserve"> </w:t>
-      </w:r>
-      <w:r>
-        <w:t xml:space="preserve">A</w:t>
-      </w:r>
-      <w:r>
-        <w:t xml:space="preserve"> </w:t>
-      </w:r>
-      <w:r>
-        <w:t xml:space="preserve">label-free,</w:t>
-      </w:r>
-      <w:r>
-        <w:t xml:space="preserve"> </w:t>
-      </w:r>
-      <w:r>
-        <w:t xml:space="preserve">closed-form</w:t>
-      </w:r>
-      <w:r>
-        <w:t xml:space="preserve"> </w:t>
-      </w:r>
-      <w:r>
-        <w:t xml:space="preserve">transfer</w:t>
-      </w:r>
-      <w:r>
-        <w:t xml:space="preserve"> </w:t>
-      </w:r>
-      <w:r>
-        <w:t xml:space="preserve">method,</w:t>
-      </w:r>
-      <w:r>
-        <w:t xml:space="preserve"> </w:t>
-      </w:r>
-      <w:r>
-        <w:t xml:space="preserve">Anchored</w:t>
-      </w:r>
-      <w:r>
-        <w:t xml:space="preserve"> </w:t>
-      </w:r>
-      <w:r>
-        <w:t xml:space="preserve">Calibration</w:t>
-      </w:r>
-      <w:r>
-        <w:t xml:space="preserve"> </w:t>
-      </w:r>
-      <w:r>
-        <w:t xml:space="preserve">Transfer</w:t>
-      </w:r>
-      <w:r>
-        <w:t xml:space="preserve"> </w:t>
-      </w:r>
-      <w:r>
-        <w:t xml:space="preserve">(ACT),</w:t>
-      </w:r>
-      <w:r>
-        <w:t xml:space="preserve"> </w:t>
-      </w:r>
-      <w:r>
-        <w:t xml:space="preserve">restores</w:t>
-      </w:r>
-      <w:r>
-        <w:t xml:space="preserve"> </w:t>
-      </w:r>
-      <w:r>
-        <w:t xml:space="preserve">69</w:t>
-      </w:r>
-      <w:r>
-        <w:t xml:space="preserve"> </w:t>
-      </w:r>
-      <w:r>
-        <w:t xml:space="preserve">to</w:t>
-      </w:r>
-      <w:r>
-        <w:t xml:space="preserve"> </w:t>
-      </w:r>
-      <w:r>
-        <w:t xml:space="preserve">72</w:t>
-      </w:r>
-      <w:r>
-        <w:t xml:space="preserve"> </w:t>
-      </w:r>
-      <w:r>
-        <w:t xml:space="preserve">percent</w:t>
-      </w:r>
-      <w:r>
-        <w:t xml:space="preserve"> </w:t>
-      </w:r>
-      <w:r>
-        <w:t xml:space="preserve">after</w:t>
-      </w:r>
-      <w:r>
-        <w:t xml:space="preserve"> </w:t>
-      </w:r>
-      <w:r>
-        <w:t xml:space="preserve">the</w:t>
-      </w:r>
-      <w:r>
-        <w:t xml:space="preserve"> </w:t>
-      </w:r>
-      <w:r>
-        <w:t xml:space="preserve">large</w:t>
-      </w:r>
-      <w:r>
-        <w:t xml:space="preserve"> </w:t>
-      </w:r>
-      <w:r>
-        <w:t xml:space="preserve">upgrade</w:t>
-      </w:r>
-      <w:r>
-        <w:t xml:space="preserve"> </w:t>
-      </w:r>
-      <w:r>
-        <w:t xml:space="preserve">at</w:t>
-      </w:r>
-      <w:r>
-        <w:t xml:space="preserve"> </w:t>
-      </w:r>
-      <w:r>
-        <w:t xml:space="preserve">about</w:t>
-      </w:r>
-      <w:r>
-        <w:t xml:space="preserve"> </w:t>
-      </w:r>
-      <w:r>
-        <w:t xml:space="preserve">a</w:t>
-      </w:r>
-      <w:r>
-        <w:t xml:space="preserve"> </w:t>
-      </w:r>
-      <w:r>
-        <w:t xml:space="preserve">third</w:t>
-      </w:r>
-      <w:r>
-        <w:t xml:space="preserve"> </w:t>
-      </w:r>
-      <w:r>
-        <w:t xml:space="preserve">of</w:t>
-      </w:r>
-      <w:r>
-        <w:t xml:space="preserve"> </w:t>
-      </w:r>
-      <w:r>
-        <w:t xml:space="preserve">the</w:t>
-      </w:r>
-      <w:r>
-        <w:t xml:space="preserve"> </w:t>
-      </w:r>
-      <w:r>
-        <w:t xml:space="preserve">retraining</w:t>
-      </w:r>
-      <w:r>
-        <w:t xml:space="preserve"> </w:t>
-      </w:r>
-      <w:r>
-        <w:t xml:space="preserve">compute</w:t>
-      </w:r>
-      <w:r>
-        <w:t xml:space="preserve"> </w:t>
-      </w:r>
-      <w:r>
-        <w:t xml:space="preserve">time,</w:t>
-      </w:r>
-      <w:r>
-        <w:t xml:space="preserve"> </w:t>
-      </w:r>
-      <w:r>
-        <w:t xml:space="preserve">which</w:t>
-      </w:r>
-      <w:r>
-        <w:t xml:space="preserve"> </w:t>
-      </w:r>
-      <w:r>
-        <w:t xml:space="preserve">makes</w:t>
-      </w:r>
-      <w:r>
-        <w:t xml:space="preserve"> </w:t>
-      </w:r>
-      <w:r>
-        <w:t xml:space="preserve">it</w:t>
-      </w:r>
-      <w:r>
-        <w:t xml:space="preserve"> </w:t>
-      </w:r>
-      <w:r>
-        <w:t xml:space="preserve">the</w:t>
-      </w:r>
-      <w:r>
-        <w:t xml:space="preserve"> </w:t>
-      </w:r>
-      <w:r>
-        <w:t xml:space="preserve">cost-minimizing</w:t>
-      </w:r>
-      <w:r>
-        <w:t xml:space="preserve"> </w:t>
-      </w:r>
-      <w:r>
-        <w:t xml:space="preserve">policy</w:t>
-      </w:r>
-      <w:r>
-        <w:t xml:space="preserve"> </w:t>
-      </w:r>
-      <w:r>
-        <w:t xml:space="preserve">for</w:t>
-      </w:r>
-      <w:r>
-        <w:t xml:space="preserve"> </w:t>
-      </w:r>
-      <w:r>
-        <w:t xml:space="preserve">adapters</w:t>
-      </w:r>
-      <w:r>
-        <w:t xml:space="preserve"> </w:t>
-      </w:r>
-      <w:r>
-        <w:t xml:space="preserve">whose</w:t>
-      </w:r>
-      <w:r>
-        <w:t xml:space="preserve"> </w:t>
-      </w:r>
-      <w:r>
-        <w:t xml:space="preserve">annual</w:t>
-      </w:r>
-      <w:r>
-        <w:t xml:space="preserve"> </w:t>
-      </w:r>
-      <w:r>
-        <w:t xml:space="preserve">value</w:t>
-      </w:r>
-      <w:r>
-        <w:t xml:space="preserve"> </w:t>
-      </w:r>
-      <w:r>
-        <w:t xml:space="preserve">is</w:t>
-      </w:r>
-      <w:r>
-        <w:t xml:space="preserve"> </w:t>
-      </w:r>
-      <w:r>
-        <w:t xml:space="preserve">roughly</w:t>
-      </w:r>
-      <w:r>
-        <w:t xml:space="preserve"> </w:t>
-      </w:r>
-      <w:r>
-        <w:t xml:space="preserve">1.8</w:t>
-      </w:r>
-      <w:r>
-        <w:t xml:space="preserve"> </w:t>
-      </w:r>
-      <w:r>
-        <w:t xml:space="preserve">to</w:t>
-      </w:r>
-      <w:r>
-        <w:t xml:space="preserve"> </w:t>
-      </w:r>
-      <w:r>
-        <w:t xml:space="preserve">4.4</w:t>
-      </w:r>
-      <w:r>
-        <w:t xml:space="preserve"> </w:t>
-      </w:r>
-      <w:r>
-        <w:t xml:space="preserve">times</w:t>
-      </w:r>
-      <w:r>
-        <w:t xml:space="preserve"> </w:t>
-      </w:r>
-      <w:r>
-        <w:t xml:space="preserve">the</w:t>
-      </w:r>
-      <w:r>
-        <w:t xml:space="preserve"> </w:t>
-      </w:r>
-      <w:r>
-        <w:t xml:space="preserve">retraining</w:t>
-      </w:r>
-      <w:r>
-        <w:t xml:space="preserve"> </w:t>
-      </w:r>
-      <w:r>
-        <w:t xml:space="preserve">cost.</w:t>
-      </w:r>
-      <w:r>
-        <w:t xml:space="preserve"> </w:t>
-      </w:r>
-      <w:r>
-        <w:t xml:space="preserve">After</w:t>
-      </w:r>
-      <w:r>
-        <w:t xml:space="preserve"> </w:t>
-      </w:r>
-      <w:r>
-        <w:t xml:space="preserve">small</w:t>
-      </w:r>
-      <w:r>
-        <w:t xml:space="preserve"> </w:t>
-      </w:r>
-      <w:r>
-        <w:t xml:space="preserve">upgrades,</w:t>
-      </w:r>
-      <w:r>
-        <w:t xml:space="preserve"> </w:t>
-      </w:r>
-      <w:r>
-        <w:t xml:space="preserve">and</w:t>
-      </w:r>
-      <w:r>
-        <w:t xml:space="preserve"> </w:t>
-      </w:r>
-      <w:r>
-        <w:t xml:space="preserve">for</w:t>
-      </w:r>
-      <w:r>
-        <w:t xml:space="preserve"> </w:t>
-      </w:r>
-      <w:r>
-        <w:t xml:space="preserve">the</w:t>
-      </w:r>
-      <w:r>
-        <w:t xml:space="preserve"> </w:t>
-      </w:r>
-      <w:r>
-        <w:t xml:space="preserve">instruction-tuned</w:t>
-      </w:r>
-      <w:r>
-        <w:t xml:space="preserve"> </w:t>
-      </w:r>
-      <w:r>
-        <w:t xml:space="preserve">pair,</w:t>
-      </w:r>
-      <w:r>
-        <w:t xml:space="preserve"> </w:t>
-      </w:r>
-      <w:r>
-        <w:t xml:space="preserve">it</w:t>
-      </w:r>
-      <w:r>
-        <w:t xml:space="preserve"> </w:t>
-      </w:r>
-      <w:r>
-        <w:t xml:space="preserve">offers</w:t>
-      </w:r>
-      <w:r>
-        <w:t xml:space="preserve"> </w:t>
-      </w:r>
-      <w:r>
-        <w:t xml:space="preserve">no</w:t>
-      </w:r>
-      <w:r>
-        <w:t xml:space="preserve"> </w:t>
-      </w:r>
-      <w:r>
-        <w:t xml:space="preserve">gain</w:t>
-      </w:r>
-      <w:r>
-        <w:t xml:space="preserve"> </w:t>
-      </w:r>
-      <w:r>
-        <w:t xml:space="preserve">over</w:t>
-      </w:r>
-      <w:r>
-        <w:t xml:space="preserve"> </w:t>
-      </w:r>
-      <w:r>
-        <w:t xml:space="preserve">copying,</w:t>
-      </w:r>
-      <w:r>
-        <w:t xml:space="preserve"> </w:t>
-      </w:r>
-      <w:r>
-        <w:t xml:space="preserve">and</w:t>
+        <w:t xml:space="preserve">reason</w:t>
       </w:r>
       <w:r>
         <w:t xml:space="preserve"> </w:t>
@@ -1461,7 +1665,7 @@
         <w:t xml:space="preserve"> </w:t>
       </w:r>
       <w:r>
-        <w:t xml:space="preserve">do</w:t>
+        <w:t xml:space="preserve">could</w:t>
       </w:r>
       <w:r>
         <w:t xml:space="preserve"> </w:t>
@@ -1473,31 +1677,7 @@
         <w:t xml:space="preserve"> </w:t>
       </w:r>
       <w:r>
-        <w:t xml:space="preserve">know</w:t>
-      </w:r>
-      <w:r>
-        <w:t xml:space="preserve"> </w:t>
-      </w:r>
-      <w:r>
-        <w:t xml:space="preserve">why</w:t>
-      </w:r>
-      <w:r>
-        <w:t xml:space="preserve"> </w:t>
-      </w:r>
-      <w:r>
-        <w:t xml:space="preserve">the</w:t>
-      </w:r>
-      <w:r>
-        <w:t xml:space="preserve"> </w:t>
-      </w:r>
-      <w:r>
-        <w:t xml:space="preserve">latter</w:t>
-      </w:r>
-      <w:r>
-        <w:t xml:space="preserve"> </w:t>
-      </w:r>
-      <w:r>
-        <w:t xml:space="preserve">differs.</w:t>
+        <w:t xml:space="preserve">identify.</w:t>
       </w:r>
       <w:r>
         <w:t xml:space="preserve"> </w:t>
@@ -2005,13 +2185,13 @@
         <w:t xml:space="preserve"> </w:t>
       </w:r>
       <w:r>
-        <w:t xml:space="preserve">On open model pairs, copying the old adapter recovers 93% to 96% of the retraining</w:t>
-      </w:r>
-      <w:r>
-        <w:t xml:space="preserve"> </w:t>
-      </w:r>
-      <w:r>
-        <w:t xml:space="preserve">benefit after small upgrades, 71% after an instruction-tuning upgrade, and only 32% to 36% after a large one. Through the model these numbers imply</w:t>
+        <w:t xml:space="preserve">On open model pairs, copying the old adapter recovers 96% of the retraining</w:t>
+      </w:r>
+      <w:r>
+        <w:t xml:space="preserve"> </w:t>
+      </w:r>
+      <w:r>
+        <w:t xml:space="preserve">benefit after a small upgrade, 55% after a larger one, and only 32% to 36% after the largest; after an instruction-tuning upgrade it recovers 71%. Through the model these numbers imply</w:t>
       </w:r>
       <w:r>
         <w:t xml:space="preserve"> </w:t>
@@ -2044,13 +2224,13 @@
         <w:t xml:space="preserve"> </w:t>
       </w:r>
       <w:r>
-        <w:t xml:space="preserve">After the large upgrade it improves recovery by 0.33 to 0.40 over copying (two seeds) at 30% to 36% of the retraining compute time, which makes it the</w:t>
-      </w:r>
-      <w:r>
-        <w:t xml:space="preserve"> </w:t>
-      </w:r>
-      <w:r>
-        <w:t xml:space="preserve">cost-minimizing policy over a bounded range of adapter values. After small upgrades it does not beat copying, and neither does it on the instruction-tuned pair, for a reason we could not identify.</w:t>
+        <w:t xml:space="preserve">Its gain over copying rises steadily with the size of the upgrade, reaching 0.33 to 0.40 after the largest (two seeds), where it restores 69% to 72% of the retraining benefit at 30% to 36% of the retraining compute time and is the</w:t>
+      </w:r>
+      <w:r>
+        <w:t xml:space="preserve"> </w:t>
+      </w:r>
+      <w:r>
+        <w:t xml:space="preserve">cost-minimizing policy over a bounded range of adapter values. After smaller upgrades its gain does not cover its cost, and on the instruction-tuned pair it gives no gain, for a reason we could not identify.</w:t>
       </w:r>
     </w:p>
     <w:p>
@@ -8247,10 +8427,18 @@
         </m:r>
       </m:oMath>
       <w:r>
-        <w:t xml:space="preserve"> </w:t>
-      </w:r>
-      <w:r>
-        <w:t xml:space="preserve">and</w:t>
+        <w:t xml:space="preserve">,</w:t>
+      </w:r>
+      <w:r>
+        <w:t xml:space="preserve"> </w:t>
+      </w:r>
+      <m:oMath>
+        <m:r>
+          <m:t>0.55</m:t>
+        </m:r>
+      </m:oMath>
+      <w:r>
+        <w:t xml:space="preserve">, and</w:t>
       </w:r>
       <w:r>
         <w:t xml:space="preserve"> </w:t>
@@ -8287,7 +8475,7 @@
         <w:t xml:space="preserve"> </w:t>
       </w:r>
       <w:r>
-        <w:t xml:space="preserve">the required gain is 2 to 3 points where copy recovers 93% to 96%, about 30 points where copy recovers 32%, and 21 points for the instruction-tuned pair, where ACT costs 0.65.</w:t>
+        <w:t xml:space="preserve">the required gain is 2 to 5 points where copy recovers 90% to 96%, about 20 points where copy recovers 55%, about 30 points where copy recovers 32%, and 21 points for the instruction-tuned pair, where ACT costs 0.65.</w:t>
       </w:r>
     </w:p>
     <w:p>
@@ -8620,7 +8808,7 @@
                 <w:rFonts w:ascii="Times New Roman" w:hAnsi="Times New Roman"/>
                 <w:sz w:val="20"/>
               </w:rPr>
-              <w:t xml:space="preserve">0.32 (Pythia, large upgrade)</w:t>
+              <w:t xml:space="preserve">0.32 (Pythia, largest upgrade)</w:t>
             </w:r>
           </w:p>
         </w:tc>
@@ -8698,7 +8886,7 @@
                 <w:rFonts w:ascii="Times New Roman" w:hAnsi="Times New Roman"/>
                 <w:sz w:val="20"/>
               </w:rPr>
-              <w:t xml:space="preserve">0.32 (Pythia, large upgrade)</w:t>
+              <w:t xml:space="preserve">0.32 (Pythia, largest upgrade)</w:t>
             </w:r>
           </w:p>
         </w:tc>
@@ -8756,6 +8944,84 @@
                 <w:sz w:val="20"/>
               </w:rPr>
               <w:t xml:space="preserve">0.303</w:t>
+            </w:r>
+          </w:p>
+        </w:tc>
+      </w:tr>
+      <w:tr>
+        <w:tc>
+          <w:tcPr>
+            <w:tcW w:type="dxa" w:w="3456"/>
+          </w:tcPr>
+          <w:p>
+            <w:pPr>
+              <w:pStyle w:val="Compact"/>
+              <w:spacing w:line="240" w:lineRule="auto"/>
+              <w:jc w:val="left"/>
+            </w:pPr>
+            <w:r>
+              <w:rPr>
+                <w:rFonts w:ascii="Times New Roman" w:hAnsi="Times New Roman"/>
+                <w:sz w:val="20"/>
+              </w:rPr>
+              <w:t xml:space="preserve">0.55 (Pythia, large upgrade)</w:t>
+            </w:r>
+          </w:p>
+        </w:tc>
+        <w:tc>
+          <w:tcPr>
+            <w:tcW w:type="dxa" w:w="1968"/>
+          </w:tcPr>
+          <w:p>
+            <w:pPr>
+              <w:pStyle w:val="Compact"/>
+              <w:spacing w:line="240" w:lineRule="auto"/>
+              <w:jc w:val="center"/>
+            </w:pPr>
+            <w:r>
+              <w:rPr>
+                <w:rFonts w:ascii="Times New Roman" w:hAnsi="Times New Roman"/>
+                <w:sz w:val="20"/>
+              </w:rPr>
+              <w:t xml:space="preserve">0.35 (measured, ACT)</w:t>
+            </w:r>
+          </w:p>
+        </w:tc>
+        <w:tc>
+          <w:tcPr>
+            <w:tcW w:type="dxa" w:w="1968"/>
+          </w:tcPr>
+          <w:p>
+            <w:pPr>
+              <w:pStyle w:val="Compact"/>
+              <w:spacing w:line="240" w:lineRule="auto"/>
+              <w:jc w:val="center"/>
+            </w:pPr>
+            <w:r>
+              <w:rPr>
+                <w:rFonts w:ascii="Times New Roman" w:hAnsi="Times New Roman"/>
+                <w:sz w:val="20"/>
+              </w:rPr>
+              <w:t xml:space="preserve">0.750</w:t>
+            </w:r>
+          </w:p>
+        </w:tc>
+        <w:tc>
+          <w:tcPr>
+            <w:tcW w:type="dxa" w:w="1968"/>
+          </w:tcPr>
+          <w:p>
+            <w:pPr>
+              <w:pStyle w:val="Compact"/>
+              <w:spacing w:line="240" w:lineRule="auto"/>
+              <w:jc w:val="center"/>
+            </w:pPr>
+            <w:r>
+              <w:rPr>
+                <w:rFonts w:ascii="Times New Roman" w:hAnsi="Times New Roman"/>
+                <w:sz w:val="20"/>
+              </w:rPr>
+              <w:t xml:space="preserve">0.196</w:t>
             </w:r>
           </w:p>
         </w:tc>
@@ -9258,13 +9524,13 @@
         <w:t xml:space="preserve"> </w:t>
       </w:r>
       <w:r>
-        <w:t xml:space="preserve">batch 4, maximum length 256). Costs are compute time only. We evaluate four upgrades. Three are Pythia-160M checkpoints (Biderman et al., 2023)</w:t>
-      </w:r>
-      <w:r>
-        <w:t xml:space="preserve"> </w:t>
-      </w:r>
-      <w:r>
-        <w:t xml:space="preserve">upgraded to the same final checkpoint, step 143k, from step 133k, 113k, and 73k, which gives upgrades of increasing size within one model family. The fourth is SmolLM2-360M, base to instruction-tuned.</w:t>
+        <w:t xml:space="preserve">batch 4, maximum length 256). Costs are compute time only. We evaluate six upgrades. Five are Pythia-160M checkpoints (Biderman et al., 2023)</w:t>
+      </w:r>
+      <w:r>
+        <w:t xml:space="preserve"> </w:t>
+      </w:r>
+      <w:r>
+        <w:t xml:space="preserve">upgraded to the same final checkpoint, step 143k, from steps 133k, 113k, 103k, 83k, and 73k, which gives upgrades of increasing size within one model family. The sixth is SmolLM2-360M, base to instruction-tuned.</w:t>
       </w:r>
       <w:r>
         <w:t xml:space="preserve"> </w:t>
@@ -9693,6 +9959,238 @@
                 <w:rFonts w:ascii="Times New Roman" w:hAnsi="Times New Roman"/>
                 <w:sz w:val="20"/>
               </w:rPr>
+              <w:t xml:space="preserve">Pythia, step 103k to 143k</w:t>
+            </w:r>
+          </w:p>
+        </w:tc>
+        <w:tc>
+          <w:tcPr>
+            <w:tcW w:type="dxa" w:w="1181"/>
+          </w:tcPr>
+          <w:p>
+            <w:pPr>
+              <w:pStyle w:val="Compact"/>
+              <w:spacing w:line="240" w:lineRule="auto"/>
+              <w:jc w:val="center"/>
+            </w:pPr>
+            <w:r>
+              <w:rPr>
+                <w:rFonts w:ascii="Times New Roman" w:hAnsi="Times New Roman"/>
+                <w:sz w:val="20"/>
+              </w:rPr>
+              <w:t xml:space="preserve">0.36</w:t>
+            </w:r>
+          </w:p>
+        </w:tc>
+        <w:tc>
+          <w:tcPr>
+            <w:tcW w:type="dxa" w:w="1181"/>
+          </w:tcPr>
+          <w:p>
+            <w:pPr>
+              <w:pStyle w:val="Compact"/>
+              <w:spacing w:line="240" w:lineRule="auto"/>
+              <w:jc w:val="center"/>
+            </w:pPr>
+            <w:r>
+              <w:rPr>
+                <w:rFonts w:ascii="Times New Roman" w:hAnsi="Times New Roman"/>
+                <w:sz w:val="20"/>
+              </w:rPr>
+              <w:t xml:space="preserve">2.761</w:t>
+            </w:r>
+          </w:p>
+        </w:tc>
+        <w:tc>
+          <w:tcPr>
+            <w:tcW w:type="dxa" w:w="1181"/>
+          </w:tcPr>
+          <w:p>
+            <w:pPr>
+              <w:pStyle w:val="Compact"/>
+              <w:spacing w:line="240" w:lineRule="auto"/>
+              <w:jc w:val="center"/>
+            </w:pPr>
+            <w:r>
+              <w:rPr>
+                <w:rFonts w:ascii="Times New Roman" w:hAnsi="Times New Roman"/>
+                <w:sz w:val="20"/>
+              </w:rPr>
+              <w:t xml:space="preserve">1.357</w:t>
+            </w:r>
+          </w:p>
+        </w:tc>
+        <w:tc>
+          <w:tcPr>
+            <w:tcW w:type="dxa" w:w="1181"/>
+          </w:tcPr>
+          <w:p>
+            <w:pPr>
+              <w:pStyle w:val="Compact"/>
+              <w:spacing w:line="240" w:lineRule="auto"/>
+              <w:jc w:val="center"/>
+            </w:pPr>
+            <w:r>
+              <w:rPr>
+                <w:rFonts w:ascii="Times New Roman" w:hAnsi="Times New Roman"/>
+                <w:sz w:val="20"/>
+              </w:rPr>
+              <w:t xml:space="preserve">1.505</w:t>
+            </w:r>
+          </w:p>
+        </w:tc>
+        <w:tc>
+          <w:tcPr>
+            <w:tcW w:type="dxa" w:w="1181"/>
+          </w:tcPr>
+          <w:p>
+            <w:pPr>
+              <w:pStyle w:val="Compact"/>
+              <w:spacing w:line="240" w:lineRule="auto"/>
+              <w:jc w:val="center"/>
+            </w:pPr>
+            <w:r>
+              <w:rPr>
+                <w:rFonts w:ascii="Times New Roman" w:hAnsi="Times New Roman"/>
+                <w:sz w:val="20"/>
+              </w:rPr>
+              <w:t xml:space="preserve">1.450</w:t>
+            </w:r>
+          </w:p>
+        </w:tc>
+      </w:tr>
+      <w:tr>
+        <w:tc>
+          <w:tcPr>
+            <w:tcW w:type="dxa" w:w="3456"/>
+          </w:tcPr>
+          <w:p>
+            <w:pPr>
+              <w:pStyle w:val="Compact"/>
+              <w:spacing w:line="240" w:lineRule="auto"/>
+              <w:jc w:val="left"/>
+            </w:pPr>
+            <w:r>
+              <w:rPr>
+                <w:rFonts w:ascii="Times New Roman" w:hAnsi="Times New Roman"/>
+                <w:sz w:val="20"/>
+              </w:rPr>
+              <w:t xml:space="preserve">Pythia, step 83k to 143k</w:t>
+            </w:r>
+          </w:p>
+        </w:tc>
+        <w:tc>
+          <w:tcPr>
+            <w:tcW w:type="dxa" w:w="1181"/>
+          </w:tcPr>
+          <w:p>
+            <w:pPr>
+              <w:pStyle w:val="Compact"/>
+              <w:spacing w:line="240" w:lineRule="auto"/>
+              <w:jc w:val="center"/>
+            </w:pPr>
+            <w:r>
+              <w:rPr>
+                <w:rFonts w:ascii="Times New Roman" w:hAnsi="Times New Roman"/>
+                <w:sz w:val="20"/>
+              </w:rPr>
+              <w:t xml:space="preserve">0.56</w:t>
+            </w:r>
+          </w:p>
+        </w:tc>
+        <w:tc>
+          <w:tcPr>
+            <w:tcW w:type="dxa" w:w="1181"/>
+          </w:tcPr>
+          <w:p>
+            <w:pPr>
+              <w:pStyle w:val="Compact"/>
+              <w:spacing w:line="240" w:lineRule="auto"/>
+              <w:jc w:val="center"/>
+            </w:pPr>
+            <w:r>
+              <w:rPr>
+                <w:rFonts w:ascii="Times New Roman" w:hAnsi="Times New Roman"/>
+                <w:sz w:val="20"/>
+              </w:rPr>
+              <w:t xml:space="preserve">2.761</w:t>
+            </w:r>
+          </w:p>
+        </w:tc>
+        <w:tc>
+          <w:tcPr>
+            <w:tcW w:type="dxa" w:w="1181"/>
+          </w:tcPr>
+          <w:p>
+            <w:pPr>
+              <w:pStyle w:val="Compact"/>
+              <w:spacing w:line="240" w:lineRule="auto"/>
+              <w:jc w:val="center"/>
+            </w:pPr>
+            <w:r>
+              <w:rPr>
+                <w:rFonts w:ascii="Times New Roman" w:hAnsi="Times New Roman"/>
+                <w:sz w:val="20"/>
+              </w:rPr>
+              <w:t xml:space="preserve">1.339</w:t>
+            </w:r>
+          </w:p>
+        </w:tc>
+        <w:tc>
+          <w:tcPr>
+            <w:tcW w:type="dxa" w:w="1181"/>
+          </w:tcPr>
+          <w:p>
+            <w:pPr>
+              <w:pStyle w:val="Compact"/>
+              <w:spacing w:line="240" w:lineRule="auto"/>
+              <w:jc w:val="center"/>
+            </w:pPr>
+            <w:r>
+              <w:rPr>
+                <w:rFonts w:ascii="Times New Roman" w:hAnsi="Times New Roman"/>
+                <w:sz w:val="20"/>
+              </w:rPr>
+              <w:t xml:space="preserve">1.974</w:t>
+            </w:r>
+          </w:p>
+        </w:tc>
+        <w:tc>
+          <w:tcPr>
+            <w:tcW w:type="dxa" w:w="1181"/>
+          </w:tcPr>
+          <w:p>
+            <w:pPr>
+              <w:pStyle w:val="Compact"/>
+              <w:spacing w:line="240" w:lineRule="auto"/>
+              <w:jc w:val="center"/>
+            </w:pPr>
+            <w:r>
+              <w:rPr>
+                <w:rFonts w:ascii="Times New Roman" w:hAnsi="Times New Roman"/>
+                <w:sz w:val="20"/>
+              </w:rPr>
+              <w:t xml:space="preserve">1.718</w:t>
+            </w:r>
+          </w:p>
+        </w:tc>
+      </w:tr>
+      <w:tr>
+        <w:tc>
+          <w:tcPr>
+            <w:tcW w:type="dxa" w:w="3456"/>
+          </w:tcPr>
+          <w:p>
+            <w:pPr>
+              <w:pStyle w:val="Compact"/>
+              <w:spacing w:line="240" w:lineRule="auto"/>
+              <w:jc w:val="left"/>
+            </w:pPr>
+            <w:r>
+              <w:rPr>
+                <w:rFonts w:ascii="Times New Roman" w:hAnsi="Times New Roman"/>
+                <w:sz w:val="20"/>
+              </w:rPr>
               <w:t xml:space="preserve">Pythia, step 73k to 143k (seed 0)</w:t>
             </w:r>
           </w:p>
@@ -10123,6 +10621,20 @@
         <w:t xml:space="preserve"> </w:t>
       </w:r>
       <w:r>
+        <w:t xml:space="preserve">and</w:t>
+      </w:r>
+      <w:r>
+        <w:t xml:space="preserve"> </w:t>
+      </w:r>
+      <m:oMath>
+        <m:r>
+          <m:t>Γ</m:t>
+        </m:r>
+      </m:oMath>
+      <w:r>
+        <w:t xml:space="preserve"> </w:t>
+      </w:r>
+      <w:r>
         <w:t xml:space="preserve">in multiples of</w:t>
       </w:r>
       <w:r>
@@ -10190,7 +10702,7 @@
         <w:tblW w:type="dxa" w:w="9360"/>
         <w:tblLook w:firstRow="1" w:lastRow="0" w:firstColumn="0" w:lastColumn="0" w:noHBand="0" w:noVBand="0" w:val="0020"/>
         <w:jc w:val="start"/>
-        <w:tblCaption w:val="Recovery, ACT cost ratio, and the policy implied by the model (\rho=0.10, \mu=2, g=0.20, \sigma=0.40; v in multiples of C_N, using each pair’s measured C_A/C_N)."/>
+        <w:tblCaption w:val="Recovery, ACT cost ratio, and the policy implied by the model (\rho=0.10, \mu=2, g=0.20, \sigma=0.40; v and \Gamma in multiples of C_N, using each pair’s measured C_A/C_N)."/>
         <w:tblLayout w:type="fixed"/>
         <w:tblBorders>
           <w:top w:val="single" w:sz="12" w:color="000000"/>
@@ -10198,12 +10710,14 @@
         </w:tblBorders>
       </w:tblPr>
       <w:tblGrid>
-        <w:gridCol w:w="3456"/>
-        <w:gridCol w:w="1180"/>
-        <w:gridCol w:w="1180"/>
-        <w:gridCol w:w="1180"/>
-        <w:gridCol w:w="1180"/>
-        <w:gridCol w:w="1180"/>
+        <w:gridCol w:w="3110"/>
+        <w:gridCol w:w="892"/>
+        <w:gridCol w:w="892"/>
+        <w:gridCol w:w="892"/>
+        <w:gridCol w:w="892"/>
+        <w:gridCol w:w="892"/>
+        <w:gridCol w:w="892"/>
+        <w:gridCol w:w="892"/>
       </w:tblGrid>
       <w:tr>
         <w:trPr>
@@ -10211,7 +10725,7 @@
         </w:trPr>
         <w:tc>
           <w:tcPr>
-            <w:tcW w:type="dxa" w:w="3456"/>
+            <w:tcW w:type="dxa" w:w="3110"/>
             <w:tcBorders>
               <w:bottom w:val="single" w:sz="6" w:color="000000"/>
             </w:tcBorders>
@@ -10225,7 +10739,7 @@
             <w:r>
               <w:rPr>
                 <w:rFonts w:ascii="Times New Roman" w:hAnsi="Times New Roman"/>
-                <w:sz w:val="20"/>
+                <w:sz w:val="18"/>
               </w:rPr>
               <w:t xml:space="preserve">Upgrade</w:t>
             </w:r>
@@ -10233,7 +10747,7 @@
         </w:tc>
         <w:tc>
           <w:tcPr>
-            <w:tcW w:type="dxa" w:w="1181"/>
+            <w:tcW w:type="dxa" w:w="893"/>
             <w:tcBorders>
               <w:bottom w:val="single" w:sz="6" w:color="000000"/>
             </w:tcBorders>
@@ -10247,14 +10761,14 @@
             <w:r>
               <w:rPr>
                 <w:rFonts w:ascii="Times New Roman" w:hAnsi="Times New Roman"/>
-                <w:sz w:val="20"/>
+                <w:sz w:val="18"/>
               </w:rPr>
               <w:t xml:space="preserve">R</w:t>
             </w:r>
             <w:r>
               <w:rPr>
                 <w:rFonts w:ascii="Times New Roman" w:hAnsi="Times New Roman"/>
-                <w:sz w:val="20"/>
+                <w:sz w:val="18"/>
                 <w:vertAlign w:val="subscript"/>
               </w:rPr>
               <w:t xml:space="preserve">C</w:t>
@@ -10263,7 +10777,7 @@
         </w:tc>
         <w:tc>
           <w:tcPr>
-            <w:tcW w:type="dxa" w:w="1181"/>
+            <w:tcW w:type="dxa" w:w="893"/>
             <w:tcBorders>
               <w:bottom w:val="single" w:sz="6" w:color="000000"/>
             </w:tcBorders>
@@ -10277,14 +10791,14 @@
             <w:r>
               <w:rPr>
                 <w:rFonts w:ascii="Times New Roman" w:hAnsi="Times New Roman"/>
-                <w:sz w:val="20"/>
+                <w:sz w:val="18"/>
               </w:rPr>
               <w:t xml:space="preserve">R</w:t>
             </w:r>
             <w:r>
               <w:rPr>
                 <w:rFonts w:ascii="Times New Roman" w:hAnsi="Times New Roman"/>
-                <w:sz w:val="20"/>
+                <w:sz w:val="18"/>
                 <w:vertAlign w:val="subscript"/>
               </w:rPr>
               <w:t xml:space="preserve">A</w:t>
@@ -10293,7 +10807,7 @@
         </w:tc>
         <w:tc>
           <w:tcPr>
-            <w:tcW w:type="dxa" w:w="1181"/>
+            <w:tcW w:type="dxa" w:w="893"/>
             <w:tcBorders>
               <w:bottom w:val="single" w:sz="6" w:color="000000"/>
             </w:tcBorders>
@@ -10307,14 +10821,14 @@
             <w:r>
               <w:rPr>
                 <w:rFonts w:ascii="Times New Roman" w:hAnsi="Times New Roman"/>
-                <w:sz w:val="20"/>
+                <w:sz w:val="18"/>
               </w:rPr>
               <w:t xml:space="preserve">C</w:t>
             </w:r>
             <w:r>
               <w:rPr>
                 <w:rFonts w:ascii="Times New Roman" w:hAnsi="Times New Roman"/>
-                <w:sz w:val="20"/>
+                <w:sz w:val="18"/>
                 <w:vertAlign w:val="subscript"/>
               </w:rPr>
               <w:t xml:space="preserve">A</w:t>
@@ -10322,14 +10836,14 @@
             <w:r>
               <w:rPr>
                 <w:rFonts w:ascii="Times New Roman" w:hAnsi="Times New Roman"/>
-                <w:sz w:val="20"/>
+                <w:sz w:val="18"/>
               </w:rPr>
               <w:t xml:space="preserve">/C</w:t>
             </w:r>
             <w:r>
               <w:rPr>
                 <w:rFonts w:ascii="Times New Roman" w:hAnsi="Times New Roman"/>
-                <w:sz w:val="20"/>
+                <w:sz w:val="18"/>
                 <w:vertAlign w:val="subscript"/>
               </w:rPr>
               <w:t xml:space="preserve">N</w:t>
@@ -10338,7 +10852,7 @@
         </w:tc>
         <w:tc>
           <w:tcPr>
-            <w:tcW w:type="dxa" w:w="1181"/>
+            <w:tcW w:type="dxa" w:w="893"/>
             <w:tcBorders>
               <w:bottom w:val="single" w:sz="6" w:color="000000"/>
             </w:tcBorders>
@@ -10352,38 +10866,15 @@
             <w:r>
               <w:rPr>
                 <w:rFonts w:ascii="Times New Roman" w:hAnsi="Times New Roman"/>
-                <w:sz w:val="20"/>
-              </w:rPr>
-              <w:t xml:space="preserve">v*</w:t>
-            </w:r>
-            <w:r>
-              <w:rPr>
-                <w:rFonts w:ascii="Times New Roman" w:hAnsi="Times New Roman"/>
-                <w:sz w:val="20"/>
-                <w:vertAlign w:val="subscript"/>
-              </w:rPr>
-              <w:t xml:space="preserve">C</w:t>
-            </w:r>
-            <w:r>
-              <w:rPr>
-                <w:rFonts w:ascii="Times New Roman" w:hAnsi="Times New Roman"/>
-                <w:sz w:val="20"/>
-              </w:rPr>
-              <w:t xml:space="preserve">/C</w:t>
-            </w:r>
-            <w:r>
-              <w:rPr>
-                <w:rFonts w:ascii="Times New Roman" w:hAnsi="Times New Roman"/>
-                <w:sz w:val="20"/>
-                <w:vertAlign w:val="subscript"/>
-              </w:rPr>
-              <w:t xml:space="preserve">N</w:t>
-            </w:r>
-          </w:p>
-        </w:tc>
-        <w:tc>
-          <w:tcPr>
-            <w:tcW w:type="dxa" w:w="1181"/>
+                <w:sz w:val="18"/>
+              </w:rPr>
+              <w:t xml:space="preserve">Γ</w:t>
+            </w:r>
+          </w:p>
+        </w:tc>
+        <w:tc>
+          <w:tcPr>
+            <w:tcW w:type="dxa" w:w="893"/>
             <w:tcBorders>
               <w:bottom w:val="single" w:sz="6" w:color="000000"/>
             </w:tcBorders>
@@ -10397,17 +10888,76 @@
             <w:r>
               <w:rPr>
                 <w:rFonts w:ascii="Times New Roman" w:hAnsi="Times New Roman"/>
-                <w:sz w:val="20"/>
+                <w:sz w:val="18"/>
+              </w:rPr>
+              <w:t xml:space="preserve">v*</w:t>
+            </w:r>
+            <w:r>
+              <w:rPr>
+                <w:rFonts w:ascii="Times New Roman" w:hAnsi="Times New Roman"/>
+                <w:sz w:val="18"/>
+                <w:vertAlign w:val="subscript"/>
+              </w:rPr>
+              <w:t xml:space="preserve">C</w:t>
+            </w:r>
+            <w:r>
+              <w:rPr>
+                <w:rFonts w:ascii="Times New Roman" w:hAnsi="Times New Roman"/>
+                <w:sz w:val="18"/>
+              </w:rPr>
+              <w:t xml:space="preserve">/C</w:t>
+            </w:r>
+            <w:r>
+              <w:rPr>
+                <w:rFonts w:ascii="Times New Roman" w:hAnsi="Times New Roman"/>
+                <w:sz w:val="18"/>
+                <w:vertAlign w:val="subscript"/>
+              </w:rPr>
+              <w:t xml:space="preserve">N</w:t>
+            </w:r>
+          </w:p>
+        </w:tc>
+        <w:tc>
+          <w:tcPr>
+            <w:tcW w:type="dxa" w:w="893"/>
+            <w:tcBorders>
+              <w:bottom w:val="single" w:sz="6" w:color="000000"/>
+            </w:tcBorders>
+          </w:tcPr>
+          <w:p>
+            <w:pPr>
+              <w:pStyle w:val="Compact"/>
+              <w:spacing w:line="240" w:lineRule="auto"/>
+              <w:jc w:val="center"/>
+            </w:pPr>
+            <w:r>
+              <w:rPr>
+                <w:rFonts w:ascii="Times New Roman" w:hAnsi="Times New Roman"/>
+                <w:sz w:val="18"/>
               </w:rPr>
               <w:t xml:space="preserve">ACT optimal for</w:t>
             </w:r>
+          </w:p>
+        </w:tc>
+        <w:tc>
+          <w:tcPr>
+            <w:tcW w:type="dxa" w:w="893"/>
+            <w:tcBorders>
+              <w:bottom w:val="single" w:sz="6" w:color="000000"/>
+            </w:tcBorders>
+          </w:tcPr>
+          <w:p>
+            <w:pPr>
+              <w:pStyle w:val="Compact"/>
+              <w:spacing w:line="240" w:lineRule="auto"/>
+            </w:pPr>
           </w:p>
         </w:tc>
       </w:tr>
       <w:tr>
         <w:tc>
           <w:tcPr>
-            <w:tcW w:type="dxa" w:w="3456"/>
+            <w:tcW w:type="dxa" w:w="3110"/>
           </w:tcPr>
           <w:p>
             <w:pPr>
@@ -10418,7 +10968,7 @@
             <w:r>
               <w:rPr>
                 <w:rFonts w:ascii="Times New Roman" w:hAnsi="Times New Roman"/>
-                <w:sz w:val="20"/>
+                <w:sz w:val="18"/>
               </w:rPr>
               <w:t xml:space="preserve">Pythia, step 133k to 143k</w:t>
             </w:r>
@@ -10426,18 +10976,18 @@
         </w:tc>
         <w:tc>
           <w:tcPr>
-            <w:tcW w:type="dxa" w:w="1181"/>
-          </w:tcPr>
-          <w:p>
-            <w:pPr>
-              <w:pStyle w:val="Compact"/>
-              <w:spacing w:line="240" w:lineRule="auto"/>
-              <w:jc w:val="center"/>
-            </w:pPr>
-            <w:r>
-              <w:rPr>
-                <w:rFonts w:ascii="Times New Roman" w:hAnsi="Times New Roman"/>
-                <w:sz w:val="20"/>
+            <w:tcW w:type="dxa" w:w="893"/>
+          </w:tcPr>
+          <w:p>
+            <w:pPr>
+              <w:pStyle w:val="Compact"/>
+              <w:spacing w:line="240" w:lineRule="auto"/>
+              <w:jc w:val="center"/>
+            </w:pPr>
+            <w:r>
+              <w:rPr>
+                <w:rFonts w:ascii="Times New Roman" w:hAnsi="Times New Roman"/>
+                <w:sz w:val="18"/>
               </w:rPr>
               <w:t xml:space="preserve">0.956</w:t>
             </w:r>
@@ -10445,18 +10995,18 @@
         </w:tc>
         <w:tc>
           <w:tcPr>
-            <w:tcW w:type="dxa" w:w="1181"/>
-          </w:tcPr>
-          <w:p>
-            <w:pPr>
-              <w:pStyle w:val="Compact"/>
-              <w:spacing w:line="240" w:lineRule="auto"/>
-              <w:jc w:val="center"/>
-            </w:pPr>
-            <w:r>
-              <w:rPr>
-                <w:rFonts w:ascii="Times New Roman" w:hAnsi="Times New Roman"/>
-                <w:sz w:val="20"/>
+            <w:tcW w:type="dxa" w:w="893"/>
+          </w:tcPr>
+          <w:p>
+            <w:pPr>
+              <w:pStyle w:val="Compact"/>
+              <w:spacing w:line="240" w:lineRule="auto"/>
+              <w:jc w:val="center"/>
+            </w:pPr>
+            <w:r>
+              <w:rPr>
+                <w:rFonts w:ascii="Times New Roman" w:hAnsi="Times New Roman"/>
+                <w:sz w:val="18"/>
               </w:rPr>
               <w:t xml:space="preserve">0.952</w:t>
             </w:r>
@@ -10464,18 +11014,18 @@
         </w:tc>
         <w:tc>
           <w:tcPr>
-            <w:tcW w:type="dxa" w:w="1181"/>
-          </w:tcPr>
-          <w:p>
-            <w:pPr>
-              <w:pStyle w:val="Compact"/>
-              <w:spacing w:line="240" w:lineRule="auto"/>
-              <w:jc w:val="center"/>
-            </w:pPr>
-            <w:r>
-              <w:rPr>
-                <w:rFonts w:ascii="Times New Roman" w:hAnsi="Times New Roman"/>
-                <w:sz w:val="20"/>
+            <w:tcW w:type="dxa" w:w="893"/>
+          </w:tcPr>
+          <w:p>
+            <w:pPr>
+              <w:pStyle w:val="Compact"/>
+              <w:spacing w:line="240" w:lineRule="auto"/>
+              <w:jc w:val="center"/>
+            </w:pPr>
+            <w:r>
+              <w:rPr>
+                <w:rFonts w:ascii="Times New Roman" w:hAnsi="Times New Roman"/>
+                <w:sz w:val="18"/>
               </w:rPr>
               <w:t xml:space="preserve">0.35</w:t>
             </w:r>
@@ -10483,18 +11033,37 @@
         </w:tc>
         <w:tc>
           <w:tcPr>
-            <w:tcW w:type="dxa" w:w="1181"/>
-          </w:tcPr>
-          <w:p>
-            <w:pPr>
-              <w:pStyle w:val="Compact"/>
-              <w:spacing w:line="240" w:lineRule="auto"/>
-              <w:jc w:val="center"/>
-            </w:pPr>
-            <w:r>
-              <w:rPr>
-                <w:rFonts w:ascii="Times New Roman" w:hAnsi="Times New Roman"/>
-                <w:sz w:val="20"/>
+            <w:tcW w:type="dxa" w:w="893"/>
+          </w:tcPr>
+          <w:p>
+            <w:pPr>
+              <w:pStyle w:val="Compact"/>
+              <w:spacing w:line="240" w:lineRule="auto"/>
+              <w:jc w:val="center"/>
+            </w:pPr>
+            <w:r>
+              <w:rPr>
+                <w:rFonts w:ascii="Times New Roman" w:hAnsi="Times New Roman"/>
+                <w:sz w:val="18"/>
+              </w:rPr>
+              <w:t xml:space="preserve">0.00</w:t>
+            </w:r>
+          </w:p>
+        </w:tc>
+        <w:tc>
+          <w:tcPr>
+            <w:tcW w:type="dxa" w:w="893"/>
+          </w:tcPr>
+          <w:p>
+            <w:pPr>
+              <w:pStyle w:val="Compact"/>
+              <w:spacing w:line="240" w:lineRule="auto"/>
+              <w:jc w:val="center"/>
+            </w:pPr>
+            <w:r>
+              <w:rPr>
+                <w:rFonts w:ascii="Times New Roman" w:hAnsi="Times New Roman"/>
+                <w:sz w:val="18"/>
               </w:rPr>
               <w:t xml:space="preserve">55.6</w:t>
             </w:r>
@@ -10502,28 +11071,39 @@
         </w:tc>
         <w:tc>
           <w:tcPr>
-            <w:tcW w:type="dxa" w:w="1181"/>
-          </w:tcPr>
-          <w:p>
-            <w:pPr>
-              <w:pStyle w:val="Compact"/>
-              <w:spacing w:line="240" w:lineRule="auto"/>
-              <w:jc w:val="center"/>
-            </w:pPr>
-            <w:r>
-              <w:rPr>
-                <w:rFonts w:ascii="Times New Roman" w:hAnsi="Times New Roman"/>
-                <w:sz w:val="20"/>
+            <w:tcW w:type="dxa" w:w="893"/>
+          </w:tcPr>
+          <w:p>
+            <w:pPr>
+              <w:pStyle w:val="Compact"/>
+              <w:spacing w:line="240" w:lineRule="auto"/>
+              <w:jc w:val="center"/>
+            </w:pPr>
+            <w:r>
+              <w:rPr>
+                <w:rFonts w:ascii="Times New Roman" w:hAnsi="Times New Roman"/>
+                <w:sz w:val="18"/>
               </w:rPr>
               <w:t xml:space="preserve">never</w:t>
             </w:r>
+          </w:p>
+        </w:tc>
+        <w:tc>
+          <w:tcPr>
+            <w:tcW w:type="dxa" w:w="893"/>
+          </w:tcPr>
+          <w:p>
+            <w:pPr>
+              <w:pStyle w:val="Compact"/>
+              <w:spacing w:line="240" w:lineRule="auto"/>
+            </w:pPr>
           </w:p>
         </w:tc>
       </w:tr>
       <w:tr>
         <w:tc>
           <w:tcPr>
-            <w:tcW w:type="dxa" w:w="3456"/>
+            <w:tcW w:type="dxa" w:w="3110"/>
           </w:tcPr>
           <w:p>
             <w:pPr>
@@ -10534,7 +11114,7 @@
             <w:r>
               <w:rPr>
                 <w:rFonts w:ascii="Times New Roman" w:hAnsi="Times New Roman"/>
-                <w:sz w:val="20"/>
+                <w:sz w:val="18"/>
               </w:rPr>
               <w:t xml:space="preserve">Pythia, step 113k to 143k</w:t>
             </w:r>
@@ -10542,18 +11122,18 @@
         </w:tc>
         <w:tc>
           <w:tcPr>
-            <w:tcW w:type="dxa" w:w="1181"/>
-          </w:tcPr>
-          <w:p>
-            <w:pPr>
-              <w:pStyle w:val="Compact"/>
-              <w:spacing w:line="240" w:lineRule="auto"/>
-              <w:jc w:val="center"/>
-            </w:pPr>
-            <w:r>
-              <w:rPr>
-                <w:rFonts w:ascii="Times New Roman" w:hAnsi="Times New Roman"/>
-                <w:sz w:val="20"/>
+            <w:tcW w:type="dxa" w:w="893"/>
+          </w:tcPr>
+          <w:p>
+            <w:pPr>
+              <w:pStyle w:val="Compact"/>
+              <w:spacing w:line="240" w:lineRule="auto"/>
+              <w:jc w:val="center"/>
+            </w:pPr>
+            <w:r>
+              <w:rPr>
+                <w:rFonts w:ascii="Times New Roman" w:hAnsi="Times New Roman"/>
+                <w:sz w:val="18"/>
               </w:rPr>
               <w:t xml:space="preserve">0.928</w:t>
             </w:r>
@@ -10561,18 +11141,18 @@
         </w:tc>
         <w:tc>
           <w:tcPr>
-            <w:tcW w:type="dxa" w:w="1181"/>
-          </w:tcPr>
-          <w:p>
-            <w:pPr>
-              <w:pStyle w:val="Compact"/>
-              <w:spacing w:line="240" w:lineRule="auto"/>
-              <w:jc w:val="center"/>
-            </w:pPr>
-            <w:r>
-              <w:rPr>
-                <w:rFonts w:ascii="Times New Roman" w:hAnsi="Times New Roman"/>
-                <w:sz w:val="20"/>
+            <w:tcW w:type="dxa" w:w="893"/>
+          </w:tcPr>
+          <w:p>
+            <w:pPr>
+              <w:pStyle w:val="Compact"/>
+              <w:spacing w:line="240" w:lineRule="auto"/>
+              <w:jc w:val="center"/>
+            </w:pPr>
+            <w:r>
+              <w:rPr>
+                <w:rFonts w:ascii="Times New Roman" w:hAnsi="Times New Roman"/>
+                <w:sz w:val="18"/>
               </w:rPr>
               <w:t xml:space="preserve">0.939</w:t>
             </w:r>
@@ -10580,18 +11160,18 @@
         </w:tc>
         <w:tc>
           <w:tcPr>
-            <w:tcW w:type="dxa" w:w="1181"/>
-          </w:tcPr>
-          <w:p>
-            <w:pPr>
-              <w:pStyle w:val="Compact"/>
-              <w:spacing w:line="240" w:lineRule="auto"/>
-              <w:jc w:val="center"/>
-            </w:pPr>
-            <w:r>
-              <w:rPr>
-                <w:rFonts w:ascii="Times New Roman" w:hAnsi="Times New Roman"/>
-                <w:sz w:val="20"/>
+            <w:tcW w:type="dxa" w:w="893"/>
+          </w:tcPr>
+          <w:p>
+            <w:pPr>
+              <w:pStyle w:val="Compact"/>
+              <w:spacing w:line="240" w:lineRule="auto"/>
+              <w:jc w:val="center"/>
+            </w:pPr>
+            <w:r>
+              <w:rPr>
+                <w:rFonts w:ascii="Times New Roman" w:hAnsi="Times New Roman"/>
+                <w:sz w:val="18"/>
               </w:rPr>
               <w:t xml:space="preserve">0.35</w:t>
             </w:r>
@@ -10599,18 +11179,37 @@
         </w:tc>
         <w:tc>
           <w:tcPr>
-            <w:tcW w:type="dxa" w:w="1181"/>
-          </w:tcPr>
-          <w:p>
-            <w:pPr>
-              <w:pStyle w:val="Compact"/>
-              <w:spacing w:line="240" w:lineRule="auto"/>
-              <w:jc w:val="center"/>
-            </w:pPr>
-            <w:r>
-              <w:rPr>
-                <w:rFonts w:ascii="Times New Roman" w:hAnsi="Times New Roman"/>
-                <w:sz w:val="20"/>
+            <w:tcW w:type="dxa" w:w="893"/>
+          </w:tcPr>
+          <w:p>
+            <w:pPr>
+              <w:pStyle w:val="Compact"/>
+              <w:spacing w:line="240" w:lineRule="auto"/>
+              <w:jc w:val="center"/>
+            </w:pPr>
+            <w:r>
+              <w:rPr>
+                <w:rFonts w:ascii="Times New Roman" w:hAnsi="Times New Roman"/>
+                <w:sz w:val="18"/>
+              </w:rPr>
+              <w:t xml:space="preserve">0.11</w:t>
+            </w:r>
+          </w:p>
+        </w:tc>
+        <w:tc>
+          <w:tcPr>
+            <w:tcW w:type="dxa" w:w="893"/>
+          </w:tcPr>
+          <w:p>
+            <w:pPr>
+              <w:pStyle w:val="Compact"/>
+              <w:spacing w:line="240" w:lineRule="auto"/>
+              <w:jc w:val="center"/>
+            </w:pPr>
+            <w:r>
+              <w:rPr>
+                <w:rFonts w:ascii="Times New Roman" w:hAnsi="Times New Roman"/>
+                <w:sz w:val="18"/>
               </w:rPr>
               <w:t xml:space="preserve">34.0</w:t>
             </w:r>
@@ -10618,28 +11217,39 @@
         </w:tc>
         <w:tc>
           <w:tcPr>
-            <w:tcW w:type="dxa" w:w="1181"/>
-          </w:tcPr>
-          <w:p>
-            <w:pPr>
-              <w:pStyle w:val="Compact"/>
-              <w:spacing w:line="240" w:lineRule="auto"/>
-              <w:jc w:val="center"/>
-            </w:pPr>
-            <w:r>
-              <w:rPr>
-                <w:rFonts w:ascii="Times New Roman" w:hAnsi="Times New Roman"/>
-                <w:sz w:val="20"/>
+            <w:tcW w:type="dxa" w:w="893"/>
+          </w:tcPr>
+          <w:p>
+            <w:pPr>
+              <w:pStyle w:val="Compact"/>
+              <w:spacing w:line="240" w:lineRule="auto"/>
+              <w:jc w:val="center"/>
+            </w:pPr>
+            <w:r>
+              <w:rPr>
+                <w:rFonts w:ascii="Times New Roman" w:hAnsi="Times New Roman"/>
+                <w:sz w:val="18"/>
               </w:rPr>
               <w:t xml:space="preserve">never</w:t>
             </w:r>
+          </w:p>
+        </w:tc>
+        <w:tc>
+          <w:tcPr>
+            <w:tcW w:type="dxa" w:w="893"/>
+          </w:tcPr>
+          <w:p>
+            <w:pPr>
+              <w:pStyle w:val="Compact"/>
+              <w:spacing w:line="240" w:lineRule="auto"/>
+            </w:pPr>
           </w:p>
         </w:tc>
       </w:tr>
       <w:tr>
         <w:tc>
           <w:tcPr>
-            <w:tcW w:type="dxa" w:w="3456"/>
+            <w:tcW w:type="dxa" w:w="3110"/>
           </w:tcPr>
           <w:p>
             <w:pPr>
@@ -10650,64 +11260,64 @@
             <w:r>
               <w:rPr>
                 <w:rFonts w:ascii="Times New Roman" w:hAnsi="Times New Roman"/>
-                <w:sz w:val="20"/>
-              </w:rPr>
-              <w:t xml:space="preserve">Pythia, step 73k to 143k (seed 0)</w:t>
-            </w:r>
-          </w:p>
-        </w:tc>
-        <w:tc>
-          <w:tcPr>
-            <w:tcW w:type="dxa" w:w="1181"/>
-          </w:tcPr>
-          <w:p>
-            <w:pPr>
-              <w:pStyle w:val="Compact"/>
-              <w:spacing w:line="240" w:lineRule="auto"/>
-              <w:jc w:val="center"/>
-            </w:pPr>
-            <w:r>
-              <w:rPr>
-                <w:rFonts w:ascii="Times New Roman" w:hAnsi="Times New Roman"/>
-                <w:sz w:val="20"/>
-              </w:rPr>
-              <w:t xml:space="preserve">0.319</w:t>
-            </w:r>
-          </w:p>
-        </w:tc>
-        <w:tc>
-          <w:tcPr>
-            <w:tcW w:type="dxa" w:w="1181"/>
-          </w:tcPr>
-          <w:p>
-            <w:pPr>
-              <w:pStyle w:val="Compact"/>
-              <w:spacing w:line="240" w:lineRule="auto"/>
-              <w:jc w:val="center"/>
-            </w:pPr>
-            <w:r>
-              <w:rPr>
-                <w:rFonts w:ascii="Times New Roman" w:hAnsi="Times New Roman"/>
-                <w:sz w:val="20"/>
-              </w:rPr>
-              <w:t xml:space="preserve">0.717</w:t>
-            </w:r>
-          </w:p>
-        </w:tc>
-        <w:tc>
-          <w:tcPr>
-            <w:tcW w:type="dxa" w:w="1181"/>
-          </w:tcPr>
-          <w:p>
-            <w:pPr>
-              <w:pStyle w:val="Compact"/>
-              <w:spacing w:line="240" w:lineRule="auto"/>
-              <w:jc w:val="center"/>
-            </w:pPr>
-            <w:r>
-              <w:rPr>
-                <w:rFonts w:ascii="Times New Roman" w:hAnsi="Times New Roman"/>
-                <w:sz w:val="20"/>
+                <w:sz w:val="18"/>
+              </w:rPr>
+              <w:t xml:space="preserve">Pythia, step 103k to 143k</w:t>
+            </w:r>
+          </w:p>
+        </w:tc>
+        <w:tc>
+          <w:tcPr>
+            <w:tcW w:type="dxa" w:w="893"/>
+          </w:tcPr>
+          <w:p>
+            <w:pPr>
+              <w:pStyle w:val="Compact"/>
+              <w:spacing w:line="240" w:lineRule="auto"/>
+              <w:jc w:val="center"/>
+            </w:pPr>
+            <w:r>
+              <w:rPr>
+                <w:rFonts w:ascii="Times New Roman" w:hAnsi="Times New Roman"/>
+                <w:sz w:val="18"/>
+              </w:rPr>
+              <w:t xml:space="preserve">0.895</w:t>
+            </w:r>
+          </w:p>
+        </w:tc>
+        <w:tc>
+          <w:tcPr>
+            <w:tcW w:type="dxa" w:w="893"/>
+          </w:tcPr>
+          <w:p>
+            <w:pPr>
+              <w:pStyle w:val="Compact"/>
+              <w:spacing w:line="240" w:lineRule="auto"/>
+              <w:jc w:val="center"/>
+            </w:pPr>
+            <w:r>
+              <w:rPr>
+                <w:rFonts w:ascii="Times New Roman" w:hAnsi="Times New Roman"/>
+                <w:sz w:val="18"/>
+              </w:rPr>
+              <w:t xml:space="preserve">0.934</w:t>
+            </w:r>
+          </w:p>
+        </w:tc>
+        <w:tc>
+          <w:tcPr>
+            <w:tcW w:type="dxa" w:w="893"/>
+          </w:tcPr>
+          <w:p>
+            <w:pPr>
+              <w:pStyle w:val="Compact"/>
+              <w:spacing w:line="240" w:lineRule="auto"/>
+              <w:jc w:val="center"/>
+            </w:pPr>
+            <w:r>
+              <w:rPr>
+                <w:rFonts w:ascii="Times New Roman" w:hAnsi="Times New Roman"/>
+                <w:sz w:val="18"/>
               </w:rPr>
               <w:t xml:space="preserve">0.36</w:t>
             </w:r>
@@ -10715,47 +11325,77 @@
         </w:tc>
         <w:tc>
           <w:tcPr>
-            <w:tcW w:type="dxa" w:w="1181"/>
-          </w:tcPr>
-          <w:p>
-            <w:pPr>
-              <w:pStyle w:val="Compact"/>
-              <w:spacing w:line="240" w:lineRule="auto"/>
-              <w:jc w:val="center"/>
-            </w:pPr>
-            <w:r>
-              <w:rPr>
-                <w:rFonts w:ascii="Times New Roman" w:hAnsi="Times New Roman"/>
-                <w:sz w:val="20"/>
-              </w:rPr>
-              <w:t xml:space="preserve">3.6</w:t>
-            </w:r>
-          </w:p>
-        </w:tc>
-        <w:tc>
-          <w:tcPr>
-            <w:tcW w:type="dxa" w:w="1181"/>
-          </w:tcPr>
-          <w:p>
-            <w:pPr>
-              <w:pStyle w:val="Compact"/>
-              <w:spacing w:line="240" w:lineRule="auto"/>
-              <w:jc w:val="center"/>
-            </w:pPr>
-            <w:r>
-              <w:rPr>
-                <w:rFonts w:ascii="Times New Roman" w:hAnsi="Times New Roman"/>
-                <w:sz w:val="20"/>
-              </w:rPr>
-              <w:t xml:space="preserve">[1.78, 4.40)</w:t>
-            </w:r>
+            <w:tcW w:type="dxa" w:w="893"/>
+          </w:tcPr>
+          <w:p>
+            <w:pPr>
+              <w:pStyle w:val="Compact"/>
+              <w:spacing w:line="240" w:lineRule="auto"/>
+              <w:jc w:val="center"/>
+            </w:pPr>
+            <w:r>
+              <w:rPr>
+                <w:rFonts w:ascii="Times New Roman" w:hAnsi="Times New Roman"/>
+                <w:sz w:val="18"/>
+              </w:rPr>
+              <w:t xml:space="preserve">0.29</w:t>
+            </w:r>
+          </w:p>
+        </w:tc>
+        <w:tc>
+          <w:tcPr>
+            <w:tcW w:type="dxa" w:w="893"/>
+          </w:tcPr>
+          <w:p>
+            <w:pPr>
+              <w:pStyle w:val="Compact"/>
+              <w:spacing w:line="240" w:lineRule="auto"/>
+              <w:jc w:val="center"/>
+            </w:pPr>
+            <w:r>
+              <w:rPr>
+                <w:rFonts w:ascii="Times New Roman" w:hAnsi="Times New Roman"/>
+                <w:sz w:val="18"/>
+              </w:rPr>
+              <w:t xml:space="preserve">23.3</w:t>
+            </w:r>
+          </w:p>
+        </w:tc>
+        <w:tc>
+          <w:tcPr>
+            <w:tcW w:type="dxa" w:w="893"/>
+          </w:tcPr>
+          <w:p>
+            <w:pPr>
+              <w:pStyle w:val="Compact"/>
+              <w:spacing w:line="240" w:lineRule="auto"/>
+              <w:jc w:val="center"/>
+            </w:pPr>
+            <w:r>
+              <w:rPr>
+                <w:rFonts w:ascii="Times New Roman" w:hAnsi="Times New Roman"/>
+                <w:sz w:val="18"/>
+              </w:rPr>
+              <w:t xml:space="preserve">never</w:t>
+            </w:r>
+          </w:p>
+        </w:tc>
+        <w:tc>
+          <w:tcPr>
+            <w:tcW w:type="dxa" w:w="893"/>
+          </w:tcPr>
+          <w:p>
+            <w:pPr>
+              <w:pStyle w:val="Compact"/>
+              <w:spacing w:line="240" w:lineRule="auto"/>
+            </w:pPr>
           </w:p>
         </w:tc>
       </w:tr>
       <w:tr>
         <w:tc>
           <w:tcPr>
-            <w:tcW w:type="dxa" w:w="3456"/>
+            <w:tcW w:type="dxa" w:w="3110"/>
           </w:tcPr>
           <w:p>
             <w:pPr>
@@ -10766,112 +11406,142 @@
             <w:r>
               <w:rPr>
                 <w:rFonts w:ascii="Times New Roman" w:hAnsi="Times New Roman"/>
-                <w:sz w:val="20"/>
-              </w:rPr>
-              <w:t xml:space="preserve">Pythia, step 73k to 143k (seed 1)</w:t>
-            </w:r>
-          </w:p>
-        </w:tc>
-        <w:tc>
-          <w:tcPr>
-            <w:tcW w:type="dxa" w:w="1181"/>
-          </w:tcPr>
-          <w:p>
-            <w:pPr>
-              <w:pStyle w:val="Compact"/>
-              <w:spacing w:line="240" w:lineRule="auto"/>
-              <w:jc w:val="center"/>
-            </w:pPr>
-            <w:r>
-              <w:rPr>
-                <w:rFonts w:ascii="Times New Roman" w:hAnsi="Times New Roman"/>
-                <w:sz w:val="20"/>
-              </w:rPr>
-              <w:t xml:space="preserve">0.359</w:t>
-            </w:r>
-          </w:p>
-        </w:tc>
-        <w:tc>
-          <w:tcPr>
-            <w:tcW w:type="dxa" w:w="1181"/>
-          </w:tcPr>
-          <w:p>
-            <w:pPr>
-              <w:pStyle w:val="Compact"/>
-              <w:spacing w:line="240" w:lineRule="auto"/>
-              <w:jc w:val="center"/>
-            </w:pPr>
-            <w:r>
-              <w:rPr>
-                <w:rFonts w:ascii="Times New Roman" w:hAnsi="Times New Roman"/>
-                <w:sz w:val="20"/>
-              </w:rPr>
-              <w:t xml:space="preserve">0.692</w:t>
-            </w:r>
-          </w:p>
-        </w:tc>
-        <w:tc>
-          <w:tcPr>
-            <w:tcW w:type="dxa" w:w="1181"/>
-          </w:tcPr>
-          <w:p>
-            <w:pPr>
-              <w:pStyle w:val="Compact"/>
-              <w:spacing w:line="240" w:lineRule="auto"/>
-              <w:jc w:val="center"/>
-            </w:pPr>
-            <w:r>
-              <w:rPr>
-                <w:rFonts w:ascii="Times New Roman" w:hAnsi="Times New Roman"/>
-                <w:sz w:val="20"/>
-              </w:rPr>
-              <w:t xml:space="preserve">0.30</w:t>
-            </w:r>
-          </w:p>
-        </w:tc>
-        <w:tc>
-          <w:tcPr>
-            <w:tcW w:type="dxa" w:w="1181"/>
-          </w:tcPr>
-          <w:p>
-            <w:pPr>
-              <w:pStyle w:val="Compact"/>
-              <w:spacing w:line="240" w:lineRule="auto"/>
-              <w:jc w:val="center"/>
-            </w:pPr>
-            <w:r>
-              <w:rPr>
-                <w:rFonts w:ascii="Times New Roman" w:hAnsi="Times New Roman"/>
-                <w:sz w:val="20"/>
-              </w:rPr>
-              <w:t xml:space="preserve">3.8</w:t>
-            </w:r>
-          </w:p>
-        </w:tc>
-        <w:tc>
-          <w:tcPr>
-            <w:tcW w:type="dxa" w:w="1181"/>
-          </w:tcPr>
-          <w:p>
-            <w:pPr>
-              <w:pStyle w:val="Compact"/>
-              <w:spacing w:line="240" w:lineRule="auto"/>
-              <w:jc w:val="center"/>
-            </w:pPr>
-            <w:r>
-              <w:rPr>
-                <w:rFonts w:ascii="Times New Roman" w:hAnsi="Times New Roman"/>
-                <w:sz w:val="20"/>
-              </w:rPr>
-              <w:t xml:space="preserve">[1.73, 4.49)</w:t>
-            </w:r>
+                <w:sz w:val="18"/>
+              </w:rPr>
+              <w:t xml:space="preserve">Pythia, step 83k to 143k</w:t>
+            </w:r>
+          </w:p>
+        </w:tc>
+        <w:tc>
+          <w:tcPr>
+            <w:tcW w:type="dxa" w:w="893"/>
+          </w:tcPr>
+          <w:p>
+            <w:pPr>
+              <w:pStyle w:val="Compact"/>
+              <w:spacing w:line="240" w:lineRule="auto"/>
+              <w:jc w:val="center"/>
+            </w:pPr>
+            <w:r>
+              <w:rPr>
+                <w:rFonts w:ascii="Times New Roman" w:hAnsi="Times New Roman"/>
+                <w:sz w:val="18"/>
+              </w:rPr>
+              <w:t xml:space="preserve">0.554</w:t>
+            </w:r>
+          </w:p>
+        </w:tc>
+        <w:tc>
+          <w:tcPr>
+            <w:tcW w:type="dxa" w:w="893"/>
+          </w:tcPr>
+          <w:p>
+            <w:pPr>
+              <w:pStyle w:val="Compact"/>
+              <w:spacing w:line="240" w:lineRule="auto"/>
+              <w:jc w:val="center"/>
+            </w:pPr>
+            <w:r>
+              <w:rPr>
+                <w:rFonts w:ascii="Times New Roman" w:hAnsi="Times New Roman"/>
+                <w:sz w:val="18"/>
+              </w:rPr>
+              <w:t xml:space="preserve">0.734</w:t>
+            </w:r>
+          </w:p>
+        </w:tc>
+        <w:tc>
+          <w:tcPr>
+            <w:tcW w:type="dxa" w:w="893"/>
+          </w:tcPr>
+          <w:p>
+            <w:pPr>
+              <w:pStyle w:val="Compact"/>
+              <w:spacing w:line="240" w:lineRule="auto"/>
+              <w:jc w:val="center"/>
+            </w:pPr>
+            <w:r>
+              <w:rPr>
+                <w:rFonts w:ascii="Times New Roman" w:hAnsi="Times New Roman"/>
+                <w:sz w:val="18"/>
+              </w:rPr>
+              <w:t xml:space="preserve">0.35</w:t>
+            </w:r>
+          </w:p>
+        </w:tc>
+        <w:tc>
+          <w:tcPr>
+            <w:tcW w:type="dxa" w:w="893"/>
+          </w:tcPr>
+          <w:p>
+            <w:pPr>
+              <w:pStyle w:val="Compact"/>
+              <w:spacing w:line="240" w:lineRule="auto"/>
+              <w:jc w:val="center"/>
+            </w:pPr>
+            <w:r>
+              <w:rPr>
+                <w:rFonts w:ascii="Times New Roman" w:hAnsi="Times New Roman"/>
+                <w:sz w:val="18"/>
+              </w:rPr>
+              <w:t xml:space="preserve">0.32</w:t>
+            </w:r>
+          </w:p>
+        </w:tc>
+        <w:tc>
+          <w:tcPr>
+            <w:tcW w:type="dxa" w:w="893"/>
+          </w:tcPr>
+          <w:p>
+            <w:pPr>
+              <w:pStyle w:val="Compact"/>
+              <w:spacing w:line="240" w:lineRule="auto"/>
+              <w:jc w:val="center"/>
+            </w:pPr>
+            <w:r>
+              <w:rPr>
+                <w:rFonts w:ascii="Times New Roman" w:hAnsi="Times New Roman"/>
+                <w:sz w:val="18"/>
+              </w:rPr>
+              <w:t xml:space="preserve">5.5</w:t>
+            </w:r>
+          </w:p>
+        </w:tc>
+        <w:tc>
+          <w:tcPr>
+            <w:tcW w:type="dxa" w:w="893"/>
+          </w:tcPr>
+          <w:p>
+            <w:pPr>
+              <w:pStyle w:val="Compact"/>
+              <w:spacing w:line="240" w:lineRule="auto"/>
+              <w:jc w:val="center"/>
+            </w:pPr>
+            <w:r>
+              <w:rPr>
+                <w:rFonts w:ascii="Times New Roman" w:hAnsi="Times New Roman"/>
+                <w:sz w:val="18"/>
+              </w:rPr>
+              <w:t xml:space="preserve">never</w:t>
+            </w:r>
+          </w:p>
+        </w:tc>
+        <w:tc>
+          <w:tcPr>
+            <w:tcW w:type="dxa" w:w="893"/>
+          </w:tcPr>
+          <w:p>
+            <w:pPr>
+              <w:pStyle w:val="Compact"/>
+              <w:spacing w:line="240" w:lineRule="auto"/>
+            </w:pPr>
           </w:p>
         </w:tc>
       </w:tr>
       <w:tr>
         <w:tc>
           <w:tcPr>
-            <w:tcW w:type="dxa" w:w="3456"/>
+            <w:tcW w:type="dxa" w:w="3110"/>
           </w:tcPr>
           <w:p>
             <w:pPr>
@@ -10882,7 +11552,299 @@
             <w:r>
               <w:rPr>
                 <w:rFonts w:ascii="Times New Roman" w:hAnsi="Times New Roman"/>
-                <w:sz w:val="20"/>
+                <w:sz w:val="18"/>
+              </w:rPr>
+              <w:t xml:space="preserve">Pythia, step 73k to 143k (seed 0)</w:t>
+            </w:r>
+          </w:p>
+        </w:tc>
+        <w:tc>
+          <w:tcPr>
+            <w:tcW w:type="dxa" w:w="893"/>
+          </w:tcPr>
+          <w:p>
+            <w:pPr>
+              <w:pStyle w:val="Compact"/>
+              <w:spacing w:line="240" w:lineRule="auto"/>
+              <w:jc w:val="center"/>
+            </w:pPr>
+            <w:r>
+              <w:rPr>
+                <w:rFonts w:ascii="Times New Roman" w:hAnsi="Times New Roman"/>
+                <w:sz w:val="18"/>
+              </w:rPr>
+              <w:t xml:space="preserve">0.319</w:t>
+            </w:r>
+          </w:p>
+        </w:tc>
+        <w:tc>
+          <w:tcPr>
+            <w:tcW w:type="dxa" w:w="893"/>
+          </w:tcPr>
+          <w:p>
+            <w:pPr>
+              <w:pStyle w:val="Compact"/>
+              <w:spacing w:line="240" w:lineRule="auto"/>
+              <w:jc w:val="center"/>
+            </w:pPr>
+            <w:r>
+              <w:rPr>
+                <w:rFonts w:ascii="Times New Roman" w:hAnsi="Times New Roman"/>
+                <w:sz w:val="18"/>
+              </w:rPr>
+              <w:t xml:space="preserve">0.717</w:t>
+            </w:r>
+          </w:p>
+        </w:tc>
+        <w:tc>
+          <w:tcPr>
+            <w:tcW w:type="dxa" w:w="893"/>
+          </w:tcPr>
+          <w:p>
+            <w:pPr>
+              <w:pStyle w:val="Compact"/>
+              <w:spacing w:line="240" w:lineRule="auto"/>
+              <w:jc w:val="center"/>
+            </w:pPr>
+            <w:r>
+              <w:rPr>
+                <w:rFonts w:ascii="Times New Roman" w:hAnsi="Times New Roman"/>
+                <w:sz w:val="18"/>
+              </w:rPr>
+              <w:t xml:space="preserve">0.36</w:t>
+            </w:r>
+          </w:p>
+        </w:tc>
+        <w:tc>
+          <w:tcPr>
+            <w:tcW w:type="dxa" w:w="893"/>
+          </w:tcPr>
+          <w:p>
+            <w:pPr>
+              <w:pStyle w:val="Compact"/>
+              <w:spacing w:line="240" w:lineRule="auto"/>
+              <w:jc w:val="center"/>
+            </w:pPr>
+            <w:r>
+              <w:rPr>
+                <w:rFonts w:ascii="Times New Roman" w:hAnsi="Times New Roman"/>
+                <w:sz w:val="18"/>
+              </w:rPr>
+              <w:t xml:space="preserve">0.50</w:t>
+            </w:r>
+          </w:p>
+        </w:tc>
+        <w:tc>
+          <w:tcPr>
+            <w:tcW w:type="dxa" w:w="893"/>
+          </w:tcPr>
+          <w:p>
+            <w:pPr>
+              <w:pStyle w:val="Compact"/>
+              <w:spacing w:line="240" w:lineRule="auto"/>
+              <w:jc w:val="center"/>
+            </w:pPr>
+            <w:r>
+              <w:rPr>
+                <w:rFonts w:ascii="Times New Roman" w:hAnsi="Times New Roman"/>
+                <w:sz w:val="18"/>
+              </w:rPr>
+              <w:t xml:space="preserve">3.6</w:t>
+            </w:r>
+          </w:p>
+        </w:tc>
+        <w:tc>
+          <w:tcPr>
+            <w:tcW w:type="dxa" w:w="893"/>
+          </w:tcPr>
+          <w:p>
+            <w:pPr>
+              <w:pStyle w:val="Compact"/>
+              <w:spacing w:line="240" w:lineRule="auto"/>
+              <w:jc w:val="center"/>
+            </w:pPr>
+            <w:r>
+              <w:rPr>
+                <w:rFonts w:ascii="Times New Roman" w:hAnsi="Times New Roman"/>
+                <w:sz w:val="18"/>
+              </w:rPr>
+              <w:t xml:space="preserve">[1.78, 4.40)</w:t>
+            </w:r>
+          </w:p>
+        </w:tc>
+        <w:tc>
+          <w:tcPr>
+            <w:tcW w:type="dxa" w:w="893"/>
+          </w:tcPr>
+          <w:p>
+            <w:pPr>
+              <w:pStyle w:val="Compact"/>
+              <w:spacing w:line="240" w:lineRule="auto"/>
+            </w:pPr>
+          </w:p>
+        </w:tc>
+      </w:tr>
+      <w:tr>
+        <w:tc>
+          <w:tcPr>
+            <w:tcW w:type="dxa" w:w="3110"/>
+          </w:tcPr>
+          <w:p>
+            <w:pPr>
+              <w:pStyle w:val="Compact"/>
+              <w:spacing w:line="240" w:lineRule="auto"/>
+              <w:jc w:val="left"/>
+            </w:pPr>
+            <w:r>
+              <w:rPr>
+                <w:rFonts w:ascii="Times New Roman" w:hAnsi="Times New Roman"/>
+                <w:sz w:val="18"/>
+              </w:rPr>
+              <w:t xml:space="preserve">Pythia, step 73k to 143k (seed 1)</w:t>
+            </w:r>
+          </w:p>
+        </w:tc>
+        <w:tc>
+          <w:tcPr>
+            <w:tcW w:type="dxa" w:w="893"/>
+          </w:tcPr>
+          <w:p>
+            <w:pPr>
+              <w:pStyle w:val="Compact"/>
+              <w:spacing w:line="240" w:lineRule="auto"/>
+              <w:jc w:val="center"/>
+            </w:pPr>
+            <w:r>
+              <w:rPr>
+                <w:rFonts w:ascii="Times New Roman" w:hAnsi="Times New Roman"/>
+                <w:sz w:val="18"/>
+              </w:rPr>
+              <w:t xml:space="preserve">0.359</w:t>
+            </w:r>
+          </w:p>
+        </w:tc>
+        <w:tc>
+          <w:tcPr>
+            <w:tcW w:type="dxa" w:w="893"/>
+          </w:tcPr>
+          <w:p>
+            <w:pPr>
+              <w:pStyle w:val="Compact"/>
+              <w:spacing w:line="240" w:lineRule="auto"/>
+              <w:jc w:val="center"/>
+            </w:pPr>
+            <w:r>
+              <w:rPr>
+                <w:rFonts w:ascii="Times New Roman" w:hAnsi="Times New Roman"/>
+                <w:sz w:val="18"/>
+              </w:rPr>
+              <w:t xml:space="preserve">0.692</w:t>
+            </w:r>
+          </w:p>
+        </w:tc>
+        <w:tc>
+          <w:tcPr>
+            <w:tcW w:type="dxa" w:w="893"/>
+          </w:tcPr>
+          <w:p>
+            <w:pPr>
+              <w:pStyle w:val="Compact"/>
+              <w:spacing w:line="240" w:lineRule="auto"/>
+              <w:jc w:val="center"/>
+            </w:pPr>
+            <w:r>
+              <w:rPr>
+                <w:rFonts w:ascii="Times New Roman" w:hAnsi="Times New Roman"/>
+                <w:sz w:val="18"/>
+              </w:rPr>
+              <w:t xml:space="preserve">0.30</w:t>
+            </w:r>
+          </w:p>
+        </w:tc>
+        <w:tc>
+          <w:tcPr>
+            <w:tcW w:type="dxa" w:w="893"/>
+          </w:tcPr>
+          <w:p>
+            <w:pPr>
+              <w:pStyle w:val="Compact"/>
+              <w:spacing w:line="240" w:lineRule="auto"/>
+              <w:jc w:val="center"/>
+            </w:pPr>
+            <w:r>
+              <w:rPr>
+                <w:rFonts w:ascii="Times New Roman" w:hAnsi="Times New Roman"/>
+                <w:sz w:val="18"/>
+              </w:rPr>
+              <w:t xml:space="preserve">0.43</w:t>
+            </w:r>
+          </w:p>
+        </w:tc>
+        <w:tc>
+          <w:tcPr>
+            <w:tcW w:type="dxa" w:w="893"/>
+          </w:tcPr>
+          <w:p>
+            <w:pPr>
+              <w:pStyle w:val="Compact"/>
+              <w:spacing w:line="240" w:lineRule="auto"/>
+              <w:jc w:val="center"/>
+            </w:pPr>
+            <w:r>
+              <w:rPr>
+                <w:rFonts w:ascii="Times New Roman" w:hAnsi="Times New Roman"/>
+                <w:sz w:val="18"/>
+              </w:rPr>
+              <w:t xml:space="preserve">3.8</w:t>
+            </w:r>
+          </w:p>
+        </w:tc>
+        <w:tc>
+          <w:tcPr>
+            <w:tcW w:type="dxa" w:w="893"/>
+          </w:tcPr>
+          <w:p>
+            <w:pPr>
+              <w:pStyle w:val="Compact"/>
+              <w:spacing w:line="240" w:lineRule="auto"/>
+              <w:jc w:val="center"/>
+            </w:pPr>
+            <w:r>
+              <w:rPr>
+                <w:rFonts w:ascii="Times New Roman" w:hAnsi="Times New Roman"/>
+                <w:sz w:val="18"/>
+              </w:rPr>
+              <w:t xml:space="preserve">[1.73, 4.49)</w:t>
+            </w:r>
+          </w:p>
+        </w:tc>
+        <w:tc>
+          <w:tcPr>
+            <w:tcW w:type="dxa" w:w="893"/>
+          </w:tcPr>
+          <w:p>
+            <w:pPr>
+              <w:pStyle w:val="Compact"/>
+              <w:spacing w:line="240" w:lineRule="auto"/>
+            </w:pPr>
+          </w:p>
+        </w:tc>
+      </w:tr>
+      <w:tr>
+        <w:tc>
+          <w:tcPr>
+            <w:tcW w:type="dxa" w:w="3110"/>
+          </w:tcPr>
+          <w:p>
+            <w:pPr>
+              <w:pStyle w:val="Compact"/>
+              <w:spacing w:line="240" w:lineRule="auto"/>
+              <w:jc w:val="left"/>
+            </w:pPr>
+            <w:r>
+              <w:rPr>
+                <w:rFonts w:ascii="Times New Roman" w:hAnsi="Times New Roman"/>
+                <w:sz w:val="18"/>
               </w:rPr>
               <w:t xml:space="preserve">SmolLM2-360M, base to instruct</w:t>
             </w:r>
@@ -10890,18 +11852,18 @@
         </w:tc>
         <w:tc>
           <w:tcPr>
-            <w:tcW w:type="dxa" w:w="1181"/>
-          </w:tcPr>
-          <w:p>
-            <w:pPr>
-              <w:pStyle w:val="Compact"/>
-              <w:spacing w:line="240" w:lineRule="auto"/>
-              <w:jc w:val="center"/>
-            </w:pPr>
-            <w:r>
-              <w:rPr>
-                <w:rFonts w:ascii="Times New Roman" w:hAnsi="Times New Roman"/>
-                <w:sz w:val="20"/>
+            <w:tcW w:type="dxa" w:w="893"/>
+          </w:tcPr>
+          <w:p>
+            <w:pPr>
+              <w:pStyle w:val="Compact"/>
+              <w:spacing w:line="240" w:lineRule="auto"/>
+              <w:jc w:val="center"/>
+            </w:pPr>
+            <w:r>
+              <w:rPr>
+                <w:rFonts w:ascii="Times New Roman" w:hAnsi="Times New Roman"/>
+                <w:sz w:val="18"/>
               </w:rPr>
               <w:t xml:space="preserve">0.706</w:t>
             </w:r>
@@ -10909,18 +11871,18 @@
         </w:tc>
         <w:tc>
           <w:tcPr>
-            <w:tcW w:type="dxa" w:w="1181"/>
-          </w:tcPr>
-          <w:p>
-            <w:pPr>
-              <w:pStyle w:val="Compact"/>
-              <w:spacing w:line="240" w:lineRule="auto"/>
-              <w:jc w:val="center"/>
-            </w:pPr>
-            <w:r>
-              <w:rPr>
-                <w:rFonts w:ascii="Times New Roman" w:hAnsi="Times New Roman"/>
-                <w:sz w:val="20"/>
+            <w:tcW w:type="dxa" w:w="893"/>
+          </w:tcPr>
+          <w:p>
+            <w:pPr>
+              <w:pStyle w:val="Compact"/>
+              <w:spacing w:line="240" w:lineRule="auto"/>
+              <w:jc w:val="center"/>
+            </w:pPr>
+            <w:r>
+              <w:rPr>
+                <w:rFonts w:ascii="Times New Roman" w:hAnsi="Times New Roman"/>
+                <w:sz w:val="18"/>
               </w:rPr>
               <w:t xml:space="preserve">0.700</w:t>
             </w:r>
@@ -10928,18 +11890,18 @@
         </w:tc>
         <w:tc>
           <w:tcPr>
-            <w:tcW w:type="dxa" w:w="1181"/>
-          </w:tcPr>
-          <w:p>
-            <w:pPr>
-              <w:pStyle w:val="Compact"/>
-              <w:spacing w:line="240" w:lineRule="auto"/>
-              <w:jc w:val="center"/>
-            </w:pPr>
-            <w:r>
-              <w:rPr>
-                <w:rFonts w:ascii="Times New Roman" w:hAnsi="Times New Roman"/>
-                <w:sz w:val="20"/>
+            <w:tcW w:type="dxa" w:w="893"/>
+          </w:tcPr>
+          <w:p>
+            <w:pPr>
+              <w:pStyle w:val="Compact"/>
+              <w:spacing w:line="240" w:lineRule="auto"/>
+              <w:jc w:val="center"/>
+            </w:pPr>
+            <w:r>
+              <w:rPr>
+                <w:rFonts w:ascii="Times New Roman" w:hAnsi="Times New Roman"/>
+                <w:sz w:val="18"/>
               </w:rPr>
               <w:t xml:space="preserve">0.65</w:t>
             </w:r>
@@ -10947,18 +11909,37 @@
         </w:tc>
         <w:tc>
           <w:tcPr>
-            <w:tcW w:type="dxa" w:w="1181"/>
-          </w:tcPr>
-          <w:p>
-            <w:pPr>
-              <w:pStyle w:val="Compact"/>
-              <w:spacing w:line="240" w:lineRule="auto"/>
-              <w:jc w:val="center"/>
-            </w:pPr>
-            <w:r>
-              <w:rPr>
-                <w:rFonts w:ascii="Times New Roman" w:hAnsi="Times New Roman"/>
-                <w:sz w:val="20"/>
+            <w:tcW w:type="dxa" w:w="893"/>
+          </w:tcPr>
+          <w:p>
+            <w:pPr>
+              <w:pStyle w:val="Compact"/>
+              <w:spacing w:line="240" w:lineRule="auto"/>
+              <w:jc w:val="center"/>
+            </w:pPr>
+            <w:r>
+              <w:rPr>
+                <w:rFonts w:ascii="Times New Roman" w:hAnsi="Times New Roman"/>
+                <w:sz w:val="18"/>
+              </w:rPr>
+              <w:t xml:space="preserve">0.00</w:t>
+            </w:r>
+          </w:p>
+        </w:tc>
+        <w:tc>
+          <w:tcPr>
+            <w:tcW w:type="dxa" w:w="893"/>
+          </w:tcPr>
+          <w:p>
+            <w:pPr>
+              <w:pStyle w:val="Compact"/>
+              <w:spacing w:line="240" w:lineRule="auto"/>
+              <w:jc w:val="center"/>
+            </w:pPr>
+            <w:r>
+              <w:rPr>
+                <w:rFonts w:ascii="Times New Roman" w:hAnsi="Times New Roman"/>
+                <w:sz w:val="18"/>
               </w:rPr>
               <w:t xml:space="preserve">8.4</w:t>
             </w:r>
@@ -10966,21 +11947,32 @@
         </w:tc>
         <w:tc>
           <w:tcPr>
-            <w:tcW w:type="dxa" w:w="1181"/>
-          </w:tcPr>
-          <w:p>
-            <w:pPr>
-              <w:pStyle w:val="Compact"/>
-              <w:spacing w:line="240" w:lineRule="auto"/>
-              <w:jc w:val="center"/>
-            </w:pPr>
-            <w:r>
-              <w:rPr>
-                <w:rFonts w:ascii="Times New Roman" w:hAnsi="Times New Roman"/>
-                <w:sz w:val="20"/>
+            <w:tcW w:type="dxa" w:w="893"/>
+          </w:tcPr>
+          <w:p>
+            <w:pPr>
+              <w:pStyle w:val="Compact"/>
+              <w:spacing w:line="240" w:lineRule="auto"/>
+              <w:jc w:val="center"/>
+            </w:pPr>
+            <w:r>
+              <w:rPr>
+                <w:rFonts w:ascii="Times New Roman" w:hAnsi="Times New Roman"/>
+                <w:sz w:val="18"/>
               </w:rPr>
               <w:t xml:space="preserve">never</w:t>
             </w:r>
+          </w:p>
+        </w:tc>
+        <w:tc>
+          <w:tcPr>
+            <w:tcW w:type="dxa" w:w="893"/>
+          </w:tcPr>
+          <w:p>
+            <w:pPr>
+              <w:pStyle w:val="Compact"/>
+              <w:spacing w:line="240" w:lineRule="auto"/>
+            </w:pPr>
           </w:p>
         </w:tc>
       </w:tr>
@@ -11000,13 +11992,13 @@
         <w:t xml:space="preserve"> </w:t>
       </w:r>
       <w:r>
-        <w:t xml:space="preserve">Copying degrades sharply with the size of the upgrade. Across the Pythia series the activation drift rises from 0.25 to 0.31 to 0.60, and</w:t>
-      </w:r>
-      <w:r>
-        <w:t xml:space="preserve"> </w:t>
-      </w:r>
-      <w:r>
-        <w:t xml:space="preserve">copy recovery falls from 0.956 to 0.928 to 0.319 (0.359 on the second seed). ACT’s gain over copying rises in the same order:</w:t>
+        <w:t xml:space="preserve">Copying degrades sharply with the size of the upgrade. Across the five Pythia upgrades the activation drift rises from 0.25 to 0.31, 0.36, 0.56, and 0.60, and</w:t>
+      </w:r>
+      <w:r>
+        <w:t xml:space="preserve"> </w:t>
+      </w:r>
+      <w:r>
+        <w:t xml:space="preserve">copy recovery falls from 0.956 to 0.928, 0.895, 0.554, and 0.319 (0.359 on the second seed). ACT’s gain over copying rises in the same order:</w:t>
       </w:r>
       <w:r>
         <w:t xml:space="preserve"> </w:t>
@@ -11040,7 +12032,7 @@
         </m:r>
       </m:oMath>
       <w:r>
-        <w:t xml:space="preserve">, and</w:t>
+        <w:t xml:space="preserve">,</w:t>
       </w:r>
       <w:r>
         <w:t xml:space="preserve"> </w:t>
@@ -11053,14 +12045,14 @@
           <m:t>+</m:t>
         </m:r>
         <m:r>
-          <m:t>0.398</m:t>
-        </m:r>
-      </m:oMath>
-      <w:r>
-        <w:t xml:space="preserve"> </w:t>
-      </w:r>
-      <w:r>
-        <w:t xml:space="preserve">(</w:t>
+          <m:t>0.039</m:t>
+        </m:r>
+      </m:oMath>
+      <w:r>
+        <w:t xml:space="preserve">,</w:t>
+      </w:r>
+      <w:r>
+        <w:t xml:space="preserve"> </w:t>
       </w:r>
       <m:oMath>
         <m:r>
@@ -11070,6 +12062,40 @@
           <m:t>+</m:t>
         </m:r>
         <m:r>
+          <m:t>0.180</m:t>
+        </m:r>
+      </m:oMath>
+      <w:r>
+        <w:t xml:space="preserve">, and</w:t>
+      </w:r>
+      <w:r>
+        <w:t xml:space="preserve"> </w:t>
+      </w:r>
+      <m:oMath>
+        <m:r>
+          <m:rPr>
+            <m:sty m:val="p"/>
+          </m:rPr>
+          <m:t>+</m:t>
+        </m:r>
+        <m:r>
+          <m:t>0.398</m:t>
+        </m:r>
+      </m:oMath>
+      <w:r>
+        <w:t xml:space="preserve"> </w:t>
+      </w:r>
+      <w:r>
+        <w:t xml:space="preserve">(</w:t>
+      </w:r>
+      <m:oMath>
+        <m:r>
+          <m:rPr>
+            <m:sty m:val="p"/>
+          </m:rPr>
+          <m:t>+</m:t>
+        </m:r>
+        <m:r>
           <m:t>0.333</m:t>
         </m:r>
       </m:oMath>
@@ -11079,46 +12105,13 @@
       <w:r>
         <w:t xml:space="preserve">on the second seed).</w:t>
       </w:r>
-      <w:r>
-        <w:t xml:space="preserve"> </w:t>
-      </w:r>
-      <w:r>
-        <w:t xml:space="preserve">After the largest upgrade ACT recovers 0.69 to 0.72 of the retraining benefit at 30% to 36% of the retraining compute time. Under the model this makes ACT the cost-minimizing policy for adapters</w:t>
-      </w:r>
-      <w:r>
-        <w:t xml:space="preserve"> </w:t>
-      </w:r>
-      <w:r>
-        <w:t xml:space="preserve">whose annual value lies between about 1.8 and 4.4 times</w:t>
-      </w:r>
-      <w:r>
-        <w:t xml:space="preserve"> </w:t>
-      </w:r>
-      <m:oMath>
-        <m:sSub>
-          <m:e>
-            <m:r>
-              <m:t>C</m:t>
-            </m:r>
-          </m:e>
-          <m:sub>
-            <m:r>
-              <m:t>N</m:t>
-            </m:r>
-          </m:sub>
-        </m:sSub>
-      </m:oMath>
-      <w:r>
-        <w:t xml:space="preserve"> </w:t>
-      </w:r>
-      <w:r>
-        <w:t xml:space="preserve">(Table 5): below that range, keep the copy; above it, retrain immediately. After the two smaller upgrades ACT’s gain is smaller than the break-even implied</w:t>
-      </w:r>
-      <w:r>
-        <w:t xml:space="preserve"> </w:t>
-      </w:r>
-      <w:r>
-        <w:t xml:space="preserve">by its cost (</w:t>
+    </w:p>
+    <w:p>
+      <w:pPr>
+        <w:pStyle w:val="BodyText"/>
+      </w:pPr>
+      <w:r>
+        <w:t xml:space="preserve">Whether the gain is worth paying for depends on its cost. At the measured cost ratio of about 0.35, ACT’s gain falls short of the break-even in the four smaller Pythia upgrades, narrowly in the largest of them: at a drift of 0.56 it recovers 0.73 against a break-even of 0.75 (</w:t>
       </w:r>
       <m:oMath>
         <m:r>
@@ -11131,22 +12124,31 @@
           <m:t>=</m:t>
         </m:r>
         <m:r>
-          <m:t>0</m:t>
-        </m:r>
-      </m:oMath>
-      <w:r>
-        <w:t xml:space="preserve"> </w:t>
-      </w:r>
-      <w:r>
-        <w:t xml:space="preserve">and</w:t>
-      </w:r>
-      <w:r>
-        <w:t xml:space="preserve"> </w:t>
-      </w:r>
-      <m:oMath>
-        <m:r>
-          <m:t>Γ</m:t>
-        </m:r>
+          <m:t>0.32</m:t>
+        </m:r>
+      </m:oMath>
+      <w:r>
+        <w:t xml:space="preserve"> </w:t>
+      </w:r>
+      <w:r>
+        <w:t xml:space="preserve">against</w:t>
+      </w:r>
+      <w:r>
+        <w:t xml:space="preserve"> </w:t>
+      </w:r>
+      <m:oMath>
+        <m:sSub>
+          <m:e>
+            <m:r>
+              <m:t>C</m:t>
+            </m:r>
+          </m:e>
+          <m:sub>
+            <m:r>
+              <m:t>A</m:t>
+            </m:r>
+          </m:sub>
+        </m:sSub>
         <m:r>
           <m:rPr>
             <m:sty m:val="p"/>
@@ -11154,14 +12156,23 @@
           <m:t>=</m:t>
         </m:r>
         <m:r>
-          <m:t>0.11</m:t>
-        </m:r>
-      </m:oMath>
-      <w:r>
-        <w:t xml:space="preserve"> </w:t>
-      </w:r>
-      <w:r>
-        <w:t xml:space="preserve">against</w:t>
+          <m:t>0.35</m:t>
+        </m:r>
+      </m:oMath>
+      <w:r>
+        <w:t xml:space="preserve">).</w:t>
+      </w:r>
+      <w:r>
+        <w:t xml:space="preserve"> </w:t>
+      </w:r>
+      <w:r>
+        <w:t xml:space="preserve">Only after the largest upgrade does it clear the bar. There ACT recovers 0.69 to 0.72 of the retraining benefit at 30% to 36% of the retraining compute time, which makes it the cost-minimizing policy for adapters</w:t>
+      </w:r>
+      <w:r>
+        <w:t xml:space="preserve"> </w:t>
+      </w:r>
+      <w:r>
+        <w:t xml:space="preserve">whose annual value lies between about 1.8 and 4.4 times</w:t>
       </w:r>
       <w:r>
         <w:t xml:space="preserve"> </w:t>
@@ -11175,22 +12186,39 @@
           </m:e>
           <m:sub>
             <m:r>
-              <m:t>A</m:t>
+              <m:t>N</m:t>
             </m:r>
           </m:sub>
         </m:sSub>
-        <m:r>
-          <m:rPr>
-            <m:sty m:val="p"/>
-          </m:rPr>
-          <m:t>=</m:t>
-        </m:r>
-        <m:r>
-          <m:t>0.35</m:t>
-        </m:r>
-      </m:oMath>
-      <w:r>
-        <w:t xml:space="preserve">), so copying is the better policy at every value.</w:t>
+      </m:oMath>
+      <w:r>
+        <w:t xml:space="preserve"> </w:t>
+      </w:r>
+      <w:r>
+        <w:t xml:space="preserve">(Table 5): below that range, keep the copy; above it, retrain immediately. A cheaper implementation would move the boundary: at a cost of</w:t>
+      </w:r>
+      <w:r>
+        <w:t xml:space="preserve"> </w:t>
+      </w:r>
+      <m:oMath>
+        <m:r>
+          <m:t>0.05</m:t>
+        </m:r>
+        <m:sSub>
+          <m:e>
+            <m:r>
+              <m:t>C</m:t>
+            </m:r>
+          </m:e>
+          <m:sub>
+            <m:r>
+              <m:t>N</m:t>
+            </m:r>
+          </m:sub>
+        </m:sSub>
+      </m:oMath>
+      <w:r>
+        <w:t xml:space="preserve">, the gain at a drift of 0.56 would already be worth paying for (break-even recovery 0.59).</w:t>
       </w:r>
     </w:p>
     <w:p>
@@ -11357,13 +12385,13 @@
         <w:t xml:space="preserve"> </w:t>
       </w:r>
       <w:r>
-        <w:t xml:space="preserve">The pattern in Table 5, with ACT’s gain growing as copy recovery falls, matches the controlled simulation of Section 6, where the gain also grows with drift (Table 1).</w:t>
-      </w:r>
-      <w:r>
-        <w:t xml:space="preserve"> </w:t>
-      </w:r>
-      <w:r>
-        <w:t xml:space="preserve">The selected anchoring strength is consistent with this account for the large Pythia upgrade: it falls with activation drift (Spearman</w:t>
+        <w:t xml:space="preserve">Across the five Pythia upgrades, ACT’s gain over copying rises monotonically with the activation drift (Table 5), matching the controlled simulation of Section 6, where the gain also grows with drift (Table 1).</w:t>
+      </w:r>
+      <w:r>
+        <w:t xml:space="preserve"> </w:t>
+      </w:r>
+      <w:r>
+        <w:t xml:space="preserve">The selected anchoring strength is consistent with this account for the largest Pythia upgrade: it falls with activation drift (Spearman</w:t>
       </w:r>
       <w:r>
         <w:t xml:space="preserve"> </w:t>
@@ -13899,7 +14927,7 @@
         </m:sSub>
       </m:oMath>
       <w:r>
-        <w:t xml:space="preserve">, so almost any task should keep the copy. After the large upgrade (</w:t>
+        <w:t xml:space="preserve">, so almost any task should keep the copy. After the largest upgrade (</w:t>
       </w:r>
       <m:oMath>
         <m:sSub>
@@ -14154,7 +15182,7 @@
         <w:t xml:space="preserve"> </w:t>
       </w:r>
       <w:r>
-        <w:t xml:space="preserve">Our measurements suggest a practical default that depends on the size of the upgrade: when the model moved little, copying the old adapter restores most of the retraining benefit, the retraining threshold is high, and a transfer method must beat copying by only a few points, but at a cost it rarely does; when the model moved a lot, copying collapses, and a cheap closed-form transfer such as ACT can be the cheapest policy over a middle range of adapter values.</w:t>
+        <w:t xml:space="preserve">Our measurements suggest a practical default that depends on the size of the upgrade: when the model moved little, copying the old adapter restores most of the retraining benefit, the retraining threshold is high, and a transfer method must beat copying by only a few points, but at a cost it rarely does; when the model moved a lot, copying collapses, and a cheap closed-form transfer such as ACT can be the cheapest policy over a middle range of adapter values, although in our series its gain covered its cost only at the largest upgrade.</w:t>
       </w:r>
       <w:r>
         <w:t xml:space="preserve"> </w:t>
@@ -14238,13 +15266,13 @@
         <w:t xml:space="preserve"> </w:t>
       </w:r>
       <w:r>
-        <w:t xml:space="preserve">are excluded and would lower every cost ratio and raise the thresholds. Second, we ran four upgrades of models with 160 to 360 million parameters, on a single task (GSM8K), with 200 evaluation examples each. The drift series covers one model family, and only the largest upgrade has a replicate; the results do not speak to frontier models or to other tasks.</w:t>
-      </w:r>
-      <w:r>
-        <w:t xml:space="preserve"> </w:t>
-      </w:r>
-      <w:r>
-        <w:t xml:space="preserve">Third, the instruction-tuned pair is an unexplained exception, and we cannot say whether it reflects the upgrade type, the model scale, or something else. Fourth, the drift at which ACT starts to pay lies between 0.31 and 0.60 in our series and is not located more precisely. Fifth, value follows a stylized diffusion, and recovery is treated as known at the start of an epoch, whereas in</w:t>
+        <w:t xml:space="preserve">are excluded and would lower every cost ratio and raise the thresholds. Second, we ran six upgrades of models with 160 to 360 million parameters, on a single task (GSM8K), with 200 evaluation examples each. The drift series covers one model family, and only the largest upgrade has a replicate; the results do not speak to frontier models or to other tasks.</w:t>
+      </w:r>
+      <w:r>
+        <w:t xml:space="preserve"> </w:t>
+      </w:r>
+      <w:r>
+        <w:t xml:space="preserve">Third, the instruction-tuned pair is an unexplained exception, and we cannot say whether it reflects the upgrade type, the model scale, or something else. Fourth, ACT’s gain rises steadily with upgrade size, but it covers ACT’s measured cost only at the largest upgrade, with the next largest narrowly short; the boundary lies between drifts of 0.56 and 0.60 for this implementation and cost, and it would move with a cheaper or better method. Fifth, value follows a stylized diffusion, and recovery is treated as known at the start of an epoch, whereas in</w:t>
       </w:r>
       <w:r>
         <w:t xml:space="preserve"> </w:t>

</xml_diff>

<commit_message>
Add model-size evidence (70M, 160M, 410M) and ACT cost scaling to manuscripts
Co-Authored-By: Claude Sonnet 5.5 <noreply@anthropic.com>
Claude-Session: https://claude.ai/code/session_01CmDdfYCJkX1v32uwdfkXMf
</commit_message>
<xml_diff>
--- a/manuscript/dss_manuscript.docx
+++ b/manuscript/dss_manuscript.docx
@@ -1515,6 +1515,198 @@
         <w:t xml:space="preserve"> </w:t>
       </w:r>
       <w:r>
+        <w:t xml:space="preserve">The</w:t>
+      </w:r>
+      <w:r>
+        <w:t xml:space="preserve"> </w:t>
+      </w:r>
+      <w:r>
+        <w:t xml:space="preserve">pattern</w:t>
+      </w:r>
+      <w:r>
+        <w:t xml:space="preserve"> </w:t>
+      </w:r>
+      <w:r>
+        <w:t xml:space="preserve">repeats</w:t>
+      </w:r>
+      <w:r>
+        <w:t xml:space="preserve"> </w:t>
+      </w:r>
+      <w:r>
+        <w:t xml:space="preserve">at</w:t>
+      </w:r>
+      <w:r>
+        <w:t xml:space="preserve"> </w:t>
+      </w:r>
+      <w:r>
+        <w:t xml:space="preserve">70</w:t>
+      </w:r>
+      <w:r>
+        <w:t xml:space="preserve"> </w:t>
+      </w:r>
+      <w:r>
+        <w:t xml:space="preserve">and</w:t>
+      </w:r>
+      <w:r>
+        <w:t xml:space="preserve"> </w:t>
+      </w:r>
+      <w:r>
+        <w:t xml:space="preserve">410</w:t>
+      </w:r>
+      <w:r>
+        <w:t xml:space="preserve"> </w:t>
+      </w:r>
+      <w:r>
+        <w:t xml:space="preserve">million</w:t>
+      </w:r>
+      <w:r>
+        <w:t xml:space="preserve"> </w:t>
+      </w:r>
+      <w:r>
+        <w:t xml:space="preserve">parameters,</w:t>
+      </w:r>
+      <w:r>
+        <w:t xml:space="preserve"> </w:t>
+      </w:r>
+      <w:r>
+        <w:t xml:space="preserve">but</w:t>
+      </w:r>
+      <w:r>
+        <w:t xml:space="preserve"> </w:t>
+      </w:r>
+      <w:r>
+        <w:t xml:space="preserve">ACT’s</w:t>
+      </w:r>
+      <w:r>
+        <w:t xml:space="preserve"> </w:t>
+      </w:r>
+      <w:r>
+        <w:t xml:space="preserve">compute</w:t>
+      </w:r>
+      <w:r>
+        <w:t xml:space="preserve"> </w:t>
+      </w:r>
+      <w:r>
+        <w:t xml:space="preserve">time</w:t>
+      </w:r>
+      <w:r>
+        <w:t xml:space="preserve"> </w:t>
+      </w:r>
+      <w:r>
+        <w:t xml:space="preserve">relative</w:t>
+      </w:r>
+      <w:r>
+        <w:t xml:space="preserve"> </w:t>
+      </w:r>
+      <w:r>
+        <w:t xml:space="preserve">to</w:t>
+      </w:r>
+      <w:r>
+        <w:t xml:space="preserve"> </w:t>
+      </w:r>
+      <w:r>
+        <w:t xml:space="preserve">retraining</w:t>
+      </w:r>
+      <w:r>
+        <w:t xml:space="preserve"> </w:t>
+      </w:r>
+      <w:r>
+        <w:t xml:space="preserve">rises</w:t>
+      </w:r>
+      <w:r>
+        <w:t xml:space="preserve"> </w:t>
+      </w:r>
+      <w:r>
+        <w:t xml:space="preserve">from</w:t>
+      </w:r>
+      <w:r>
+        <w:t xml:space="preserve"> </w:t>
+      </w:r>
+      <w:r>
+        <w:t xml:space="preserve">0.14</w:t>
+      </w:r>
+      <w:r>
+        <w:t xml:space="preserve"> </w:t>
+      </w:r>
+      <w:r>
+        <w:t xml:space="preserve">to</w:t>
+      </w:r>
+      <w:r>
+        <w:t xml:space="preserve"> </w:t>
+      </w:r>
+      <w:r>
+        <w:t xml:space="preserve">0.70</w:t>
+      </w:r>
+      <w:r>
+        <w:t xml:space="preserve"> </w:t>
+      </w:r>
+      <w:r>
+        <w:t xml:space="preserve">in</w:t>
+      </w:r>
+      <w:r>
+        <w:t xml:space="preserve"> </w:t>
+      </w:r>
+      <w:r>
+        <w:t xml:space="preserve">our</w:t>
+      </w:r>
+      <w:r>
+        <w:t xml:space="preserve"> </w:t>
+      </w:r>
+      <w:r>
+        <w:t xml:space="preserve">implementation,</w:t>
+      </w:r>
+      <w:r>
+        <w:t xml:space="preserve"> </w:t>
+      </w:r>
+      <w:r>
+        <w:t xml:space="preserve">so</w:t>
+      </w:r>
+      <w:r>
+        <w:t xml:space="preserve"> </w:t>
+      </w:r>
+      <w:r>
+        <w:t xml:space="preserve">at</w:t>
+      </w:r>
+      <w:r>
+        <w:t xml:space="preserve"> </w:t>
+      </w:r>
+      <w:r>
+        <w:t xml:space="preserve">410</w:t>
+      </w:r>
+      <w:r>
+        <w:t xml:space="preserve"> </w:t>
+      </w:r>
+      <w:r>
+        <w:t xml:space="preserve">million</w:t>
+      </w:r>
+      <w:r>
+        <w:t xml:space="preserve"> </w:t>
+      </w:r>
+      <w:r>
+        <w:t xml:space="preserve">it</w:t>
+      </w:r>
+      <w:r>
+        <w:t xml:space="preserve"> </w:t>
+      </w:r>
+      <w:r>
+        <w:t xml:space="preserve">no</w:t>
+      </w:r>
+      <w:r>
+        <w:t xml:space="preserve"> </w:t>
+      </w:r>
+      <w:r>
+        <w:t xml:space="preserve">longer</w:t>
+      </w:r>
+      <w:r>
+        <w:t xml:space="preserve"> </w:t>
+      </w:r>
+      <w:r>
+        <w:t xml:space="preserve">pays.</w:t>
+      </w:r>
+      <w:r>
+        <w:t xml:space="preserve"> </w:t>
+      </w:r>
+      <w:r>
         <w:t xml:space="preserve">After</w:t>
       </w:r>
       <w:r>
@@ -1587,7 +1779,7 @@
         <w:t xml:space="preserve"> </w:t>
       </w:r>
       <w:r>
-        <w:t xml:space="preserve">the</w:t>
+        <w:t xml:space="preserve">an</w:t>
       </w:r>
       <w:r>
         <w:t xml:space="preserve"> </w:t>
@@ -2224,13 +2416,19 @@
         <w:t xml:space="preserve"> </w:t>
       </w:r>
       <w:r>
-        <w:t xml:space="preserve">Its gain over copying rises steadily with the size of the upgrade, reaching 0.33 to 0.40 after the largest (two seeds), where it restores 69% to 72% of the retraining benefit at 30% to 36% of the retraining compute time and is the</w:t>
-      </w:r>
-      <w:r>
-        <w:t xml:space="preserve"> </w:t>
-      </w:r>
-      <w:r>
-        <w:t xml:space="preserve">cost-minimizing policy over a bounded range of adapter values. After smaller upgrades its gain does not cover its cost, and on the instruction-tuned pair it gives no gain, for a reason we could not identify.</w:t>
+        <w:t xml:space="preserve">Its gain over copying rises steadily with the size of the upgrade, reaching 0.33 to 0.40 after the largest at 160 million parameters (two seeds), where it restores 69% to 72% of the retraining benefit at 30% to 36% of the retraining compute time and is the</w:t>
+      </w:r>
+      <w:r>
+        <w:t xml:space="preserve"> </w:t>
+      </w:r>
+      <w:r>
+        <w:t xml:space="preserve">cost-minimizing policy over a bounded range of adapter values. The gain also appears at 70 and 410 million parameters, but ACT’s compute time relative to retraining rises from 0.14 to 0.70 with model size in our implementation, so the same method stops paying at 410 million.</w:t>
+      </w:r>
+      <w:r>
+        <w:t xml:space="preserve"> </w:t>
+      </w:r>
+      <w:r>
+        <w:t xml:space="preserve">After smaller upgrades its gain does not cover its cost, and on the instruction-tuned pair it gives no gain, for a reason we could not identify.</w:t>
       </w:r>
     </w:p>
     <w:p>
@@ -10710,14 +10908,13 @@
         </w:tblBorders>
       </w:tblPr>
       <w:tblGrid>
-        <w:gridCol w:w="3110"/>
-        <w:gridCol w:w="892"/>
-        <w:gridCol w:w="892"/>
-        <w:gridCol w:w="892"/>
-        <w:gridCol w:w="892"/>
-        <w:gridCol w:w="892"/>
-        <w:gridCol w:w="892"/>
-        <w:gridCol w:w="892"/>
+        <w:gridCol w:w="3456"/>
+        <w:gridCol w:w="983"/>
+        <w:gridCol w:w="983"/>
+        <w:gridCol w:w="983"/>
+        <w:gridCol w:w="983"/>
+        <w:gridCol w:w="983"/>
+        <w:gridCol w:w="983"/>
       </w:tblGrid>
       <w:tr>
         <w:trPr>
@@ -10725,7 +10922,7 @@
         </w:trPr>
         <w:tc>
           <w:tcPr>
-            <w:tcW w:type="dxa" w:w="3110"/>
+            <w:tcW w:type="dxa" w:w="3456"/>
             <w:tcBorders>
               <w:bottom w:val="single" w:sz="6" w:color="000000"/>
             </w:tcBorders>
@@ -10739,7 +10936,7 @@
             <w:r>
               <w:rPr>
                 <w:rFonts w:ascii="Times New Roman" w:hAnsi="Times New Roman"/>
-                <w:sz w:val="18"/>
+                <w:sz w:val="20"/>
               </w:rPr>
               <w:t xml:space="preserve">Upgrade</w:t>
             </w:r>
@@ -10747,7 +10944,7 @@
         </w:tc>
         <w:tc>
           <w:tcPr>
-            <w:tcW w:type="dxa" w:w="893"/>
+            <w:tcW w:type="dxa" w:w="984"/>
             <w:tcBorders>
               <w:bottom w:val="single" w:sz="6" w:color="000000"/>
             </w:tcBorders>
@@ -10761,14 +10958,14 @@
             <w:r>
               <w:rPr>
                 <w:rFonts w:ascii="Times New Roman" w:hAnsi="Times New Roman"/>
-                <w:sz w:val="18"/>
+                <w:sz w:val="20"/>
               </w:rPr>
               <w:t xml:space="preserve">R</w:t>
             </w:r>
             <w:r>
               <w:rPr>
                 <w:rFonts w:ascii="Times New Roman" w:hAnsi="Times New Roman"/>
-                <w:sz w:val="18"/>
+                <w:sz w:val="20"/>
                 <w:vertAlign w:val="subscript"/>
               </w:rPr>
               <w:t xml:space="preserve">C</w:t>
@@ -10777,7 +10974,7 @@
         </w:tc>
         <w:tc>
           <w:tcPr>
-            <w:tcW w:type="dxa" w:w="893"/>
+            <w:tcW w:type="dxa" w:w="984"/>
             <w:tcBorders>
               <w:bottom w:val="single" w:sz="6" w:color="000000"/>
             </w:tcBorders>
@@ -10791,14 +10988,14 @@
             <w:r>
               <w:rPr>
                 <w:rFonts w:ascii="Times New Roman" w:hAnsi="Times New Roman"/>
-                <w:sz w:val="18"/>
+                <w:sz w:val="20"/>
               </w:rPr>
               <w:t xml:space="preserve">R</w:t>
             </w:r>
             <w:r>
               <w:rPr>
                 <w:rFonts w:ascii="Times New Roman" w:hAnsi="Times New Roman"/>
-                <w:sz w:val="18"/>
+                <w:sz w:val="20"/>
                 <w:vertAlign w:val="subscript"/>
               </w:rPr>
               <w:t xml:space="preserve">A</w:t>
@@ -10807,7 +11004,7 @@
         </w:tc>
         <w:tc>
           <w:tcPr>
-            <w:tcW w:type="dxa" w:w="893"/>
+            <w:tcW w:type="dxa" w:w="984"/>
             <w:tcBorders>
               <w:bottom w:val="single" w:sz="6" w:color="000000"/>
             </w:tcBorders>
@@ -10821,14 +11018,14 @@
             <w:r>
               <w:rPr>
                 <w:rFonts w:ascii="Times New Roman" w:hAnsi="Times New Roman"/>
-                <w:sz w:val="18"/>
+                <w:sz w:val="20"/>
               </w:rPr>
               <w:t xml:space="preserve">C</w:t>
             </w:r>
             <w:r>
               <w:rPr>
                 <w:rFonts w:ascii="Times New Roman" w:hAnsi="Times New Roman"/>
-                <w:sz w:val="18"/>
+                <w:sz w:val="20"/>
                 <w:vertAlign w:val="subscript"/>
               </w:rPr>
               <w:t xml:space="preserve">A</w:t>
@@ -10836,14 +11033,14 @@
             <w:r>
               <w:rPr>
                 <w:rFonts w:ascii="Times New Roman" w:hAnsi="Times New Roman"/>
-                <w:sz w:val="18"/>
+                <w:sz w:val="20"/>
               </w:rPr>
               <w:t xml:space="preserve">/C</w:t>
             </w:r>
             <w:r>
               <w:rPr>
                 <w:rFonts w:ascii="Times New Roman" w:hAnsi="Times New Roman"/>
-                <w:sz w:val="18"/>
+                <w:sz w:val="20"/>
                 <w:vertAlign w:val="subscript"/>
               </w:rPr>
               <w:t xml:space="preserve">N</w:t>
@@ -10852,7 +11049,7 @@
         </w:tc>
         <w:tc>
           <w:tcPr>
-            <w:tcW w:type="dxa" w:w="893"/>
+            <w:tcW w:type="dxa" w:w="984"/>
             <w:tcBorders>
               <w:bottom w:val="single" w:sz="6" w:color="000000"/>
             </w:tcBorders>
@@ -10866,7 +11063,7 @@
             <w:r>
               <w:rPr>
                 <w:rFonts w:ascii="Times New Roman" w:hAnsi="Times New Roman"/>
-                <w:sz w:val="18"/>
+                <w:sz w:val="20"/>
               </w:rPr>
               <w:t xml:space="preserve">Γ</w:t>
             </w:r>
@@ -10874,7 +11071,7 @@
         </w:tc>
         <w:tc>
           <w:tcPr>
-            <w:tcW w:type="dxa" w:w="893"/>
+            <w:tcW w:type="dxa" w:w="984"/>
             <w:tcBorders>
               <w:bottom w:val="single" w:sz="6" w:color="000000"/>
             </w:tcBorders>
@@ -10888,14 +11085,14 @@
             <w:r>
               <w:rPr>
                 <w:rFonts w:ascii="Times New Roman" w:hAnsi="Times New Roman"/>
-                <w:sz w:val="18"/>
+                <w:sz w:val="20"/>
               </w:rPr>
               <w:t xml:space="preserve">v*</w:t>
             </w:r>
             <w:r>
               <w:rPr>
                 <w:rFonts w:ascii="Times New Roman" w:hAnsi="Times New Roman"/>
-                <w:sz w:val="18"/>
+                <w:sz w:val="20"/>
                 <w:vertAlign w:val="subscript"/>
               </w:rPr>
               <w:t xml:space="preserve">C</w:t>
@@ -10903,14 +11100,14 @@
             <w:r>
               <w:rPr>
                 <w:rFonts w:ascii="Times New Roman" w:hAnsi="Times New Roman"/>
-                <w:sz w:val="18"/>
+                <w:sz w:val="20"/>
               </w:rPr>
               <w:t xml:space="preserve">/C</w:t>
             </w:r>
             <w:r>
               <w:rPr>
                 <w:rFonts w:ascii="Times New Roman" w:hAnsi="Times New Roman"/>
-                <w:sz w:val="18"/>
+                <w:sz w:val="20"/>
                 <w:vertAlign w:val="subscript"/>
               </w:rPr>
               <w:t xml:space="preserve">N</w:t>
@@ -10919,7 +11116,7 @@
         </w:tc>
         <w:tc>
           <w:tcPr>
-            <w:tcW w:type="dxa" w:w="893"/>
+            <w:tcW w:type="dxa" w:w="984"/>
             <w:tcBorders>
               <w:bottom w:val="single" w:sz="6" w:color="000000"/>
             </w:tcBorders>
@@ -10933,31 +11130,17 @@
             <w:r>
               <w:rPr>
                 <w:rFonts w:ascii="Times New Roman" w:hAnsi="Times New Roman"/>
-                <w:sz w:val="18"/>
+                <w:sz w:val="20"/>
               </w:rPr>
               <w:t xml:space="preserve">ACT optimal for</w:t>
             </w:r>
-          </w:p>
-        </w:tc>
-        <w:tc>
-          <w:tcPr>
-            <w:tcW w:type="dxa" w:w="893"/>
-            <w:tcBorders>
-              <w:bottom w:val="single" w:sz="6" w:color="000000"/>
-            </w:tcBorders>
-          </w:tcPr>
-          <w:p>
-            <w:pPr>
-              <w:pStyle w:val="Compact"/>
-              <w:spacing w:line="240" w:lineRule="auto"/>
-            </w:pPr>
           </w:p>
         </w:tc>
       </w:tr>
       <w:tr>
         <w:tc>
           <w:tcPr>
-            <w:tcW w:type="dxa" w:w="3110"/>
+            <w:tcW w:type="dxa" w:w="3456"/>
           </w:tcPr>
           <w:p>
             <w:pPr>
@@ -10968,7 +11151,7 @@
             <w:r>
               <w:rPr>
                 <w:rFonts w:ascii="Times New Roman" w:hAnsi="Times New Roman"/>
-                <w:sz w:val="18"/>
+                <w:sz w:val="20"/>
               </w:rPr>
               <w:t xml:space="preserve">Pythia, step 133k to 143k</w:t>
             </w:r>
@@ -10976,18 +11159,18 @@
         </w:tc>
         <w:tc>
           <w:tcPr>
-            <w:tcW w:type="dxa" w:w="893"/>
-          </w:tcPr>
-          <w:p>
-            <w:pPr>
-              <w:pStyle w:val="Compact"/>
-              <w:spacing w:line="240" w:lineRule="auto"/>
-              <w:jc w:val="center"/>
-            </w:pPr>
-            <w:r>
-              <w:rPr>
-                <w:rFonts w:ascii="Times New Roman" w:hAnsi="Times New Roman"/>
-                <w:sz w:val="18"/>
+            <w:tcW w:type="dxa" w:w="984"/>
+          </w:tcPr>
+          <w:p>
+            <w:pPr>
+              <w:pStyle w:val="Compact"/>
+              <w:spacing w:line="240" w:lineRule="auto"/>
+              <w:jc w:val="center"/>
+            </w:pPr>
+            <w:r>
+              <w:rPr>
+                <w:rFonts w:ascii="Times New Roman" w:hAnsi="Times New Roman"/>
+                <w:sz w:val="20"/>
               </w:rPr>
               <w:t xml:space="preserve">0.956</w:t>
             </w:r>
@@ -10995,18 +11178,18 @@
         </w:tc>
         <w:tc>
           <w:tcPr>
-            <w:tcW w:type="dxa" w:w="893"/>
-          </w:tcPr>
-          <w:p>
-            <w:pPr>
-              <w:pStyle w:val="Compact"/>
-              <w:spacing w:line="240" w:lineRule="auto"/>
-              <w:jc w:val="center"/>
-            </w:pPr>
-            <w:r>
-              <w:rPr>
-                <w:rFonts w:ascii="Times New Roman" w:hAnsi="Times New Roman"/>
-                <w:sz w:val="18"/>
+            <w:tcW w:type="dxa" w:w="984"/>
+          </w:tcPr>
+          <w:p>
+            <w:pPr>
+              <w:pStyle w:val="Compact"/>
+              <w:spacing w:line="240" w:lineRule="auto"/>
+              <w:jc w:val="center"/>
+            </w:pPr>
+            <w:r>
+              <w:rPr>
+                <w:rFonts w:ascii="Times New Roman" w:hAnsi="Times New Roman"/>
+                <w:sz w:val="20"/>
               </w:rPr>
               <w:t xml:space="preserve">0.952</w:t>
             </w:r>
@@ -11014,18 +11197,18 @@
         </w:tc>
         <w:tc>
           <w:tcPr>
-            <w:tcW w:type="dxa" w:w="893"/>
-          </w:tcPr>
-          <w:p>
-            <w:pPr>
-              <w:pStyle w:val="Compact"/>
-              <w:spacing w:line="240" w:lineRule="auto"/>
-              <w:jc w:val="center"/>
-            </w:pPr>
-            <w:r>
-              <w:rPr>
-                <w:rFonts w:ascii="Times New Roman" w:hAnsi="Times New Roman"/>
-                <w:sz w:val="18"/>
+            <w:tcW w:type="dxa" w:w="984"/>
+          </w:tcPr>
+          <w:p>
+            <w:pPr>
+              <w:pStyle w:val="Compact"/>
+              <w:spacing w:line="240" w:lineRule="auto"/>
+              <w:jc w:val="center"/>
+            </w:pPr>
+            <w:r>
+              <w:rPr>
+                <w:rFonts w:ascii="Times New Roman" w:hAnsi="Times New Roman"/>
+                <w:sz w:val="20"/>
               </w:rPr>
               <w:t xml:space="preserve">0.35</w:t>
             </w:r>
@@ -11033,18 +11216,18 @@
         </w:tc>
         <w:tc>
           <w:tcPr>
-            <w:tcW w:type="dxa" w:w="893"/>
-          </w:tcPr>
-          <w:p>
-            <w:pPr>
-              <w:pStyle w:val="Compact"/>
-              <w:spacing w:line="240" w:lineRule="auto"/>
-              <w:jc w:val="center"/>
-            </w:pPr>
-            <w:r>
-              <w:rPr>
-                <w:rFonts w:ascii="Times New Roman" w:hAnsi="Times New Roman"/>
-                <w:sz w:val="18"/>
+            <w:tcW w:type="dxa" w:w="984"/>
+          </w:tcPr>
+          <w:p>
+            <w:pPr>
+              <w:pStyle w:val="Compact"/>
+              <w:spacing w:line="240" w:lineRule="auto"/>
+              <w:jc w:val="center"/>
+            </w:pPr>
+            <w:r>
+              <w:rPr>
+                <w:rFonts w:ascii="Times New Roman" w:hAnsi="Times New Roman"/>
+                <w:sz w:val="20"/>
               </w:rPr>
               <w:t xml:space="preserve">0.00</w:t>
             </w:r>
@@ -11052,18 +11235,18 @@
         </w:tc>
         <w:tc>
           <w:tcPr>
-            <w:tcW w:type="dxa" w:w="893"/>
-          </w:tcPr>
-          <w:p>
-            <w:pPr>
-              <w:pStyle w:val="Compact"/>
-              <w:spacing w:line="240" w:lineRule="auto"/>
-              <w:jc w:val="center"/>
-            </w:pPr>
-            <w:r>
-              <w:rPr>
-                <w:rFonts w:ascii="Times New Roman" w:hAnsi="Times New Roman"/>
-                <w:sz w:val="18"/>
+            <w:tcW w:type="dxa" w:w="984"/>
+          </w:tcPr>
+          <w:p>
+            <w:pPr>
+              <w:pStyle w:val="Compact"/>
+              <w:spacing w:line="240" w:lineRule="auto"/>
+              <w:jc w:val="center"/>
+            </w:pPr>
+            <w:r>
+              <w:rPr>
+                <w:rFonts w:ascii="Times New Roman" w:hAnsi="Times New Roman"/>
+                <w:sz w:val="20"/>
               </w:rPr>
               <w:t xml:space="preserve">55.6</w:t>
             </w:r>
@@ -11071,39 +11254,28 @@
         </w:tc>
         <w:tc>
           <w:tcPr>
-            <w:tcW w:type="dxa" w:w="893"/>
-          </w:tcPr>
-          <w:p>
-            <w:pPr>
-              <w:pStyle w:val="Compact"/>
-              <w:spacing w:line="240" w:lineRule="auto"/>
-              <w:jc w:val="center"/>
-            </w:pPr>
-            <w:r>
-              <w:rPr>
-                <w:rFonts w:ascii="Times New Roman" w:hAnsi="Times New Roman"/>
-                <w:sz w:val="18"/>
+            <w:tcW w:type="dxa" w:w="984"/>
+          </w:tcPr>
+          <w:p>
+            <w:pPr>
+              <w:pStyle w:val="Compact"/>
+              <w:spacing w:line="240" w:lineRule="auto"/>
+              <w:jc w:val="center"/>
+            </w:pPr>
+            <w:r>
+              <w:rPr>
+                <w:rFonts w:ascii="Times New Roman" w:hAnsi="Times New Roman"/>
+                <w:sz w:val="20"/>
               </w:rPr>
               <w:t xml:space="preserve">never</w:t>
             </w:r>
-          </w:p>
-        </w:tc>
-        <w:tc>
-          <w:tcPr>
-            <w:tcW w:type="dxa" w:w="893"/>
-          </w:tcPr>
-          <w:p>
-            <w:pPr>
-              <w:pStyle w:val="Compact"/>
-              <w:spacing w:line="240" w:lineRule="auto"/>
-            </w:pPr>
           </w:p>
         </w:tc>
       </w:tr>
       <w:tr>
         <w:tc>
           <w:tcPr>
-            <w:tcW w:type="dxa" w:w="3110"/>
+            <w:tcW w:type="dxa" w:w="3456"/>
           </w:tcPr>
           <w:p>
             <w:pPr>
@@ -11114,7 +11286,7 @@
             <w:r>
               <w:rPr>
                 <w:rFonts w:ascii="Times New Roman" w:hAnsi="Times New Roman"/>
-                <w:sz w:val="18"/>
+                <w:sz w:val="20"/>
               </w:rPr>
               <w:t xml:space="preserve">Pythia, step 113k to 143k</w:t>
             </w:r>
@@ -11122,18 +11294,18 @@
         </w:tc>
         <w:tc>
           <w:tcPr>
-            <w:tcW w:type="dxa" w:w="893"/>
-          </w:tcPr>
-          <w:p>
-            <w:pPr>
-              <w:pStyle w:val="Compact"/>
-              <w:spacing w:line="240" w:lineRule="auto"/>
-              <w:jc w:val="center"/>
-            </w:pPr>
-            <w:r>
-              <w:rPr>
-                <w:rFonts w:ascii="Times New Roman" w:hAnsi="Times New Roman"/>
-                <w:sz w:val="18"/>
+            <w:tcW w:type="dxa" w:w="984"/>
+          </w:tcPr>
+          <w:p>
+            <w:pPr>
+              <w:pStyle w:val="Compact"/>
+              <w:spacing w:line="240" w:lineRule="auto"/>
+              <w:jc w:val="center"/>
+            </w:pPr>
+            <w:r>
+              <w:rPr>
+                <w:rFonts w:ascii="Times New Roman" w:hAnsi="Times New Roman"/>
+                <w:sz w:val="20"/>
               </w:rPr>
               <w:t xml:space="preserve">0.928</w:t>
             </w:r>
@@ -11141,18 +11313,18 @@
         </w:tc>
         <w:tc>
           <w:tcPr>
-            <w:tcW w:type="dxa" w:w="893"/>
-          </w:tcPr>
-          <w:p>
-            <w:pPr>
-              <w:pStyle w:val="Compact"/>
-              <w:spacing w:line="240" w:lineRule="auto"/>
-              <w:jc w:val="center"/>
-            </w:pPr>
-            <w:r>
-              <w:rPr>
-                <w:rFonts w:ascii="Times New Roman" w:hAnsi="Times New Roman"/>
-                <w:sz w:val="18"/>
+            <w:tcW w:type="dxa" w:w="984"/>
+          </w:tcPr>
+          <w:p>
+            <w:pPr>
+              <w:pStyle w:val="Compact"/>
+              <w:spacing w:line="240" w:lineRule="auto"/>
+              <w:jc w:val="center"/>
+            </w:pPr>
+            <w:r>
+              <w:rPr>
+                <w:rFonts w:ascii="Times New Roman" w:hAnsi="Times New Roman"/>
+                <w:sz w:val="20"/>
               </w:rPr>
               <w:t xml:space="preserve">0.939</w:t>
             </w:r>
@@ -11160,18 +11332,18 @@
         </w:tc>
         <w:tc>
           <w:tcPr>
-            <w:tcW w:type="dxa" w:w="893"/>
-          </w:tcPr>
-          <w:p>
-            <w:pPr>
-              <w:pStyle w:val="Compact"/>
-              <w:spacing w:line="240" w:lineRule="auto"/>
-              <w:jc w:val="center"/>
-            </w:pPr>
-            <w:r>
-              <w:rPr>
-                <w:rFonts w:ascii="Times New Roman" w:hAnsi="Times New Roman"/>
-                <w:sz w:val="18"/>
+            <w:tcW w:type="dxa" w:w="984"/>
+          </w:tcPr>
+          <w:p>
+            <w:pPr>
+              <w:pStyle w:val="Compact"/>
+              <w:spacing w:line="240" w:lineRule="auto"/>
+              <w:jc w:val="center"/>
+            </w:pPr>
+            <w:r>
+              <w:rPr>
+                <w:rFonts w:ascii="Times New Roman" w:hAnsi="Times New Roman"/>
+                <w:sz w:val="20"/>
               </w:rPr>
               <w:t xml:space="preserve">0.35</w:t>
             </w:r>
@@ -11179,18 +11351,18 @@
         </w:tc>
         <w:tc>
           <w:tcPr>
-            <w:tcW w:type="dxa" w:w="893"/>
-          </w:tcPr>
-          <w:p>
-            <w:pPr>
-              <w:pStyle w:val="Compact"/>
-              <w:spacing w:line="240" w:lineRule="auto"/>
-              <w:jc w:val="center"/>
-            </w:pPr>
-            <w:r>
-              <w:rPr>
-                <w:rFonts w:ascii="Times New Roman" w:hAnsi="Times New Roman"/>
-                <w:sz w:val="18"/>
+            <w:tcW w:type="dxa" w:w="984"/>
+          </w:tcPr>
+          <w:p>
+            <w:pPr>
+              <w:pStyle w:val="Compact"/>
+              <w:spacing w:line="240" w:lineRule="auto"/>
+              <w:jc w:val="center"/>
+            </w:pPr>
+            <w:r>
+              <w:rPr>
+                <w:rFonts w:ascii="Times New Roman" w:hAnsi="Times New Roman"/>
+                <w:sz w:val="20"/>
               </w:rPr>
               <w:t xml:space="preserve">0.11</w:t>
             </w:r>
@@ -11198,18 +11370,18 @@
         </w:tc>
         <w:tc>
           <w:tcPr>
-            <w:tcW w:type="dxa" w:w="893"/>
-          </w:tcPr>
-          <w:p>
-            <w:pPr>
-              <w:pStyle w:val="Compact"/>
-              <w:spacing w:line="240" w:lineRule="auto"/>
-              <w:jc w:val="center"/>
-            </w:pPr>
-            <w:r>
-              <w:rPr>
-                <w:rFonts w:ascii="Times New Roman" w:hAnsi="Times New Roman"/>
-                <w:sz w:val="18"/>
+            <w:tcW w:type="dxa" w:w="984"/>
+          </w:tcPr>
+          <w:p>
+            <w:pPr>
+              <w:pStyle w:val="Compact"/>
+              <w:spacing w:line="240" w:lineRule="auto"/>
+              <w:jc w:val="center"/>
+            </w:pPr>
+            <w:r>
+              <w:rPr>
+                <w:rFonts w:ascii="Times New Roman" w:hAnsi="Times New Roman"/>
+                <w:sz w:val="20"/>
               </w:rPr>
               <w:t xml:space="preserve">34.0</w:t>
             </w:r>
@@ -11217,39 +11389,28 @@
         </w:tc>
         <w:tc>
           <w:tcPr>
-            <w:tcW w:type="dxa" w:w="893"/>
-          </w:tcPr>
-          <w:p>
-            <w:pPr>
-              <w:pStyle w:val="Compact"/>
-              <w:spacing w:line="240" w:lineRule="auto"/>
-              <w:jc w:val="center"/>
-            </w:pPr>
-            <w:r>
-              <w:rPr>
-                <w:rFonts w:ascii="Times New Roman" w:hAnsi="Times New Roman"/>
-                <w:sz w:val="18"/>
+            <w:tcW w:type="dxa" w:w="984"/>
+          </w:tcPr>
+          <w:p>
+            <w:pPr>
+              <w:pStyle w:val="Compact"/>
+              <w:spacing w:line="240" w:lineRule="auto"/>
+              <w:jc w:val="center"/>
+            </w:pPr>
+            <w:r>
+              <w:rPr>
+                <w:rFonts w:ascii="Times New Roman" w:hAnsi="Times New Roman"/>
+                <w:sz w:val="20"/>
               </w:rPr>
               <w:t xml:space="preserve">never</w:t>
             </w:r>
-          </w:p>
-        </w:tc>
-        <w:tc>
-          <w:tcPr>
-            <w:tcW w:type="dxa" w:w="893"/>
-          </w:tcPr>
-          <w:p>
-            <w:pPr>
-              <w:pStyle w:val="Compact"/>
-              <w:spacing w:line="240" w:lineRule="auto"/>
-            </w:pPr>
           </w:p>
         </w:tc>
       </w:tr>
       <w:tr>
         <w:tc>
           <w:tcPr>
-            <w:tcW w:type="dxa" w:w="3110"/>
+            <w:tcW w:type="dxa" w:w="3456"/>
           </w:tcPr>
           <w:p>
             <w:pPr>
@@ -11260,7 +11421,7 @@
             <w:r>
               <w:rPr>
                 <w:rFonts w:ascii="Times New Roman" w:hAnsi="Times New Roman"/>
-                <w:sz w:val="18"/>
+                <w:sz w:val="20"/>
               </w:rPr>
               <w:t xml:space="preserve">Pythia, step 103k to 143k</w:t>
             </w:r>
@@ -11268,18 +11429,18 @@
         </w:tc>
         <w:tc>
           <w:tcPr>
-            <w:tcW w:type="dxa" w:w="893"/>
-          </w:tcPr>
-          <w:p>
-            <w:pPr>
-              <w:pStyle w:val="Compact"/>
-              <w:spacing w:line="240" w:lineRule="auto"/>
-              <w:jc w:val="center"/>
-            </w:pPr>
-            <w:r>
-              <w:rPr>
-                <w:rFonts w:ascii="Times New Roman" w:hAnsi="Times New Roman"/>
-                <w:sz w:val="18"/>
+            <w:tcW w:type="dxa" w:w="984"/>
+          </w:tcPr>
+          <w:p>
+            <w:pPr>
+              <w:pStyle w:val="Compact"/>
+              <w:spacing w:line="240" w:lineRule="auto"/>
+              <w:jc w:val="center"/>
+            </w:pPr>
+            <w:r>
+              <w:rPr>
+                <w:rFonts w:ascii="Times New Roman" w:hAnsi="Times New Roman"/>
+                <w:sz w:val="20"/>
               </w:rPr>
               <w:t xml:space="preserve">0.895</w:t>
             </w:r>
@@ -11287,18 +11448,18 @@
         </w:tc>
         <w:tc>
           <w:tcPr>
-            <w:tcW w:type="dxa" w:w="893"/>
-          </w:tcPr>
-          <w:p>
-            <w:pPr>
-              <w:pStyle w:val="Compact"/>
-              <w:spacing w:line="240" w:lineRule="auto"/>
-              <w:jc w:val="center"/>
-            </w:pPr>
-            <w:r>
-              <w:rPr>
-                <w:rFonts w:ascii="Times New Roman" w:hAnsi="Times New Roman"/>
-                <w:sz w:val="18"/>
+            <w:tcW w:type="dxa" w:w="984"/>
+          </w:tcPr>
+          <w:p>
+            <w:pPr>
+              <w:pStyle w:val="Compact"/>
+              <w:spacing w:line="240" w:lineRule="auto"/>
+              <w:jc w:val="center"/>
+            </w:pPr>
+            <w:r>
+              <w:rPr>
+                <w:rFonts w:ascii="Times New Roman" w:hAnsi="Times New Roman"/>
+                <w:sz w:val="20"/>
               </w:rPr>
               <w:t xml:space="preserve">0.934</w:t>
             </w:r>
@@ -11306,18 +11467,18 @@
         </w:tc>
         <w:tc>
           <w:tcPr>
-            <w:tcW w:type="dxa" w:w="893"/>
-          </w:tcPr>
-          <w:p>
-            <w:pPr>
-              <w:pStyle w:val="Compact"/>
-              <w:spacing w:line="240" w:lineRule="auto"/>
-              <w:jc w:val="center"/>
-            </w:pPr>
-            <w:r>
-              <w:rPr>
-                <w:rFonts w:ascii="Times New Roman" w:hAnsi="Times New Roman"/>
-                <w:sz w:val="18"/>
+            <w:tcW w:type="dxa" w:w="984"/>
+          </w:tcPr>
+          <w:p>
+            <w:pPr>
+              <w:pStyle w:val="Compact"/>
+              <w:spacing w:line="240" w:lineRule="auto"/>
+              <w:jc w:val="center"/>
+            </w:pPr>
+            <w:r>
+              <w:rPr>
+                <w:rFonts w:ascii="Times New Roman" w:hAnsi="Times New Roman"/>
+                <w:sz w:val="20"/>
               </w:rPr>
               <w:t xml:space="preserve">0.36</w:t>
             </w:r>
@@ -11325,18 +11486,18 @@
         </w:tc>
         <w:tc>
           <w:tcPr>
-            <w:tcW w:type="dxa" w:w="893"/>
-          </w:tcPr>
-          <w:p>
-            <w:pPr>
-              <w:pStyle w:val="Compact"/>
-              <w:spacing w:line="240" w:lineRule="auto"/>
-              <w:jc w:val="center"/>
-            </w:pPr>
-            <w:r>
-              <w:rPr>
-                <w:rFonts w:ascii="Times New Roman" w:hAnsi="Times New Roman"/>
-                <w:sz w:val="18"/>
+            <w:tcW w:type="dxa" w:w="984"/>
+          </w:tcPr>
+          <w:p>
+            <w:pPr>
+              <w:pStyle w:val="Compact"/>
+              <w:spacing w:line="240" w:lineRule="auto"/>
+              <w:jc w:val="center"/>
+            </w:pPr>
+            <w:r>
+              <w:rPr>
+                <w:rFonts w:ascii="Times New Roman" w:hAnsi="Times New Roman"/>
+                <w:sz w:val="20"/>
               </w:rPr>
               <w:t xml:space="preserve">0.29</w:t>
             </w:r>
@@ -11344,18 +11505,18 @@
         </w:tc>
         <w:tc>
           <w:tcPr>
-            <w:tcW w:type="dxa" w:w="893"/>
-          </w:tcPr>
-          <w:p>
-            <w:pPr>
-              <w:pStyle w:val="Compact"/>
-              <w:spacing w:line="240" w:lineRule="auto"/>
-              <w:jc w:val="center"/>
-            </w:pPr>
-            <w:r>
-              <w:rPr>
-                <w:rFonts w:ascii="Times New Roman" w:hAnsi="Times New Roman"/>
-                <w:sz w:val="18"/>
+            <w:tcW w:type="dxa" w:w="984"/>
+          </w:tcPr>
+          <w:p>
+            <w:pPr>
+              <w:pStyle w:val="Compact"/>
+              <w:spacing w:line="240" w:lineRule="auto"/>
+              <w:jc w:val="center"/>
+            </w:pPr>
+            <w:r>
+              <w:rPr>
+                <w:rFonts w:ascii="Times New Roman" w:hAnsi="Times New Roman"/>
+                <w:sz w:val="20"/>
               </w:rPr>
               <w:t xml:space="preserve">23.3</w:t>
             </w:r>
@@ -11363,39 +11524,28 @@
         </w:tc>
         <w:tc>
           <w:tcPr>
-            <w:tcW w:type="dxa" w:w="893"/>
-          </w:tcPr>
-          <w:p>
-            <w:pPr>
-              <w:pStyle w:val="Compact"/>
-              <w:spacing w:line="240" w:lineRule="auto"/>
-              <w:jc w:val="center"/>
-            </w:pPr>
-            <w:r>
-              <w:rPr>
-                <w:rFonts w:ascii="Times New Roman" w:hAnsi="Times New Roman"/>
-                <w:sz w:val="18"/>
+            <w:tcW w:type="dxa" w:w="984"/>
+          </w:tcPr>
+          <w:p>
+            <w:pPr>
+              <w:pStyle w:val="Compact"/>
+              <w:spacing w:line="240" w:lineRule="auto"/>
+              <w:jc w:val="center"/>
+            </w:pPr>
+            <w:r>
+              <w:rPr>
+                <w:rFonts w:ascii="Times New Roman" w:hAnsi="Times New Roman"/>
+                <w:sz w:val="20"/>
               </w:rPr>
               <w:t xml:space="preserve">never</w:t>
             </w:r>
-          </w:p>
-        </w:tc>
-        <w:tc>
-          <w:tcPr>
-            <w:tcW w:type="dxa" w:w="893"/>
-          </w:tcPr>
-          <w:p>
-            <w:pPr>
-              <w:pStyle w:val="Compact"/>
-              <w:spacing w:line="240" w:lineRule="auto"/>
-            </w:pPr>
           </w:p>
         </w:tc>
       </w:tr>
       <w:tr>
         <w:tc>
           <w:tcPr>
-            <w:tcW w:type="dxa" w:w="3110"/>
+            <w:tcW w:type="dxa" w:w="3456"/>
           </w:tcPr>
           <w:p>
             <w:pPr>
@@ -11406,7 +11556,7 @@
             <w:r>
               <w:rPr>
                 <w:rFonts w:ascii="Times New Roman" w:hAnsi="Times New Roman"/>
-                <w:sz w:val="18"/>
+                <w:sz w:val="20"/>
               </w:rPr>
               <w:t xml:space="preserve">Pythia, step 83k to 143k</w:t>
             </w:r>
@@ -11414,18 +11564,18 @@
         </w:tc>
         <w:tc>
           <w:tcPr>
-            <w:tcW w:type="dxa" w:w="893"/>
-          </w:tcPr>
-          <w:p>
-            <w:pPr>
-              <w:pStyle w:val="Compact"/>
-              <w:spacing w:line="240" w:lineRule="auto"/>
-              <w:jc w:val="center"/>
-            </w:pPr>
-            <w:r>
-              <w:rPr>
-                <w:rFonts w:ascii="Times New Roman" w:hAnsi="Times New Roman"/>
-                <w:sz w:val="18"/>
+            <w:tcW w:type="dxa" w:w="984"/>
+          </w:tcPr>
+          <w:p>
+            <w:pPr>
+              <w:pStyle w:val="Compact"/>
+              <w:spacing w:line="240" w:lineRule="auto"/>
+              <w:jc w:val="center"/>
+            </w:pPr>
+            <w:r>
+              <w:rPr>
+                <w:rFonts w:ascii="Times New Roman" w:hAnsi="Times New Roman"/>
+                <w:sz w:val="20"/>
               </w:rPr>
               <w:t xml:space="preserve">0.554</w:t>
             </w:r>
@@ -11433,18 +11583,18 @@
         </w:tc>
         <w:tc>
           <w:tcPr>
-            <w:tcW w:type="dxa" w:w="893"/>
-          </w:tcPr>
-          <w:p>
-            <w:pPr>
-              <w:pStyle w:val="Compact"/>
-              <w:spacing w:line="240" w:lineRule="auto"/>
-              <w:jc w:val="center"/>
-            </w:pPr>
-            <w:r>
-              <w:rPr>
-                <w:rFonts w:ascii="Times New Roman" w:hAnsi="Times New Roman"/>
-                <w:sz w:val="18"/>
+            <w:tcW w:type="dxa" w:w="984"/>
+          </w:tcPr>
+          <w:p>
+            <w:pPr>
+              <w:pStyle w:val="Compact"/>
+              <w:spacing w:line="240" w:lineRule="auto"/>
+              <w:jc w:val="center"/>
+            </w:pPr>
+            <w:r>
+              <w:rPr>
+                <w:rFonts w:ascii="Times New Roman" w:hAnsi="Times New Roman"/>
+                <w:sz w:val="20"/>
               </w:rPr>
               <w:t xml:space="preserve">0.734</w:t>
             </w:r>
@@ -11452,18 +11602,18 @@
         </w:tc>
         <w:tc>
           <w:tcPr>
-            <w:tcW w:type="dxa" w:w="893"/>
-          </w:tcPr>
-          <w:p>
-            <w:pPr>
-              <w:pStyle w:val="Compact"/>
-              <w:spacing w:line="240" w:lineRule="auto"/>
-              <w:jc w:val="center"/>
-            </w:pPr>
-            <w:r>
-              <w:rPr>
-                <w:rFonts w:ascii="Times New Roman" w:hAnsi="Times New Roman"/>
-                <w:sz w:val="18"/>
+            <w:tcW w:type="dxa" w:w="984"/>
+          </w:tcPr>
+          <w:p>
+            <w:pPr>
+              <w:pStyle w:val="Compact"/>
+              <w:spacing w:line="240" w:lineRule="auto"/>
+              <w:jc w:val="center"/>
+            </w:pPr>
+            <w:r>
+              <w:rPr>
+                <w:rFonts w:ascii="Times New Roman" w:hAnsi="Times New Roman"/>
+                <w:sz w:val="20"/>
               </w:rPr>
               <w:t xml:space="preserve">0.35</w:t>
             </w:r>
@@ -11471,18 +11621,18 @@
         </w:tc>
         <w:tc>
           <w:tcPr>
-            <w:tcW w:type="dxa" w:w="893"/>
-          </w:tcPr>
-          <w:p>
-            <w:pPr>
-              <w:pStyle w:val="Compact"/>
-              <w:spacing w:line="240" w:lineRule="auto"/>
-              <w:jc w:val="center"/>
-            </w:pPr>
-            <w:r>
-              <w:rPr>
-                <w:rFonts w:ascii="Times New Roman" w:hAnsi="Times New Roman"/>
-                <w:sz w:val="18"/>
+            <w:tcW w:type="dxa" w:w="984"/>
+          </w:tcPr>
+          <w:p>
+            <w:pPr>
+              <w:pStyle w:val="Compact"/>
+              <w:spacing w:line="240" w:lineRule="auto"/>
+              <w:jc w:val="center"/>
+            </w:pPr>
+            <w:r>
+              <w:rPr>
+                <w:rFonts w:ascii="Times New Roman" w:hAnsi="Times New Roman"/>
+                <w:sz w:val="20"/>
               </w:rPr>
               <w:t xml:space="preserve">0.32</w:t>
             </w:r>
@@ -11490,18 +11640,18 @@
         </w:tc>
         <w:tc>
           <w:tcPr>
-            <w:tcW w:type="dxa" w:w="893"/>
-          </w:tcPr>
-          <w:p>
-            <w:pPr>
-              <w:pStyle w:val="Compact"/>
-              <w:spacing w:line="240" w:lineRule="auto"/>
-              <w:jc w:val="center"/>
-            </w:pPr>
-            <w:r>
-              <w:rPr>
-                <w:rFonts w:ascii="Times New Roman" w:hAnsi="Times New Roman"/>
-                <w:sz w:val="18"/>
+            <w:tcW w:type="dxa" w:w="984"/>
+          </w:tcPr>
+          <w:p>
+            <w:pPr>
+              <w:pStyle w:val="Compact"/>
+              <w:spacing w:line="240" w:lineRule="auto"/>
+              <w:jc w:val="center"/>
+            </w:pPr>
+            <w:r>
+              <w:rPr>
+                <w:rFonts w:ascii="Times New Roman" w:hAnsi="Times New Roman"/>
+                <w:sz w:val="20"/>
               </w:rPr>
               <w:t xml:space="preserve">5.5</w:t>
             </w:r>
@@ -11509,39 +11659,28 @@
         </w:tc>
         <w:tc>
           <w:tcPr>
-            <w:tcW w:type="dxa" w:w="893"/>
-          </w:tcPr>
-          <w:p>
-            <w:pPr>
-              <w:pStyle w:val="Compact"/>
-              <w:spacing w:line="240" w:lineRule="auto"/>
-              <w:jc w:val="center"/>
-            </w:pPr>
-            <w:r>
-              <w:rPr>
-                <w:rFonts w:ascii="Times New Roman" w:hAnsi="Times New Roman"/>
-                <w:sz w:val="18"/>
+            <w:tcW w:type="dxa" w:w="984"/>
+          </w:tcPr>
+          <w:p>
+            <w:pPr>
+              <w:pStyle w:val="Compact"/>
+              <w:spacing w:line="240" w:lineRule="auto"/>
+              <w:jc w:val="center"/>
+            </w:pPr>
+            <w:r>
+              <w:rPr>
+                <w:rFonts w:ascii="Times New Roman" w:hAnsi="Times New Roman"/>
+                <w:sz w:val="20"/>
               </w:rPr>
               <w:t xml:space="preserve">never</w:t>
             </w:r>
-          </w:p>
-        </w:tc>
-        <w:tc>
-          <w:tcPr>
-            <w:tcW w:type="dxa" w:w="893"/>
-          </w:tcPr>
-          <w:p>
-            <w:pPr>
-              <w:pStyle w:val="Compact"/>
-              <w:spacing w:line="240" w:lineRule="auto"/>
-            </w:pPr>
           </w:p>
         </w:tc>
       </w:tr>
       <w:tr>
         <w:tc>
           <w:tcPr>
-            <w:tcW w:type="dxa" w:w="3110"/>
+            <w:tcW w:type="dxa" w:w="3456"/>
           </w:tcPr>
           <w:p>
             <w:pPr>
@@ -11552,7 +11691,7 @@
             <w:r>
               <w:rPr>
                 <w:rFonts w:ascii="Times New Roman" w:hAnsi="Times New Roman"/>
-                <w:sz w:val="18"/>
+                <w:sz w:val="20"/>
               </w:rPr>
               <w:t xml:space="preserve">Pythia, step 73k to 143k (seed 0)</w:t>
             </w:r>
@@ -11560,18 +11699,18 @@
         </w:tc>
         <w:tc>
           <w:tcPr>
-            <w:tcW w:type="dxa" w:w="893"/>
-          </w:tcPr>
-          <w:p>
-            <w:pPr>
-              <w:pStyle w:val="Compact"/>
-              <w:spacing w:line="240" w:lineRule="auto"/>
-              <w:jc w:val="center"/>
-            </w:pPr>
-            <w:r>
-              <w:rPr>
-                <w:rFonts w:ascii="Times New Roman" w:hAnsi="Times New Roman"/>
-                <w:sz w:val="18"/>
+            <w:tcW w:type="dxa" w:w="984"/>
+          </w:tcPr>
+          <w:p>
+            <w:pPr>
+              <w:pStyle w:val="Compact"/>
+              <w:spacing w:line="240" w:lineRule="auto"/>
+              <w:jc w:val="center"/>
+            </w:pPr>
+            <w:r>
+              <w:rPr>
+                <w:rFonts w:ascii="Times New Roman" w:hAnsi="Times New Roman"/>
+                <w:sz w:val="20"/>
               </w:rPr>
               <w:t xml:space="preserve">0.319</w:t>
             </w:r>
@@ -11579,18 +11718,18 @@
         </w:tc>
         <w:tc>
           <w:tcPr>
-            <w:tcW w:type="dxa" w:w="893"/>
-          </w:tcPr>
-          <w:p>
-            <w:pPr>
-              <w:pStyle w:val="Compact"/>
-              <w:spacing w:line="240" w:lineRule="auto"/>
-              <w:jc w:val="center"/>
-            </w:pPr>
-            <w:r>
-              <w:rPr>
-                <w:rFonts w:ascii="Times New Roman" w:hAnsi="Times New Roman"/>
-                <w:sz w:val="18"/>
+            <w:tcW w:type="dxa" w:w="984"/>
+          </w:tcPr>
+          <w:p>
+            <w:pPr>
+              <w:pStyle w:val="Compact"/>
+              <w:spacing w:line="240" w:lineRule="auto"/>
+              <w:jc w:val="center"/>
+            </w:pPr>
+            <w:r>
+              <w:rPr>
+                <w:rFonts w:ascii="Times New Roman" w:hAnsi="Times New Roman"/>
+                <w:sz w:val="20"/>
               </w:rPr>
               <w:t xml:space="preserve">0.717</w:t>
             </w:r>
@@ -11598,18 +11737,18 @@
         </w:tc>
         <w:tc>
           <w:tcPr>
-            <w:tcW w:type="dxa" w:w="893"/>
-          </w:tcPr>
-          <w:p>
-            <w:pPr>
-              <w:pStyle w:val="Compact"/>
-              <w:spacing w:line="240" w:lineRule="auto"/>
-              <w:jc w:val="center"/>
-            </w:pPr>
-            <w:r>
-              <w:rPr>
-                <w:rFonts w:ascii="Times New Roman" w:hAnsi="Times New Roman"/>
-                <w:sz w:val="18"/>
+            <w:tcW w:type="dxa" w:w="984"/>
+          </w:tcPr>
+          <w:p>
+            <w:pPr>
+              <w:pStyle w:val="Compact"/>
+              <w:spacing w:line="240" w:lineRule="auto"/>
+              <w:jc w:val="center"/>
+            </w:pPr>
+            <w:r>
+              <w:rPr>
+                <w:rFonts w:ascii="Times New Roman" w:hAnsi="Times New Roman"/>
+                <w:sz w:val="20"/>
               </w:rPr>
               <w:t xml:space="preserve">0.36</w:t>
             </w:r>
@@ -11617,18 +11756,18 @@
         </w:tc>
         <w:tc>
           <w:tcPr>
-            <w:tcW w:type="dxa" w:w="893"/>
-          </w:tcPr>
-          <w:p>
-            <w:pPr>
-              <w:pStyle w:val="Compact"/>
-              <w:spacing w:line="240" w:lineRule="auto"/>
-              <w:jc w:val="center"/>
-            </w:pPr>
-            <w:r>
-              <w:rPr>
-                <w:rFonts w:ascii="Times New Roman" w:hAnsi="Times New Roman"/>
-                <w:sz w:val="18"/>
+            <w:tcW w:type="dxa" w:w="984"/>
+          </w:tcPr>
+          <w:p>
+            <w:pPr>
+              <w:pStyle w:val="Compact"/>
+              <w:spacing w:line="240" w:lineRule="auto"/>
+              <w:jc w:val="center"/>
+            </w:pPr>
+            <w:r>
+              <w:rPr>
+                <w:rFonts w:ascii="Times New Roman" w:hAnsi="Times New Roman"/>
+                <w:sz w:val="20"/>
               </w:rPr>
               <w:t xml:space="preserve">0.50</w:t>
             </w:r>
@@ -11636,18 +11775,18 @@
         </w:tc>
         <w:tc>
           <w:tcPr>
-            <w:tcW w:type="dxa" w:w="893"/>
-          </w:tcPr>
-          <w:p>
-            <w:pPr>
-              <w:pStyle w:val="Compact"/>
-              <w:spacing w:line="240" w:lineRule="auto"/>
-              <w:jc w:val="center"/>
-            </w:pPr>
-            <w:r>
-              <w:rPr>
-                <w:rFonts w:ascii="Times New Roman" w:hAnsi="Times New Roman"/>
-                <w:sz w:val="18"/>
+            <w:tcW w:type="dxa" w:w="984"/>
+          </w:tcPr>
+          <w:p>
+            <w:pPr>
+              <w:pStyle w:val="Compact"/>
+              <w:spacing w:line="240" w:lineRule="auto"/>
+              <w:jc w:val="center"/>
+            </w:pPr>
+            <w:r>
+              <w:rPr>
+                <w:rFonts w:ascii="Times New Roman" w:hAnsi="Times New Roman"/>
+                <w:sz w:val="20"/>
               </w:rPr>
               <w:t xml:space="preserve">3.6</w:t>
             </w:r>
@@ -11655,39 +11794,28 @@
         </w:tc>
         <w:tc>
           <w:tcPr>
-            <w:tcW w:type="dxa" w:w="893"/>
-          </w:tcPr>
-          <w:p>
-            <w:pPr>
-              <w:pStyle w:val="Compact"/>
-              <w:spacing w:line="240" w:lineRule="auto"/>
-              <w:jc w:val="center"/>
-            </w:pPr>
-            <w:r>
-              <w:rPr>
-                <w:rFonts w:ascii="Times New Roman" w:hAnsi="Times New Roman"/>
-                <w:sz w:val="18"/>
+            <w:tcW w:type="dxa" w:w="984"/>
+          </w:tcPr>
+          <w:p>
+            <w:pPr>
+              <w:pStyle w:val="Compact"/>
+              <w:spacing w:line="240" w:lineRule="auto"/>
+              <w:jc w:val="center"/>
+            </w:pPr>
+            <w:r>
+              <w:rPr>
+                <w:rFonts w:ascii="Times New Roman" w:hAnsi="Times New Roman"/>
+                <w:sz w:val="20"/>
               </w:rPr>
               <w:t xml:space="preserve">[1.78, 4.40)</w:t>
             </w:r>
-          </w:p>
-        </w:tc>
-        <w:tc>
-          <w:tcPr>
-            <w:tcW w:type="dxa" w:w="893"/>
-          </w:tcPr>
-          <w:p>
-            <w:pPr>
-              <w:pStyle w:val="Compact"/>
-              <w:spacing w:line="240" w:lineRule="auto"/>
-            </w:pPr>
           </w:p>
         </w:tc>
       </w:tr>
       <w:tr>
         <w:tc>
           <w:tcPr>
-            <w:tcW w:type="dxa" w:w="3110"/>
+            <w:tcW w:type="dxa" w:w="3456"/>
           </w:tcPr>
           <w:p>
             <w:pPr>
@@ -11698,7 +11826,7 @@
             <w:r>
               <w:rPr>
                 <w:rFonts w:ascii="Times New Roman" w:hAnsi="Times New Roman"/>
-                <w:sz w:val="18"/>
+                <w:sz w:val="20"/>
               </w:rPr>
               <w:t xml:space="preserve">Pythia, step 73k to 143k (seed 1)</w:t>
             </w:r>
@@ -11706,18 +11834,18 @@
         </w:tc>
         <w:tc>
           <w:tcPr>
-            <w:tcW w:type="dxa" w:w="893"/>
-          </w:tcPr>
-          <w:p>
-            <w:pPr>
-              <w:pStyle w:val="Compact"/>
-              <w:spacing w:line="240" w:lineRule="auto"/>
-              <w:jc w:val="center"/>
-            </w:pPr>
-            <w:r>
-              <w:rPr>
-                <w:rFonts w:ascii="Times New Roman" w:hAnsi="Times New Roman"/>
-                <w:sz w:val="18"/>
+            <w:tcW w:type="dxa" w:w="984"/>
+          </w:tcPr>
+          <w:p>
+            <w:pPr>
+              <w:pStyle w:val="Compact"/>
+              <w:spacing w:line="240" w:lineRule="auto"/>
+              <w:jc w:val="center"/>
+            </w:pPr>
+            <w:r>
+              <w:rPr>
+                <w:rFonts w:ascii="Times New Roman" w:hAnsi="Times New Roman"/>
+                <w:sz w:val="20"/>
               </w:rPr>
               <w:t xml:space="preserve">0.359</w:t>
             </w:r>
@@ -11725,18 +11853,18 @@
         </w:tc>
         <w:tc>
           <w:tcPr>
-            <w:tcW w:type="dxa" w:w="893"/>
-          </w:tcPr>
-          <w:p>
-            <w:pPr>
-              <w:pStyle w:val="Compact"/>
-              <w:spacing w:line="240" w:lineRule="auto"/>
-              <w:jc w:val="center"/>
-            </w:pPr>
-            <w:r>
-              <w:rPr>
-                <w:rFonts w:ascii="Times New Roman" w:hAnsi="Times New Roman"/>
-                <w:sz w:val="18"/>
+            <w:tcW w:type="dxa" w:w="984"/>
+          </w:tcPr>
+          <w:p>
+            <w:pPr>
+              <w:pStyle w:val="Compact"/>
+              <w:spacing w:line="240" w:lineRule="auto"/>
+              <w:jc w:val="center"/>
+            </w:pPr>
+            <w:r>
+              <w:rPr>
+                <w:rFonts w:ascii="Times New Roman" w:hAnsi="Times New Roman"/>
+                <w:sz w:val="20"/>
               </w:rPr>
               <w:t xml:space="preserve">0.692</w:t>
             </w:r>
@@ -11744,18 +11872,18 @@
         </w:tc>
         <w:tc>
           <w:tcPr>
-            <w:tcW w:type="dxa" w:w="893"/>
-          </w:tcPr>
-          <w:p>
-            <w:pPr>
-              <w:pStyle w:val="Compact"/>
-              <w:spacing w:line="240" w:lineRule="auto"/>
-              <w:jc w:val="center"/>
-            </w:pPr>
-            <w:r>
-              <w:rPr>
-                <w:rFonts w:ascii="Times New Roman" w:hAnsi="Times New Roman"/>
-                <w:sz w:val="18"/>
+            <w:tcW w:type="dxa" w:w="984"/>
+          </w:tcPr>
+          <w:p>
+            <w:pPr>
+              <w:pStyle w:val="Compact"/>
+              <w:spacing w:line="240" w:lineRule="auto"/>
+              <w:jc w:val="center"/>
+            </w:pPr>
+            <w:r>
+              <w:rPr>
+                <w:rFonts w:ascii="Times New Roman" w:hAnsi="Times New Roman"/>
+                <w:sz w:val="20"/>
               </w:rPr>
               <w:t xml:space="preserve">0.30</w:t>
             </w:r>
@@ -11763,18 +11891,18 @@
         </w:tc>
         <w:tc>
           <w:tcPr>
-            <w:tcW w:type="dxa" w:w="893"/>
-          </w:tcPr>
-          <w:p>
-            <w:pPr>
-              <w:pStyle w:val="Compact"/>
-              <w:spacing w:line="240" w:lineRule="auto"/>
-              <w:jc w:val="center"/>
-            </w:pPr>
-            <w:r>
-              <w:rPr>
-                <w:rFonts w:ascii="Times New Roman" w:hAnsi="Times New Roman"/>
-                <w:sz w:val="18"/>
+            <w:tcW w:type="dxa" w:w="984"/>
+          </w:tcPr>
+          <w:p>
+            <w:pPr>
+              <w:pStyle w:val="Compact"/>
+              <w:spacing w:line="240" w:lineRule="auto"/>
+              <w:jc w:val="center"/>
+            </w:pPr>
+            <w:r>
+              <w:rPr>
+                <w:rFonts w:ascii="Times New Roman" w:hAnsi="Times New Roman"/>
+                <w:sz w:val="20"/>
               </w:rPr>
               <w:t xml:space="preserve">0.43</w:t>
             </w:r>
@@ -11782,18 +11910,18 @@
         </w:tc>
         <w:tc>
           <w:tcPr>
-            <w:tcW w:type="dxa" w:w="893"/>
-          </w:tcPr>
-          <w:p>
-            <w:pPr>
-              <w:pStyle w:val="Compact"/>
-              <w:spacing w:line="240" w:lineRule="auto"/>
-              <w:jc w:val="center"/>
-            </w:pPr>
-            <w:r>
-              <w:rPr>
-                <w:rFonts w:ascii="Times New Roman" w:hAnsi="Times New Roman"/>
-                <w:sz w:val="18"/>
+            <w:tcW w:type="dxa" w:w="984"/>
+          </w:tcPr>
+          <w:p>
+            <w:pPr>
+              <w:pStyle w:val="Compact"/>
+              <w:spacing w:line="240" w:lineRule="auto"/>
+              <w:jc w:val="center"/>
+            </w:pPr>
+            <w:r>
+              <w:rPr>
+                <w:rFonts w:ascii="Times New Roman" w:hAnsi="Times New Roman"/>
+                <w:sz w:val="20"/>
               </w:rPr>
               <w:t xml:space="preserve">3.8</w:t>
             </w:r>
@@ -11801,39 +11929,28 @@
         </w:tc>
         <w:tc>
           <w:tcPr>
-            <w:tcW w:type="dxa" w:w="893"/>
-          </w:tcPr>
-          <w:p>
-            <w:pPr>
-              <w:pStyle w:val="Compact"/>
-              <w:spacing w:line="240" w:lineRule="auto"/>
-              <w:jc w:val="center"/>
-            </w:pPr>
-            <w:r>
-              <w:rPr>
-                <w:rFonts w:ascii="Times New Roman" w:hAnsi="Times New Roman"/>
-                <w:sz w:val="18"/>
+            <w:tcW w:type="dxa" w:w="984"/>
+          </w:tcPr>
+          <w:p>
+            <w:pPr>
+              <w:pStyle w:val="Compact"/>
+              <w:spacing w:line="240" w:lineRule="auto"/>
+              <w:jc w:val="center"/>
+            </w:pPr>
+            <w:r>
+              <w:rPr>
+                <w:rFonts w:ascii="Times New Roman" w:hAnsi="Times New Roman"/>
+                <w:sz w:val="20"/>
               </w:rPr>
               <w:t xml:space="preserve">[1.73, 4.49)</w:t>
             </w:r>
-          </w:p>
-        </w:tc>
-        <w:tc>
-          <w:tcPr>
-            <w:tcW w:type="dxa" w:w="893"/>
-          </w:tcPr>
-          <w:p>
-            <w:pPr>
-              <w:pStyle w:val="Compact"/>
-              <w:spacing w:line="240" w:lineRule="auto"/>
-            </w:pPr>
           </w:p>
         </w:tc>
       </w:tr>
       <w:tr>
         <w:tc>
           <w:tcPr>
-            <w:tcW w:type="dxa" w:w="3110"/>
+            <w:tcW w:type="dxa" w:w="3456"/>
           </w:tcPr>
           <w:p>
             <w:pPr>
@@ -11844,7 +11961,7 @@
             <w:r>
               <w:rPr>
                 <w:rFonts w:ascii="Times New Roman" w:hAnsi="Times New Roman"/>
-                <w:sz w:val="18"/>
+                <w:sz w:val="20"/>
               </w:rPr>
               <w:t xml:space="preserve">SmolLM2-360M, base to instruct</w:t>
             </w:r>
@@ -11852,18 +11969,18 @@
         </w:tc>
         <w:tc>
           <w:tcPr>
-            <w:tcW w:type="dxa" w:w="893"/>
-          </w:tcPr>
-          <w:p>
-            <w:pPr>
-              <w:pStyle w:val="Compact"/>
-              <w:spacing w:line="240" w:lineRule="auto"/>
-              <w:jc w:val="center"/>
-            </w:pPr>
-            <w:r>
-              <w:rPr>
-                <w:rFonts w:ascii="Times New Roman" w:hAnsi="Times New Roman"/>
-                <w:sz w:val="18"/>
+            <w:tcW w:type="dxa" w:w="984"/>
+          </w:tcPr>
+          <w:p>
+            <w:pPr>
+              <w:pStyle w:val="Compact"/>
+              <w:spacing w:line="240" w:lineRule="auto"/>
+              <w:jc w:val="center"/>
+            </w:pPr>
+            <w:r>
+              <w:rPr>
+                <w:rFonts w:ascii="Times New Roman" w:hAnsi="Times New Roman"/>
+                <w:sz w:val="20"/>
               </w:rPr>
               <w:t xml:space="preserve">0.706</w:t>
             </w:r>
@@ -11871,18 +11988,18 @@
         </w:tc>
         <w:tc>
           <w:tcPr>
-            <w:tcW w:type="dxa" w:w="893"/>
-          </w:tcPr>
-          <w:p>
-            <w:pPr>
-              <w:pStyle w:val="Compact"/>
-              <w:spacing w:line="240" w:lineRule="auto"/>
-              <w:jc w:val="center"/>
-            </w:pPr>
-            <w:r>
-              <w:rPr>
-                <w:rFonts w:ascii="Times New Roman" w:hAnsi="Times New Roman"/>
-                <w:sz w:val="18"/>
+            <w:tcW w:type="dxa" w:w="984"/>
+          </w:tcPr>
+          <w:p>
+            <w:pPr>
+              <w:pStyle w:val="Compact"/>
+              <w:spacing w:line="240" w:lineRule="auto"/>
+              <w:jc w:val="center"/>
+            </w:pPr>
+            <w:r>
+              <w:rPr>
+                <w:rFonts w:ascii="Times New Roman" w:hAnsi="Times New Roman"/>
+                <w:sz w:val="20"/>
               </w:rPr>
               <w:t xml:space="preserve">0.700</w:t>
             </w:r>
@@ -11890,18 +12007,18 @@
         </w:tc>
         <w:tc>
           <w:tcPr>
-            <w:tcW w:type="dxa" w:w="893"/>
-          </w:tcPr>
-          <w:p>
-            <w:pPr>
-              <w:pStyle w:val="Compact"/>
-              <w:spacing w:line="240" w:lineRule="auto"/>
-              <w:jc w:val="center"/>
-            </w:pPr>
-            <w:r>
-              <w:rPr>
-                <w:rFonts w:ascii="Times New Roman" w:hAnsi="Times New Roman"/>
-                <w:sz w:val="18"/>
+            <w:tcW w:type="dxa" w:w="984"/>
+          </w:tcPr>
+          <w:p>
+            <w:pPr>
+              <w:pStyle w:val="Compact"/>
+              <w:spacing w:line="240" w:lineRule="auto"/>
+              <w:jc w:val="center"/>
+            </w:pPr>
+            <w:r>
+              <w:rPr>
+                <w:rFonts w:ascii="Times New Roman" w:hAnsi="Times New Roman"/>
+                <w:sz w:val="20"/>
               </w:rPr>
               <w:t xml:space="preserve">0.65</w:t>
             </w:r>
@@ -11909,18 +12026,18 @@
         </w:tc>
         <w:tc>
           <w:tcPr>
-            <w:tcW w:type="dxa" w:w="893"/>
-          </w:tcPr>
-          <w:p>
-            <w:pPr>
-              <w:pStyle w:val="Compact"/>
-              <w:spacing w:line="240" w:lineRule="auto"/>
-              <w:jc w:val="center"/>
-            </w:pPr>
-            <w:r>
-              <w:rPr>
-                <w:rFonts w:ascii="Times New Roman" w:hAnsi="Times New Roman"/>
-                <w:sz w:val="18"/>
+            <w:tcW w:type="dxa" w:w="984"/>
+          </w:tcPr>
+          <w:p>
+            <w:pPr>
+              <w:pStyle w:val="Compact"/>
+              <w:spacing w:line="240" w:lineRule="auto"/>
+              <w:jc w:val="center"/>
+            </w:pPr>
+            <w:r>
+              <w:rPr>
+                <w:rFonts w:ascii="Times New Roman" w:hAnsi="Times New Roman"/>
+                <w:sz w:val="20"/>
               </w:rPr>
               <w:t xml:space="preserve">0.00</w:t>
             </w:r>
@@ -11928,18 +12045,18 @@
         </w:tc>
         <w:tc>
           <w:tcPr>
-            <w:tcW w:type="dxa" w:w="893"/>
-          </w:tcPr>
-          <w:p>
-            <w:pPr>
-              <w:pStyle w:val="Compact"/>
-              <w:spacing w:line="240" w:lineRule="auto"/>
-              <w:jc w:val="center"/>
-            </w:pPr>
-            <w:r>
-              <w:rPr>
-                <w:rFonts w:ascii="Times New Roman" w:hAnsi="Times New Roman"/>
-                <w:sz w:val="18"/>
+            <w:tcW w:type="dxa" w:w="984"/>
+          </w:tcPr>
+          <w:p>
+            <w:pPr>
+              <w:pStyle w:val="Compact"/>
+              <w:spacing w:line="240" w:lineRule="auto"/>
+              <w:jc w:val="center"/>
+            </w:pPr>
+            <w:r>
+              <w:rPr>
+                <w:rFonts w:ascii="Times New Roman" w:hAnsi="Times New Roman"/>
+                <w:sz w:val="20"/>
               </w:rPr>
               <w:t xml:space="preserve">8.4</w:t>
             </w:r>
@@ -11947,32 +12064,21 @@
         </w:tc>
         <w:tc>
           <w:tcPr>
-            <w:tcW w:type="dxa" w:w="893"/>
-          </w:tcPr>
-          <w:p>
-            <w:pPr>
-              <w:pStyle w:val="Compact"/>
-              <w:spacing w:line="240" w:lineRule="auto"/>
-              <w:jc w:val="center"/>
-            </w:pPr>
-            <w:r>
-              <w:rPr>
-                <w:rFonts w:ascii="Times New Roman" w:hAnsi="Times New Roman"/>
-                <w:sz w:val="18"/>
+            <w:tcW w:type="dxa" w:w="984"/>
+          </w:tcPr>
+          <w:p>
+            <w:pPr>
+              <w:pStyle w:val="Compact"/>
+              <w:spacing w:line="240" w:lineRule="auto"/>
+              <w:jc w:val="center"/>
+            </w:pPr>
+            <w:r>
+              <w:rPr>
+                <w:rFonts w:ascii="Times New Roman" w:hAnsi="Times New Roman"/>
+                <w:sz w:val="20"/>
               </w:rPr>
               <w:t xml:space="preserve">never</w:t>
             </w:r>
-          </w:p>
-        </w:tc>
-        <w:tc>
-          <w:tcPr>
-            <w:tcW w:type="dxa" w:w="893"/>
-          </w:tcPr>
-          <w:p>
-            <w:pPr>
-              <w:pStyle w:val="Compact"/>
-              <w:spacing w:line="240" w:lineRule="auto"/>
-            </w:pPr>
           </w:p>
         </w:tc>
       </w:tr>
@@ -12358,6 +12464,1094 @@
       </w:r>
       <w:r>
         <w:t xml:space="preserve">and raises every threshold.</w:t>
+      </w:r>
+    </w:p>
+    <w:p>
+      <w:pPr>
+        <w:pStyle w:val="BodyText"/>
+      </w:pPr>
+      <w:r>
+        <w:rPr>
+          <w:bCs/>
+          <w:b/>
+        </w:rPr>
+        <w:t xml:space="preserve">Model size.</w:t>
+      </w:r>
+      <w:r>
+        <w:t xml:space="preserve"> </w:t>
+      </w:r>
+      <w:r>
+        <w:t xml:space="preserve">To check whether the pattern depends on scale, we repeat the smallest, a medium, and the largest upgrade at 70 million parameters, and the largest upgrade at 410 million parameters (Table 6); the 160-million row is repeated for comparison.</w:t>
+      </w:r>
+      <w:r>
+        <w:t xml:space="preserve"> </w:t>
+      </w:r>
+      <w:r>
+        <w:t xml:space="preserve">The shape repeats at 70 million: copy recovery falls from 0.972 to 0.933 to 0.621 as the drift rises from 0.25 to 0.32 to 0.49, and ACT’s gain rises from</w:t>
+      </w:r>
+      <w:r>
+        <w:t xml:space="preserve"> </w:t>
+      </w:r>
+      <m:oMath>
+        <m:r>
+          <m:rPr>
+            <m:sty m:val="p"/>
+          </m:rPr>
+          <m:t>+</m:t>
+        </m:r>
+        <m:r>
+          <m:t>0.002</m:t>
+        </m:r>
+      </m:oMath>
+      <w:r>
+        <w:t xml:space="preserve"> </w:t>
+      </w:r>
+      <w:r>
+        <w:t xml:space="preserve">to</w:t>
+      </w:r>
+      <w:r>
+        <w:t xml:space="preserve"> </w:t>
+      </w:r>
+      <m:oMath>
+        <m:r>
+          <m:rPr>
+            <m:sty m:val="p"/>
+          </m:rPr>
+          <m:t>+</m:t>
+        </m:r>
+        <m:r>
+          <m:t>0.026</m:t>
+        </m:r>
+      </m:oMath>
+      <w:r>
+        <w:t xml:space="preserve"> </w:t>
+      </w:r>
+      <w:r>
+        <w:t xml:space="preserve">to</w:t>
+      </w:r>
+      <w:r>
+        <w:t xml:space="preserve"> </w:t>
+      </w:r>
+      <m:oMath>
+        <m:r>
+          <m:rPr>
+            <m:sty m:val="p"/>
+          </m:rPr>
+          <m:t>+</m:t>
+        </m:r>
+        <m:r>
+          <m:t>0.171</m:t>
+        </m:r>
+      </m:oMath>
+      <w:r>
+        <w:t xml:space="preserve">. ACT is cheaper relative to retraining at this size (0.14 to 0.16), so it already pays after the medium upgrade, for adapter values between about 12 and 42 times</w:t>
+      </w:r>
+      <w:r>
+        <w:t xml:space="preserve"> </w:t>
+      </w:r>
+      <m:oMath>
+        <m:sSub>
+          <m:e>
+            <m:r>
+              <m:t>C</m:t>
+            </m:r>
+          </m:e>
+          <m:sub>
+            <m:r>
+              <m:t>N</m:t>
+            </m:r>
+          </m:sub>
+        </m:sSub>
+      </m:oMath>
+      <w:r>
+        <w:t xml:space="preserve">, and over a range of 1.6 to 8.4 after the largest.</w:t>
+      </w:r>
+      <w:r>
+        <w:t xml:space="preserve"> </w:t>
+      </w:r>
+      <w:r>
+        <w:t xml:space="preserve">At 410 million parameters ACT again improves on copying after the largest upgrade (recovery 0.63 against 0.47, a gain of 0.16), but its compute time relative to retraining has risen to 0.70, so the gain is smaller than the break-even (</w:t>
+      </w:r>
+      <m:oMath>
+        <m:r>
+          <m:t>Γ</m:t>
+        </m:r>
+        <m:r>
+          <m:rPr>
+            <m:sty m:val="p"/>
+          </m:rPr>
+          <m:t>=</m:t>
+        </m:r>
+        <m:r>
+          <m:t>0.23</m:t>
+        </m:r>
+      </m:oMath>
+      <w:r>
+        <w:t xml:space="preserve"> </w:t>
+      </w:r>
+      <w:r>
+        <w:t xml:space="preserve">against</w:t>
+      </w:r>
+      <w:r>
+        <w:t xml:space="preserve"> </w:t>
+      </w:r>
+      <m:oMath>
+        <m:sSub>
+          <m:e>
+            <m:r>
+              <m:t>C</m:t>
+            </m:r>
+          </m:e>
+          <m:sub>
+            <m:r>
+              <m:t>A</m:t>
+            </m:r>
+          </m:sub>
+        </m:sSub>
+        <m:r>
+          <m:rPr>
+            <m:sty m:val="p"/>
+          </m:rPr>
+          <m:t>=</m:t>
+        </m:r>
+        <m:r>
+          <m:t>0.70</m:t>
+        </m:r>
+      </m:oMath>
+      <w:r>
+        <w:t xml:space="preserve">) and ACT is never the cost-minimizing policy.</w:t>
+      </w:r>
+    </w:p>
+    <w:p>
+      <w:pPr>
+        <w:pStyle w:val="TableCaption"/>
+      </w:pPr>
+      <w:r>
+        <w:t xml:space="preserve">The same pattern at three model sizes (Pythia; step 73k to 143k unless noted). Cost ratio is compute time of ACT over compute time of retraining;</w:t>
+      </w:r>
+      <w:r>
+        <w:t xml:space="preserve"> </w:t>
+      </w:r>
+      <m:oMath>
+        <m:r>
+          <m:t>Γ</m:t>
+        </m:r>
+      </m:oMath>
+      <w:r>
+        <w:t xml:space="preserve"> </w:t>
+      </w:r>
+      <w:r>
+        <w:t xml:space="preserve">and ACT-optimal range use each run’s own cost ratio.</w:t>
+      </w:r>
+    </w:p>
+    <w:tbl>
+      <w:tblPr>
+        <w:tblStyle w:val="Table"/>
+        <w:tblW w:type="dxa" w:w="9360"/>
+        <w:tblLook w:firstRow="1" w:lastRow="0" w:firstColumn="0" w:lastColumn="0" w:noHBand="0" w:noVBand="0" w:val="0020"/>
+        <w:jc w:val="start"/>
+        <w:tblCaption w:val="The same pattern at three model sizes (Pythia; step 73k to 143k unless noted). Cost ratio is compute time of ACT over compute time of retraining; \Gamma and ACT-optimal range use each run’s own cost ratio."/>
+        <w:tblLayout w:type="fixed"/>
+        <w:tblBorders>
+          <w:top w:val="single" w:sz="12" w:color="000000"/>
+          <w:bottom w:val="single" w:sz="12" w:color="000000"/>
+        </w:tblBorders>
+      </w:tblPr>
+      <w:tblGrid>
+        <w:gridCol w:w="3456"/>
+        <w:gridCol w:w="983"/>
+        <w:gridCol w:w="983"/>
+        <w:gridCol w:w="983"/>
+        <w:gridCol w:w="983"/>
+        <w:gridCol w:w="983"/>
+        <w:gridCol w:w="983"/>
+      </w:tblGrid>
+      <w:tr>
+        <w:trPr>
+          <w:tblHeader w:val="true"/>
+        </w:trPr>
+        <w:tc>
+          <w:tcPr>
+            <w:tcW w:type="dxa" w:w="3456"/>
+            <w:tcBorders>
+              <w:bottom w:val="single" w:sz="6" w:color="000000"/>
+            </w:tcBorders>
+          </w:tcPr>
+          <w:p>
+            <w:pPr>
+              <w:pStyle w:val="Compact"/>
+              <w:spacing w:line="240" w:lineRule="auto"/>
+              <w:jc w:val="left"/>
+            </w:pPr>
+            <w:r>
+              <w:rPr>
+                <w:rFonts w:ascii="Times New Roman" w:hAnsi="Times New Roman"/>
+                <w:sz w:val="20"/>
+              </w:rPr>
+              <w:t xml:space="preserve">Model and upgrade</w:t>
+            </w:r>
+          </w:p>
+        </w:tc>
+        <w:tc>
+          <w:tcPr>
+            <w:tcW w:type="dxa" w:w="984"/>
+            <w:tcBorders>
+              <w:bottom w:val="single" w:sz="6" w:color="000000"/>
+            </w:tcBorders>
+          </w:tcPr>
+          <w:p>
+            <w:pPr>
+              <w:pStyle w:val="Compact"/>
+              <w:spacing w:line="240" w:lineRule="auto"/>
+              <w:jc w:val="center"/>
+            </w:pPr>
+            <w:r>
+              <w:rPr>
+                <w:rFonts w:ascii="Times New Roman" w:hAnsi="Times New Roman"/>
+                <w:sz w:val="20"/>
+              </w:rPr>
+              <w:t xml:space="preserve">Drift</w:t>
+            </w:r>
+          </w:p>
+        </w:tc>
+        <w:tc>
+          <w:tcPr>
+            <w:tcW w:type="dxa" w:w="984"/>
+            <w:tcBorders>
+              <w:bottom w:val="single" w:sz="6" w:color="000000"/>
+            </w:tcBorders>
+          </w:tcPr>
+          <w:p>
+            <w:pPr>
+              <w:pStyle w:val="Compact"/>
+              <w:spacing w:line="240" w:lineRule="auto"/>
+              <w:jc w:val="center"/>
+            </w:pPr>
+            <w:r>
+              <w:rPr>
+                <w:rFonts w:ascii="Times New Roman" w:hAnsi="Times New Roman"/>
+                <w:sz w:val="20"/>
+              </w:rPr>
+              <w:t xml:space="preserve">R</w:t>
+            </w:r>
+            <w:r>
+              <w:rPr>
+                <w:rFonts w:ascii="Times New Roman" w:hAnsi="Times New Roman"/>
+                <w:sz w:val="20"/>
+                <w:vertAlign w:val="subscript"/>
+              </w:rPr>
+              <w:t xml:space="preserve">C</w:t>
+            </w:r>
+          </w:p>
+        </w:tc>
+        <w:tc>
+          <w:tcPr>
+            <w:tcW w:type="dxa" w:w="984"/>
+            <w:tcBorders>
+              <w:bottom w:val="single" w:sz="6" w:color="000000"/>
+            </w:tcBorders>
+          </w:tcPr>
+          <w:p>
+            <w:pPr>
+              <w:pStyle w:val="Compact"/>
+              <w:spacing w:line="240" w:lineRule="auto"/>
+              <w:jc w:val="center"/>
+            </w:pPr>
+            <w:r>
+              <w:rPr>
+                <w:rFonts w:ascii="Times New Roman" w:hAnsi="Times New Roman"/>
+                <w:sz w:val="20"/>
+              </w:rPr>
+              <w:t xml:space="preserve">R</w:t>
+            </w:r>
+            <w:r>
+              <w:rPr>
+                <w:rFonts w:ascii="Times New Roman" w:hAnsi="Times New Roman"/>
+                <w:sz w:val="20"/>
+                <w:vertAlign w:val="subscript"/>
+              </w:rPr>
+              <w:t xml:space="preserve">A</w:t>
+            </w:r>
+          </w:p>
+        </w:tc>
+        <w:tc>
+          <w:tcPr>
+            <w:tcW w:type="dxa" w:w="984"/>
+            <w:tcBorders>
+              <w:bottom w:val="single" w:sz="6" w:color="000000"/>
+            </w:tcBorders>
+          </w:tcPr>
+          <w:p>
+            <w:pPr>
+              <w:pStyle w:val="Compact"/>
+              <w:spacing w:line="240" w:lineRule="auto"/>
+              <w:jc w:val="center"/>
+            </w:pPr>
+            <w:r>
+              <w:rPr>
+                <w:rFonts w:ascii="Times New Roman" w:hAnsi="Times New Roman"/>
+                <w:sz w:val="20"/>
+              </w:rPr>
+              <w:t xml:space="preserve">C</w:t>
+            </w:r>
+            <w:r>
+              <w:rPr>
+                <w:rFonts w:ascii="Times New Roman" w:hAnsi="Times New Roman"/>
+                <w:sz w:val="20"/>
+                <w:vertAlign w:val="subscript"/>
+              </w:rPr>
+              <w:t xml:space="preserve">A</w:t>
+            </w:r>
+            <w:r>
+              <w:rPr>
+                <w:rFonts w:ascii="Times New Roman" w:hAnsi="Times New Roman"/>
+                <w:sz w:val="20"/>
+              </w:rPr>
+              <w:t xml:space="preserve">/C</w:t>
+            </w:r>
+            <w:r>
+              <w:rPr>
+                <w:rFonts w:ascii="Times New Roman" w:hAnsi="Times New Roman"/>
+                <w:sz w:val="20"/>
+                <w:vertAlign w:val="subscript"/>
+              </w:rPr>
+              <w:t xml:space="preserve">N</w:t>
+            </w:r>
+          </w:p>
+        </w:tc>
+        <w:tc>
+          <w:tcPr>
+            <w:tcW w:type="dxa" w:w="984"/>
+            <w:tcBorders>
+              <w:bottom w:val="single" w:sz="6" w:color="000000"/>
+            </w:tcBorders>
+          </w:tcPr>
+          <w:p>
+            <w:pPr>
+              <w:pStyle w:val="Compact"/>
+              <w:spacing w:line="240" w:lineRule="auto"/>
+              <w:jc w:val="center"/>
+            </w:pPr>
+            <w:r>
+              <w:rPr>
+                <w:rFonts w:ascii="Times New Roman" w:hAnsi="Times New Roman"/>
+                <w:sz w:val="20"/>
+              </w:rPr>
+              <w:t xml:space="preserve">Γ</w:t>
+            </w:r>
+          </w:p>
+        </w:tc>
+        <w:tc>
+          <w:tcPr>
+            <w:tcW w:type="dxa" w:w="984"/>
+            <w:tcBorders>
+              <w:bottom w:val="single" w:sz="6" w:color="000000"/>
+            </w:tcBorders>
+          </w:tcPr>
+          <w:p>
+            <w:pPr>
+              <w:pStyle w:val="Compact"/>
+              <w:spacing w:line="240" w:lineRule="auto"/>
+              <w:jc w:val="center"/>
+            </w:pPr>
+            <w:r>
+              <w:rPr>
+                <w:rFonts w:ascii="Times New Roman" w:hAnsi="Times New Roman"/>
+                <w:sz w:val="20"/>
+              </w:rPr>
+              <w:t xml:space="preserve">ACT optimal for</w:t>
+            </w:r>
+          </w:p>
+        </w:tc>
+      </w:tr>
+      <w:tr>
+        <w:tc>
+          <w:tcPr>
+            <w:tcW w:type="dxa" w:w="3456"/>
+          </w:tcPr>
+          <w:p>
+            <w:pPr>
+              <w:pStyle w:val="Compact"/>
+              <w:spacing w:line="240" w:lineRule="auto"/>
+              <w:jc w:val="left"/>
+            </w:pPr>
+            <w:r>
+              <w:rPr>
+                <w:rFonts w:ascii="Times New Roman" w:hAnsi="Times New Roman"/>
+                <w:sz w:val="20"/>
+              </w:rPr>
+              <w:t xml:space="preserve">70M, step 133k to 143k</w:t>
+            </w:r>
+          </w:p>
+        </w:tc>
+        <w:tc>
+          <w:tcPr>
+            <w:tcW w:type="dxa" w:w="984"/>
+          </w:tcPr>
+          <w:p>
+            <w:pPr>
+              <w:pStyle w:val="Compact"/>
+              <w:spacing w:line="240" w:lineRule="auto"/>
+              <w:jc w:val="center"/>
+            </w:pPr>
+            <w:r>
+              <w:rPr>
+                <w:rFonts w:ascii="Times New Roman" w:hAnsi="Times New Roman"/>
+                <w:sz w:val="20"/>
+              </w:rPr>
+              <w:t xml:space="preserve">0.25</w:t>
+            </w:r>
+          </w:p>
+        </w:tc>
+        <w:tc>
+          <w:tcPr>
+            <w:tcW w:type="dxa" w:w="984"/>
+          </w:tcPr>
+          <w:p>
+            <w:pPr>
+              <w:pStyle w:val="Compact"/>
+              <w:spacing w:line="240" w:lineRule="auto"/>
+              <w:jc w:val="center"/>
+            </w:pPr>
+            <w:r>
+              <w:rPr>
+                <w:rFonts w:ascii="Times New Roman" w:hAnsi="Times New Roman"/>
+                <w:sz w:val="20"/>
+              </w:rPr>
+              <w:t xml:space="preserve">0.972</w:t>
+            </w:r>
+          </w:p>
+        </w:tc>
+        <w:tc>
+          <w:tcPr>
+            <w:tcW w:type="dxa" w:w="984"/>
+          </w:tcPr>
+          <w:p>
+            <w:pPr>
+              <w:pStyle w:val="Compact"/>
+              <w:spacing w:line="240" w:lineRule="auto"/>
+              <w:jc w:val="center"/>
+            </w:pPr>
+            <w:r>
+              <w:rPr>
+                <w:rFonts w:ascii="Times New Roman" w:hAnsi="Times New Roman"/>
+                <w:sz w:val="20"/>
+              </w:rPr>
+              <w:t xml:space="preserve">0.974</w:t>
+            </w:r>
+          </w:p>
+        </w:tc>
+        <w:tc>
+          <w:tcPr>
+            <w:tcW w:type="dxa" w:w="984"/>
+          </w:tcPr>
+          <w:p>
+            <w:pPr>
+              <w:pStyle w:val="Compact"/>
+              <w:spacing w:line="240" w:lineRule="auto"/>
+              <w:jc w:val="center"/>
+            </w:pPr>
+            <w:r>
+              <w:rPr>
+                <w:rFonts w:ascii="Times New Roman" w:hAnsi="Times New Roman"/>
+                <w:sz w:val="20"/>
+              </w:rPr>
+              <w:t xml:space="preserve">0.16</w:t>
+            </w:r>
+          </w:p>
+        </w:tc>
+        <w:tc>
+          <w:tcPr>
+            <w:tcW w:type="dxa" w:w="984"/>
+          </w:tcPr>
+          <w:p>
+            <w:pPr>
+              <w:pStyle w:val="Compact"/>
+              <w:spacing w:line="240" w:lineRule="auto"/>
+              <w:jc w:val="center"/>
+            </w:pPr>
+            <w:r>
+              <w:rPr>
+                <w:rFonts w:ascii="Times New Roman" w:hAnsi="Times New Roman"/>
+                <w:sz w:val="20"/>
+              </w:rPr>
+              <w:t xml:space="preserve">0.05</w:t>
+            </w:r>
+          </w:p>
+        </w:tc>
+        <w:tc>
+          <w:tcPr>
+            <w:tcW w:type="dxa" w:w="984"/>
+          </w:tcPr>
+          <w:p>
+            <w:pPr>
+              <w:pStyle w:val="Compact"/>
+              <w:spacing w:line="240" w:lineRule="auto"/>
+              <w:jc w:val="center"/>
+            </w:pPr>
+            <w:r>
+              <w:rPr>
+                <w:rFonts w:ascii="Times New Roman" w:hAnsi="Times New Roman"/>
+                <w:sz w:val="20"/>
+              </w:rPr>
+              <w:t xml:space="preserve">never</w:t>
+            </w:r>
+          </w:p>
+        </w:tc>
+      </w:tr>
+      <w:tr>
+        <w:tc>
+          <w:tcPr>
+            <w:tcW w:type="dxa" w:w="3456"/>
+          </w:tcPr>
+          <w:p>
+            <w:pPr>
+              <w:pStyle w:val="Compact"/>
+              <w:spacing w:line="240" w:lineRule="auto"/>
+              <w:jc w:val="left"/>
+            </w:pPr>
+            <w:r>
+              <w:rPr>
+                <w:rFonts w:ascii="Times New Roman" w:hAnsi="Times New Roman"/>
+                <w:sz w:val="20"/>
+              </w:rPr>
+              <w:t xml:space="preserve">70M, step 103k to 143k</w:t>
+            </w:r>
+          </w:p>
+        </w:tc>
+        <w:tc>
+          <w:tcPr>
+            <w:tcW w:type="dxa" w:w="984"/>
+          </w:tcPr>
+          <w:p>
+            <w:pPr>
+              <w:pStyle w:val="Compact"/>
+              <w:spacing w:line="240" w:lineRule="auto"/>
+              <w:jc w:val="center"/>
+            </w:pPr>
+            <w:r>
+              <w:rPr>
+                <w:rFonts w:ascii="Times New Roman" w:hAnsi="Times New Roman"/>
+                <w:sz w:val="20"/>
+              </w:rPr>
+              <w:t xml:space="preserve">0.32</w:t>
+            </w:r>
+          </w:p>
+        </w:tc>
+        <w:tc>
+          <w:tcPr>
+            <w:tcW w:type="dxa" w:w="984"/>
+          </w:tcPr>
+          <w:p>
+            <w:pPr>
+              <w:pStyle w:val="Compact"/>
+              <w:spacing w:line="240" w:lineRule="auto"/>
+              <w:jc w:val="center"/>
+            </w:pPr>
+            <w:r>
+              <w:rPr>
+                <w:rFonts w:ascii="Times New Roman" w:hAnsi="Times New Roman"/>
+                <w:sz w:val="20"/>
+              </w:rPr>
+              <w:t xml:space="preserve">0.933</w:t>
+            </w:r>
+          </w:p>
+        </w:tc>
+        <w:tc>
+          <w:tcPr>
+            <w:tcW w:type="dxa" w:w="984"/>
+          </w:tcPr>
+          <w:p>
+            <w:pPr>
+              <w:pStyle w:val="Compact"/>
+              <w:spacing w:line="240" w:lineRule="auto"/>
+              <w:jc w:val="center"/>
+            </w:pPr>
+            <w:r>
+              <w:rPr>
+                <w:rFonts w:ascii="Times New Roman" w:hAnsi="Times New Roman"/>
+                <w:sz w:val="20"/>
+              </w:rPr>
+              <w:t xml:space="preserve">0.959</w:t>
+            </w:r>
+          </w:p>
+        </w:tc>
+        <w:tc>
+          <w:tcPr>
+            <w:tcW w:type="dxa" w:w="984"/>
+          </w:tcPr>
+          <w:p>
+            <w:pPr>
+              <w:pStyle w:val="Compact"/>
+              <w:spacing w:line="240" w:lineRule="auto"/>
+              <w:jc w:val="center"/>
+            </w:pPr>
+            <w:r>
+              <w:rPr>
+                <w:rFonts w:ascii="Times New Roman" w:hAnsi="Times New Roman"/>
+                <w:sz w:val="20"/>
+              </w:rPr>
+              <w:t xml:space="preserve">0.16</w:t>
+            </w:r>
+          </w:p>
+        </w:tc>
+        <w:tc>
+          <w:tcPr>
+            <w:tcW w:type="dxa" w:w="984"/>
+          </w:tcPr>
+          <w:p>
+            <w:pPr>
+              <w:pStyle w:val="Compact"/>
+              <w:spacing w:line="240" w:lineRule="auto"/>
+              <w:jc w:val="center"/>
+            </w:pPr>
+            <w:r>
+              <w:rPr>
+                <w:rFonts w:ascii="Times New Roman" w:hAnsi="Times New Roman"/>
+                <w:sz w:val="20"/>
+              </w:rPr>
+              <w:t xml:space="preserve">0.31</w:t>
+            </w:r>
+          </w:p>
+        </w:tc>
+        <w:tc>
+          <w:tcPr>
+            <w:tcW w:type="dxa" w:w="984"/>
+          </w:tcPr>
+          <w:p>
+            <w:pPr>
+              <w:pStyle w:val="Compact"/>
+              <w:spacing w:line="240" w:lineRule="auto"/>
+              <w:jc w:val="center"/>
+            </w:pPr>
+            <w:r>
+              <w:rPr>
+                <w:rFonts w:ascii="Times New Roman" w:hAnsi="Times New Roman"/>
+                <w:sz w:val="20"/>
+              </w:rPr>
+              <w:t xml:space="preserve">[11.7, 42.1)</w:t>
+            </w:r>
+          </w:p>
+        </w:tc>
+      </w:tr>
+      <w:tr>
+        <w:tc>
+          <w:tcPr>
+            <w:tcW w:type="dxa" w:w="3456"/>
+          </w:tcPr>
+          <w:p>
+            <w:pPr>
+              <w:pStyle w:val="Compact"/>
+              <w:spacing w:line="240" w:lineRule="auto"/>
+              <w:jc w:val="left"/>
+            </w:pPr>
+            <w:r>
+              <w:rPr>
+                <w:rFonts w:ascii="Times New Roman" w:hAnsi="Times New Roman"/>
+                <w:sz w:val="20"/>
+              </w:rPr>
+              <w:t xml:space="preserve">70M, step 73k to 143k</w:t>
+            </w:r>
+          </w:p>
+        </w:tc>
+        <w:tc>
+          <w:tcPr>
+            <w:tcW w:type="dxa" w:w="984"/>
+          </w:tcPr>
+          <w:p>
+            <w:pPr>
+              <w:pStyle w:val="Compact"/>
+              <w:spacing w:line="240" w:lineRule="auto"/>
+              <w:jc w:val="center"/>
+            </w:pPr>
+            <w:r>
+              <w:rPr>
+                <w:rFonts w:ascii="Times New Roman" w:hAnsi="Times New Roman"/>
+                <w:sz w:val="20"/>
+              </w:rPr>
+              <w:t xml:space="preserve">0.49</w:t>
+            </w:r>
+          </w:p>
+        </w:tc>
+        <w:tc>
+          <w:tcPr>
+            <w:tcW w:type="dxa" w:w="984"/>
+          </w:tcPr>
+          <w:p>
+            <w:pPr>
+              <w:pStyle w:val="Compact"/>
+              <w:spacing w:line="240" w:lineRule="auto"/>
+              <w:jc w:val="center"/>
+            </w:pPr>
+            <w:r>
+              <w:rPr>
+                <w:rFonts w:ascii="Times New Roman" w:hAnsi="Times New Roman"/>
+                <w:sz w:val="20"/>
+              </w:rPr>
+              <w:t xml:space="preserve">0.621</w:t>
+            </w:r>
+          </w:p>
+        </w:tc>
+        <w:tc>
+          <w:tcPr>
+            <w:tcW w:type="dxa" w:w="984"/>
+          </w:tcPr>
+          <w:p>
+            <w:pPr>
+              <w:pStyle w:val="Compact"/>
+              <w:spacing w:line="240" w:lineRule="auto"/>
+              <w:jc w:val="center"/>
+            </w:pPr>
+            <w:r>
+              <w:rPr>
+                <w:rFonts w:ascii="Times New Roman" w:hAnsi="Times New Roman"/>
+                <w:sz w:val="20"/>
+              </w:rPr>
+              <w:t xml:space="preserve">0.791</w:t>
+            </w:r>
+          </w:p>
+        </w:tc>
+        <w:tc>
+          <w:tcPr>
+            <w:tcW w:type="dxa" w:w="984"/>
+          </w:tcPr>
+          <w:p>
+            <w:pPr>
+              <w:pStyle w:val="Compact"/>
+              <w:spacing w:line="240" w:lineRule="auto"/>
+              <w:jc w:val="center"/>
+            </w:pPr>
+            <w:r>
+              <w:rPr>
+                <w:rFonts w:ascii="Times New Roman" w:hAnsi="Times New Roman"/>
+                <w:sz w:val="20"/>
+              </w:rPr>
+              <w:t xml:space="preserve">0.14</w:t>
+            </w:r>
+          </w:p>
+        </w:tc>
+        <w:tc>
+          <w:tcPr>
+            <w:tcW w:type="dxa" w:w="984"/>
+          </w:tcPr>
+          <w:p>
+            <w:pPr>
+              <w:pStyle w:val="Compact"/>
+              <w:spacing w:line="240" w:lineRule="auto"/>
+              <w:jc w:val="center"/>
+            </w:pPr>
+            <w:r>
+              <w:rPr>
+                <w:rFonts w:ascii="Times New Roman" w:hAnsi="Times New Roman"/>
+                <w:sz w:val="20"/>
+              </w:rPr>
+              <w:t xml:space="preserve">0.36</w:t>
+            </w:r>
+          </w:p>
+        </w:tc>
+        <w:tc>
+          <w:tcPr>
+            <w:tcW w:type="dxa" w:w="984"/>
+          </w:tcPr>
+          <w:p>
+            <w:pPr>
+              <w:pStyle w:val="Compact"/>
+              <w:spacing w:line="240" w:lineRule="auto"/>
+              <w:jc w:val="center"/>
+            </w:pPr>
+            <w:r>
+              <w:rPr>
+                <w:rFonts w:ascii="Times New Roman" w:hAnsi="Times New Roman"/>
+                <w:sz w:val="20"/>
+              </w:rPr>
+              <w:t xml:space="preserve">[1.6, 8.4)</w:t>
+            </w:r>
+          </w:p>
+        </w:tc>
+      </w:tr>
+      <w:tr>
+        <w:tc>
+          <w:tcPr>
+            <w:tcW w:type="dxa" w:w="3456"/>
+          </w:tcPr>
+          <w:p>
+            <w:pPr>
+              <w:pStyle w:val="Compact"/>
+              <w:spacing w:line="240" w:lineRule="auto"/>
+              <w:jc w:val="left"/>
+            </w:pPr>
+            <w:r>
+              <w:rPr>
+                <w:rFonts w:ascii="Times New Roman" w:hAnsi="Times New Roman"/>
+                <w:sz w:val="20"/>
+              </w:rPr>
+              <w:t xml:space="preserve">160M, step 73k to 143k (seed 0)</w:t>
+            </w:r>
+          </w:p>
+        </w:tc>
+        <w:tc>
+          <w:tcPr>
+            <w:tcW w:type="dxa" w:w="984"/>
+          </w:tcPr>
+          <w:p>
+            <w:pPr>
+              <w:pStyle w:val="Compact"/>
+              <w:spacing w:line="240" w:lineRule="auto"/>
+              <w:jc w:val="center"/>
+            </w:pPr>
+            <w:r>
+              <w:rPr>
+                <w:rFonts w:ascii="Times New Roman" w:hAnsi="Times New Roman"/>
+                <w:sz w:val="20"/>
+              </w:rPr>
+              <w:t xml:space="preserve">0.60</w:t>
+            </w:r>
+          </w:p>
+        </w:tc>
+        <w:tc>
+          <w:tcPr>
+            <w:tcW w:type="dxa" w:w="984"/>
+          </w:tcPr>
+          <w:p>
+            <w:pPr>
+              <w:pStyle w:val="Compact"/>
+              <w:spacing w:line="240" w:lineRule="auto"/>
+              <w:jc w:val="center"/>
+            </w:pPr>
+            <w:r>
+              <w:rPr>
+                <w:rFonts w:ascii="Times New Roman" w:hAnsi="Times New Roman"/>
+                <w:sz w:val="20"/>
+              </w:rPr>
+              <w:t xml:space="preserve">0.319</w:t>
+            </w:r>
+          </w:p>
+        </w:tc>
+        <w:tc>
+          <w:tcPr>
+            <w:tcW w:type="dxa" w:w="984"/>
+          </w:tcPr>
+          <w:p>
+            <w:pPr>
+              <w:pStyle w:val="Compact"/>
+              <w:spacing w:line="240" w:lineRule="auto"/>
+              <w:jc w:val="center"/>
+            </w:pPr>
+            <w:r>
+              <w:rPr>
+                <w:rFonts w:ascii="Times New Roman" w:hAnsi="Times New Roman"/>
+                <w:sz w:val="20"/>
+              </w:rPr>
+              <w:t xml:space="preserve">0.717</w:t>
+            </w:r>
+          </w:p>
+        </w:tc>
+        <w:tc>
+          <w:tcPr>
+            <w:tcW w:type="dxa" w:w="984"/>
+          </w:tcPr>
+          <w:p>
+            <w:pPr>
+              <w:pStyle w:val="Compact"/>
+              <w:spacing w:line="240" w:lineRule="auto"/>
+              <w:jc w:val="center"/>
+            </w:pPr>
+            <w:r>
+              <w:rPr>
+                <w:rFonts w:ascii="Times New Roman" w:hAnsi="Times New Roman"/>
+                <w:sz w:val="20"/>
+              </w:rPr>
+              <w:t xml:space="preserve">0.36</w:t>
+            </w:r>
+          </w:p>
+        </w:tc>
+        <w:tc>
+          <w:tcPr>
+            <w:tcW w:type="dxa" w:w="984"/>
+          </w:tcPr>
+          <w:p>
+            <w:pPr>
+              <w:pStyle w:val="Compact"/>
+              <w:spacing w:line="240" w:lineRule="auto"/>
+              <w:jc w:val="center"/>
+            </w:pPr>
+            <w:r>
+              <w:rPr>
+                <w:rFonts w:ascii="Times New Roman" w:hAnsi="Times New Roman"/>
+                <w:sz w:val="20"/>
+              </w:rPr>
+              <w:t xml:space="preserve">0.50</w:t>
+            </w:r>
+          </w:p>
+        </w:tc>
+        <w:tc>
+          <w:tcPr>
+            <w:tcW w:type="dxa" w:w="984"/>
+          </w:tcPr>
+          <w:p>
+            <w:pPr>
+              <w:pStyle w:val="Compact"/>
+              <w:spacing w:line="240" w:lineRule="auto"/>
+              <w:jc w:val="center"/>
+            </w:pPr>
+            <w:r>
+              <w:rPr>
+                <w:rFonts w:ascii="Times New Roman" w:hAnsi="Times New Roman"/>
+                <w:sz w:val="20"/>
+              </w:rPr>
+              <w:t xml:space="preserve">[1.8, 4.4)</w:t>
+            </w:r>
+          </w:p>
+        </w:tc>
+      </w:tr>
+      <w:tr>
+        <w:tc>
+          <w:tcPr>
+            <w:tcW w:type="dxa" w:w="3456"/>
+          </w:tcPr>
+          <w:p>
+            <w:pPr>
+              <w:pStyle w:val="Compact"/>
+              <w:spacing w:line="240" w:lineRule="auto"/>
+              <w:jc w:val="left"/>
+            </w:pPr>
+            <w:r>
+              <w:rPr>
+                <w:rFonts w:ascii="Times New Roman" w:hAnsi="Times New Roman"/>
+                <w:sz w:val="20"/>
+              </w:rPr>
+              <w:t xml:space="preserve">410M, step 73k to 143k</w:t>
+            </w:r>
+          </w:p>
+        </w:tc>
+        <w:tc>
+          <w:tcPr>
+            <w:tcW w:type="dxa" w:w="984"/>
+          </w:tcPr>
+          <w:p>
+            <w:pPr>
+              <w:pStyle w:val="Compact"/>
+              <w:spacing w:line="240" w:lineRule="auto"/>
+              <w:jc w:val="center"/>
+            </w:pPr>
+            <w:r>
+              <w:rPr>
+                <w:rFonts w:ascii="Times New Roman" w:hAnsi="Times New Roman"/>
+                <w:sz w:val="20"/>
+              </w:rPr>
+              <w:t xml:space="preserve">0.46</w:t>
+            </w:r>
+          </w:p>
+        </w:tc>
+        <w:tc>
+          <w:tcPr>
+            <w:tcW w:type="dxa" w:w="984"/>
+          </w:tcPr>
+          <w:p>
+            <w:pPr>
+              <w:pStyle w:val="Compact"/>
+              <w:spacing w:line="240" w:lineRule="auto"/>
+              <w:jc w:val="center"/>
+            </w:pPr>
+            <w:r>
+              <w:rPr>
+                <w:rFonts w:ascii="Times New Roman" w:hAnsi="Times New Roman"/>
+                <w:sz w:val="20"/>
+              </w:rPr>
+              <w:t xml:space="preserve">0.472</w:t>
+            </w:r>
+          </w:p>
+        </w:tc>
+        <w:tc>
+          <w:tcPr>
+            <w:tcW w:type="dxa" w:w="984"/>
+          </w:tcPr>
+          <w:p>
+            <w:pPr>
+              <w:pStyle w:val="Compact"/>
+              <w:spacing w:line="240" w:lineRule="auto"/>
+              <w:jc w:val="center"/>
+            </w:pPr>
+            <w:r>
+              <w:rPr>
+                <w:rFonts w:ascii="Times New Roman" w:hAnsi="Times New Roman"/>
+                <w:sz w:val="20"/>
+              </w:rPr>
+              <w:t xml:space="preserve">0.631</w:t>
+            </w:r>
+          </w:p>
+        </w:tc>
+        <w:tc>
+          <w:tcPr>
+            <w:tcW w:type="dxa" w:w="984"/>
+          </w:tcPr>
+          <w:p>
+            <w:pPr>
+              <w:pStyle w:val="Compact"/>
+              <w:spacing w:line="240" w:lineRule="auto"/>
+              <w:jc w:val="center"/>
+            </w:pPr>
+            <w:r>
+              <w:rPr>
+                <w:rFonts w:ascii="Times New Roman" w:hAnsi="Times New Roman"/>
+                <w:sz w:val="20"/>
+              </w:rPr>
+              <w:t xml:space="preserve">0.70</w:t>
+            </w:r>
+          </w:p>
+        </w:tc>
+        <w:tc>
+          <w:tcPr>
+            <w:tcW w:type="dxa" w:w="984"/>
+          </w:tcPr>
+          <w:p>
+            <w:pPr>
+              <w:pStyle w:val="Compact"/>
+              <w:spacing w:line="240" w:lineRule="auto"/>
+              <w:jc w:val="center"/>
+            </w:pPr>
+            <w:r>
+              <w:rPr>
+                <w:rFonts w:ascii="Times New Roman" w:hAnsi="Times New Roman"/>
+                <w:sz w:val="20"/>
+              </w:rPr>
+              <w:t xml:space="preserve">0.23</w:t>
+            </w:r>
+          </w:p>
+        </w:tc>
+        <w:tc>
+          <w:tcPr>
+            <w:tcW w:type="dxa" w:w="984"/>
+          </w:tcPr>
+          <w:p>
+            <w:pPr>
+              <w:pStyle w:val="Compact"/>
+              <w:spacing w:line="240" w:lineRule="auto"/>
+              <w:jc w:val="center"/>
+            </w:pPr>
+            <w:r>
+              <w:rPr>
+                <w:rFonts w:ascii="Times New Roman" w:hAnsi="Times New Roman"/>
+                <w:sz w:val="20"/>
+              </w:rPr>
+              <w:t xml:space="preserve">never</w:t>
+            </w:r>
+          </w:p>
+        </w:tc>
+      </w:tr>
+    </w:tbl>
+    <w:p>
+      <w:pPr>
+        <w:pStyle w:val="BodyText"/>
+      </w:pPr>
+      <w:r>
+        <w:t xml:space="preserve">The cost ratio is the quantity that changes with scale. Retraining time grows roughly in proportion to model size (207, 467, and 1</w:t>
+      </w:r>
+      <w:r>
+        <w:t xml:space="preserve">,</w:t>
+      </w:r>
+      <w:r>
+        <w:t xml:space="preserve">171 seconds at 70, 160, and 410 million parameters), but ACT’s time grows faster (29, 168, and 815 seconds). We have not isolated the reason. A plausible one is that the implementation solves several linear systems per module in every layer, which may grow faster with width than gradient training does, but we did not test this. The effect is a property of our implementation rather than of the method, and a cheaper implementation would shift the boundary of the useful range. It shows, however, that a transfer method’s gain and its cost have to be measured at the scale at which it will be used. The 410-million run is a single upgrade with a single seed, and its drift (0.46) is lower than that of the 160-million run it is compared with (0.60).</w:t>
       </w:r>
     </w:p>
     <w:bookmarkEnd w:id="26"/>
@@ -13181,7 +14375,7 @@
         <w:pStyle w:val="BodyText"/>
       </w:pPr>
       <w:r>
-        <w:t xml:space="preserve">In simulation ACT keeps a gain of 0.05 to 0.33 under both upgrade types and every task overlap (Table 6), so neither the upgrade type nor the task mismatch explains the exception. Calibrating on prompt and answer tokens leaves ACT level with copy on the smallest Pythia upgrade (</w:t>
+        <w:t xml:space="preserve">In simulation ACT keeps a gain of 0.05 to 0.33 under both upgrade types and every task overlap (Table 7), so neither the upgrade type nor the task mismatch explains the exception. Calibrating on prompt and answer tokens leaves ACT level with copy on the smallest Pythia upgrade (</w:t>
       </w:r>
       <m:oMath>
         <m:sSub>
@@ -15112,7 +16306,7 @@
         <w:pStyle w:val="FirstParagraph"/>
       </w:pPr>
       <w:r>
-        <w:t xml:space="preserve">Two cautions apply. The thresholds scale with the full retraining cost, so a team that omits labeling and validation labor from</w:t>
+        <w:t xml:space="preserve">Three cautions apply. The thresholds scale with the full retraining cost, so a team that omits labeling and validation labor from</w:t>
       </w:r>
       <w:r>
         <w:t xml:space="preserve"> </w:t>
@@ -15158,7 +16352,30 @@
         <w:t xml:space="preserve"> </w:t>
       </w:r>
       <w:r>
-        <w:t xml:space="preserve">is task-specific: the same upgrade can leave a summarization adapter nearly intact and a reasoning adapter badly degraded, so the measurement in step 1 should be repeated for each adapter that matters.</w:t>
+        <w:t xml:space="preserve">is task-specific: the same upgrade can leave a summarization adapter nearly intact and a reasoning adapter badly degraded, so the measurement in step 1 should be repeated for each adapter that matters. Finally, a transfer method’s cost ratio depends on model scale and implementation (in our runs ACT’s rose from 0.14 to 0.70 between 70 and 410 million parameters), so</w:t>
+      </w:r>
+      <w:r>
+        <w:t xml:space="preserve"> </w:t>
+      </w:r>
+      <m:oMath>
+        <m:sSub>
+          <m:e>
+            <m:r>
+              <m:t>C</m:t>
+            </m:r>
+          </m:e>
+          <m:sub>
+            <m:r>
+              <m:t>A</m:t>
+            </m:r>
+          </m:sub>
+        </m:sSub>
+      </m:oMath>
+      <w:r>
+        <w:t xml:space="preserve"> </w:t>
+      </w:r>
+      <w:r>
+        <w:t xml:space="preserve">should be measured at the model size in use.</w:t>
       </w:r>
     </w:p>
     <w:bookmarkEnd w:id="29"/>
@@ -15182,7 +16399,7 @@
         <w:t xml:space="preserve"> </w:t>
       </w:r>
       <w:r>
-        <w:t xml:space="preserve">Our measurements suggest a practical default that depends on the size of the upgrade: when the model moved little, copying the old adapter restores most of the retraining benefit, the retraining threshold is high, and a transfer method must beat copying by only a few points, but at a cost it rarely does; when the model moved a lot, copying collapses, and a cheap closed-form transfer such as ACT can be the cheapest policy over a middle range of adapter values, although in our series its gain covered its cost only at the largest upgrade.</w:t>
+        <w:t xml:space="preserve">Our measurements suggest a practical default that depends on the size of the upgrade: when the model moved little, copying the old adapter restores most of the retraining benefit, the retraining threshold is high, and a transfer method must beat copying by only a few points, but at a cost it rarely does; when the model moved a lot, copying collapses, and a cheap closed-form transfer such as ACT can be the cheapest policy over a middle range of adapter values, although in our series its gain covered its cost only at the largest upgrade, and at 410 million parameters, where its compute cost relative to retraining rose to 0.70, not even there.</w:t>
       </w:r>
       <w:r>
         <w:t xml:space="preserve"> </w:t>
@@ -15266,13 +16483,13 @@
         <w:t xml:space="preserve"> </w:t>
       </w:r>
       <w:r>
-        <w:t xml:space="preserve">are excluded and would lower every cost ratio and raise the thresholds. Second, we ran six upgrades of models with 160 to 360 million parameters, on a single task (GSM8K), with 200 evaluation examples each. The drift series covers one model family, and only the largest upgrade has a replicate; the results do not speak to frontier models or to other tasks.</w:t>
-      </w:r>
-      <w:r>
-        <w:t xml:space="preserve"> </w:t>
-      </w:r>
-      <w:r>
-        <w:t xml:space="preserve">Third, the instruction-tuned pair is an unexplained exception, and we cannot say whether it reflects the upgrade type, the model scale, or something else. Fourth, ACT’s gain rises steadily with upgrade size, but it covers ACT’s measured cost only at the largest upgrade, with the next largest narrowly short; the boundary lies between drifts of 0.56 and 0.60 for this implementation and cost, and it would move with a cheaper or better method. Fifth, value follows a stylized diffusion, and recovery is treated as known at the start of an epoch, whereas in</w:t>
+        <w:t xml:space="preserve">are excluded and would lower every cost ratio and raise the thresholds. Second, we ran ten upgrades of models with 70 to 410 million parameters, on a single task (GSM8K), with 200 evaluation examples each. The drift series covers one model family, and only the largest upgrade at 160 million parameters has a replicate; the 70- and 410-million runs have one seed each, and the 410-million run covers a single upgrade. The results do not speak to frontier models or to other tasks.</w:t>
+      </w:r>
+      <w:r>
+        <w:t xml:space="preserve"> </w:t>
+      </w:r>
+      <w:r>
+        <w:t xml:space="preserve">Third, the instruction-tuned pair is an unexplained exception, and we cannot say whether it reflects the upgrade type, the model scale, or something else. The rise of ACT’s relative compute cost with model size is also unexplained, and may reflect our implementation. Fourth, ACT’s gain rises steadily with upgrade size, but it covers ACT’s measured cost only at the largest upgrade, with the next largest narrowly short; the boundary lies between drifts of 0.56 and 0.60 for this implementation and cost, and it would move with a cheaper or better method. Fifth, value follows a stylized diffusion, and recovery is treated as known at the start of an epoch, whereas in</w:t>
       </w:r>
       <w:r>
         <w:t xml:space="preserve"> </w:t>

</xml_diff>

<commit_message>
Explain ACT cost growth with ACT time profile (repeated forward passes); update all manuscript versions
Co-Authored-By: Claude Sonnet 5.5 <noreply@anthropic.com>
Claude-Session: https://claude.ai/code/session_01CmDdfYCJkX1v32uwdfkXMf
</commit_message>
<xml_diff>
--- a/manuscript/dss_manuscript.docx
+++ b/manuscript/dss_manuscript.docx
@@ -13551,7 +13551,542 @@
         <w:t xml:space="preserve">,</w:t>
       </w:r>
       <w:r>
-        <w:t xml:space="preserve">171 seconds at 70, 160, and 410 million parameters), but ACT’s time grows faster (29, 168, and 815 seconds). We have not isolated the reason. A plausible one is that the implementation solves several linear systems per module in every layer, which may grow faster with width than gradient training does, but we did not test this. The effect is a property of our implementation rather than of the method, and a cheaper implementation would shift the boundary of the useful range. It shows, however, that a transfer method’s gain and its cost have to be measured at the scale at which it will be used. The 410-million run is a single upgrade with a single seed, and its drift (0.46) is lower than that of the 160-million run it is compared with (0.60).</w:t>
+        <w:t xml:space="preserve">171 seconds at 70, 160, and 410 million parameters), but ACT’s time grows faster (29, 168, and 815 seconds). To see where the time goes, we profiled ACT on untrained adapters, whose cost is the same as that of trained ones (Table 7).</w:t>
+      </w:r>
+      <w:r>
+        <w:t xml:space="preserve"> </w:t>
+      </w:r>
+      <w:r>
+        <w:t xml:space="preserve">Contrary to our first guess, the linear solves are not the main cost: they take 11% to 14% of ACT’s time at every size. The largest component, and the one that grows fastest, is the forward passes that capture module inputs (39%, 51%, and 60% of the time). ACT corrects the layers in order from the input side, and for each layer it runs both models from the input up to that layer, so the number of layer passes grows with the square of the depth. Relative to 70 million parameters, the layer-pass count multiplied by the squared layer width predicts growth of 8.4 and 57 times; the measured forward time grew by 8.4 and 35 times. The prediction matches at 160 million parameters and overshoots at 410 million, perhaps because larger matrix products run more efficiently on the CPU, a point we did not test.</w:t>
+      </w:r>
+      <w:r>
+        <w:t xml:space="preserve"> </w:t>
+      </w:r>
+      <w:r>
+        <w:t xml:space="preserve">Retraining, in contrast, passes through each layer once per step, so its cost grows roughly with depth rather than with its square. Of the 787 seconds added between 70 and 410 million parameters, forward passes account for 61%, Gram-matrix accumulation and other work for 26%, and the solves for 13%.</w:t>
+      </w:r>
+    </w:p>
+    <w:p>
+      <w:pPr>
+        <w:pStyle w:val="TableCaption"/>
+      </w:pPr>
+      <w:r>
+        <w:t xml:space="preserve">Profile of ACT on untrained adapters (Pythia, CPU, four threads). The totals differ from the ACT times of the full runs by up to 38%.</w:t>
+      </w:r>
+    </w:p>
+    <w:tbl>
+      <w:tblPr>
+        <w:tblStyle w:val="Table"/>
+        <w:tblW w:type="dxa" w:w="9360"/>
+        <w:tblLook w:firstRow="1" w:lastRow="0" w:firstColumn="0" w:lastColumn="0" w:noHBand="0" w:noVBand="0" w:val="0020"/>
+        <w:jc w:val="start"/>
+        <w:tblCaption w:val="Profile of ACT on untrained adapters (Pythia, CPU, four threads). The totals differ from the ACT times of the full runs by up to 38%."/>
+        <w:tblLayout w:type="fixed"/>
+        <w:tblBorders>
+          <w:top w:val="single" w:sz="12" w:color="000000"/>
+          <w:bottom w:val="single" w:sz="12" w:color="000000"/>
+        </w:tblBorders>
+      </w:tblPr>
+      <w:tblGrid>
+        <w:gridCol w:w="3456"/>
+        <w:gridCol w:w="1180"/>
+        <w:gridCol w:w="1180"/>
+        <w:gridCol w:w="1180"/>
+        <w:gridCol w:w="1180"/>
+        <w:gridCol w:w="1180"/>
+      </w:tblGrid>
+      <w:tr>
+        <w:trPr>
+          <w:tblHeader w:val="true"/>
+        </w:trPr>
+        <w:tc>
+          <w:tcPr>
+            <w:tcW w:type="dxa" w:w="3456"/>
+            <w:tcBorders>
+              <w:bottom w:val="single" w:sz="6" w:color="000000"/>
+            </w:tcBorders>
+          </w:tcPr>
+          <w:p>
+            <w:pPr>
+              <w:pStyle w:val="Compact"/>
+              <w:spacing w:line="240" w:lineRule="auto"/>
+              <w:jc w:val="left"/>
+            </w:pPr>
+            <w:r>
+              <w:rPr>
+                <w:rFonts w:ascii="Times New Roman" w:hAnsi="Times New Roman"/>
+                <w:sz w:val="20"/>
+              </w:rPr>
+              <w:t xml:space="preserve">Model</w:t>
+            </w:r>
+          </w:p>
+        </w:tc>
+        <w:tc>
+          <w:tcPr>
+            <w:tcW w:type="dxa" w:w="1181"/>
+            <w:tcBorders>
+              <w:bottom w:val="single" w:sz="6" w:color="000000"/>
+            </w:tcBorders>
+          </w:tcPr>
+          <w:p>
+            <w:pPr>
+              <w:pStyle w:val="Compact"/>
+              <w:spacing w:line="240" w:lineRule="auto"/>
+              <w:jc w:val="center"/>
+            </w:pPr>
+            <w:r>
+              <w:rPr>
+                <w:rFonts w:ascii="Times New Roman" w:hAnsi="Times New Roman"/>
+                <w:sz w:val="20"/>
+              </w:rPr>
+              <w:t xml:space="preserve">Layers</w:t>
+            </w:r>
+          </w:p>
+        </w:tc>
+        <w:tc>
+          <w:tcPr>
+            <w:tcW w:type="dxa" w:w="1181"/>
+            <w:tcBorders>
+              <w:bottom w:val="single" w:sz="6" w:color="000000"/>
+            </w:tcBorders>
+          </w:tcPr>
+          <w:p>
+            <w:pPr>
+              <w:pStyle w:val="Compact"/>
+              <w:spacing w:line="240" w:lineRule="auto"/>
+              <w:jc w:val="center"/>
+            </w:pPr>
+            <w:r>
+              <w:rPr>
+                <w:rFonts w:ascii="Times New Roman" w:hAnsi="Times New Roman"/>
+                <w:sz w:val="20"/>
+              </w:rPr>
+              <w:t xml:space="preserve">Total (s)</w:t>
+            </w:r>
+          </w:p>
+        </w:tc>
+        <w:tc>
+          <w:tcPr>
+            <w:tcW w:type="dxa" w:w="1181"/>
+            <w:tcBorders>
+              <w:bottom w:val="single" w:sz="6" w:color="000000"/>
+            </w:tcBorders>
+          </w:tcPr>
+          <w:p>
+            <w:pPr>
+              <w:pStyle w:val="Compact"/>
+              <w:spacing w:line="240" w:lineRule="auto"/>
+              <w:jc w:val="center"/>
+            </w:pPr>
+            <w:r>
+              <w:rPr>
+                <w:rFonts w:ascii="Times New Roman" w:hAnsi="Times New Roman"/>
+                <w:sz w:val="20"/>
+              </w:rPr>
+              <w:t xml:space="preserve">Forward passes</w:t>
+            </w:r>
+          </w:p>
+        </w:tc>
+        <w:tc>
+          <w:tcPr>
+            <w:tcW w:type="dxa" w:w="1181"/>
+            <w:tcBorders>
+              <w:bottom w:val="single" w:sz="6" w:color="000000"/>
+            </w:tcBorders>
+          </w:tcPr>
+          <w:p>
+            <w:pPr>
+              <w:pStyle w:val="Compact"/>
+              <w:spacing w:line="240" w:lineRule="auto"/>
+              <w:jc w:val="center"/>
+            </w:pPr>
+            <w:r>
+              <w:rPr>
+                <w:rFonts w:ascii="Times New Roman" w:hAnsi="Times New Roman"/>
+                <w:sz w:val="20"/>
+              </w:rPr>
+              <w:t xml:space="preserve">Linear solves</w:t>
+            </w:r>
+          </w:p>
+        </w:tc>
+        <w:tc>
+          <w:tcPr>
+            <w:tcW w:type="dxa" w:w="1181"/>
+            <w:tcBorders>
+              <w:bottom w:val="single" w:sz="6" w:color="000000"/>
+            </w:tcBorders>
+          </w:tcPr>
+          <w:p>
+            <w:pPr>
+              <w:pStyle w:val="Compact"/>
+              <w:spacing w:line="240" w:lineRule="auto"/>
+              <w:jc w:val="center"/>
+            </w:pPr>
+            <w:r>
+              <w:rPr>
+                <w:rFonts w:ascii="Times New Roman" w:hAnsi="Times New Roman"/>
+                <w:sz w:val="20"/>
+              </w:rPr>
+              <w:t xml:space="preserve">Gram matrices, other</w:t>
+            </w:r>
+          </w:p>
+        </w:tc>
+      </w:tr>
+      <w:tr>
+        <w:tc>
+          <w:tcPr>
+            <w:tcW w:type="dxa" w:w="3456"/>
+          </w:tcPr>
+          <w:p>
+            <w:pPr>
+              <w:pStyle w:val="Compact"/>
+              <w:spacing w:line="240" w:lineRule="auto"/>
+              <w:jc w:val="left"/>
+            </w:pPr>
+            <w:r>
+              <w:rPr>
+                <w:rFonts w:ascii="Times New Roman" w:hAnsi="Times New Roman"/>
+                <w:sz w:val="20"/>
+              </w:rPr>
+              <w:t xml:space="preserve">70M</w:t>
+            </w:r>
+          </w:p>
+        </w:tc>
+        <w:tc>
+          <w:tcPr>
+            <w:tcW w:type="dxa" w:w="1181"/>
+          </w:tcPr>
+          <w:p>
+            <w:pPr>
+              <w:pStyle w:val="Compact"/>
+              <w:spacing w:line="240" w:lineRule="auto"/>
+              <w:jc w:val="center"/>
+            </w:pPr>
+            <w:r>
+              <w:rPr>
+                <w:rFonts w:ascii="Times New Roman" w:hAnsi="Times New Roman"/>
+                <w:sz w:val="20"/>
+              </w:rPr>
+              <w:t xml:space="preserve">6</w:t>
+            </w:r>
+          </w:p>
+        </w:tc>
+        <w:tc>
+          <w:tcPr>
+            <w:tcW w:type="dxa" w:w="1181"/>
+          </w:tcPr>
+          <w:p>
+            <w:pPr>
+              <w:pStyle w:val="Compact"/>
+              <w:spacing w:line="240" w:lineRule="auto"/>
+              <w:jc w:val="center"/>
+            </w:pPr>
+            <w:r>
+              <w:rPr>
+                <w:rFonts w:ascii="Times New Roman" w:hAnsi="Times New Roman"/>
+                <w:sz w:val="20"/>
+              </w:rPr>
+              <w:t xml:space="preserve">36</w:t>
+            </w:r>
+          </w:p>
+        </w:tc>
+        <w:tc>
+          <w:tcPr>
+            <w:tcW w:type="dxa" w:w="1181"/>
+          </w:tcPr>
+          <w:p>
+            <w:pPr>
+              <w:pStyle w:val="Compact"/>
+              <w:spacing w:line="240" w:lineRule="auto"/>
+              <w:jc w:val="center"/>
+            </w:pPr>
+            <w:r>
+              <w:rPr>
+                <w:rFonts w:ascii="Times New Roman" w:hAnsi="Times New Roman"/>
+                <w:sz w:val="20"/>
+              </w:rPr>
+              <w:t xml:space="preserve">14 (39%)</w:t>
+            </w:r>
+          </w:p>
+        </w:tc>
+        <w:tc>
+          <w:tcPr>
+            <w:tcW w:type="dxa" w:w="1181"/>
+          </w:tcPr>
+          <w:p>
+            <w:pPr>
+              <w:pStyle w:val="Compact"/>
+              <w:spacing w:line="240" w:lineRule="auto"/>
+              <w:jc w:val="center"/>
+            </w:pPr>
+            <w:r>
+              <w:rPr>
+                <w:rFonts w:ascii="Times New Roman" w:hAnsi="Times New Roman"/>
+                <w:sz w:val="20"/>
+              </w:rPr>
+              <w:t xml:space="preserve">5 (14%)</w:t>
+            </w:r>
+          </w:p>
+        </w:tc>
+        <w:tc>
+          <w:tcPr>
+            <w:tcW w:type="dxa" w:w="1181"/>
+          </w:tcPr>
+          <w:p>
+            <w:pPr>
+              <w:pStyle w:val="Compact"/>
+              <w:spacing w:line="240" w:lineRule="auto"/>
+              <w:jc w:val="center"/>
+            </w:pPr>
+            <w:r>
+              <w:rPr>
+                <w:rFonts w:ascii="Times New Roman" w:hAnsi="Times New Roman"/>
+                <w:sz w:val="20"/>
+              </w:rPr>
+              <w:t xml:space="preserve">17 (47%)</w:t>
+            </w:r>
+          </w:p>
+        </w:tc>
+      </w:tr>
+      <w:tr>
+        <w:tc>
+          <w:tcPr>
+            <w:tcW w:type="dxa" w:w="3456"/>
+          </w:tcPr>
+          <w:p>
+            <w:pPr>
+              <w:pStyle w:val="Compact"/>
+              <w:spacing w:line="240" w:lineRule="auto"/>
+              <w:jc w:val="left"/>
+            </w:pPr>
+            <w:r>
+              <w:rPr>
+                <w:rFonts w:ascii="Times New Roman" w:hAnsi="Times New Roman"/>
+                <w:sz w:val="20"/>
+              </w:rPr>
+              <w:t xml:space="preserve">160M</w:t>
+            </w:r>
+          </w:p>
+        </w:tc>
+        <w:tc>
+          <w:tcPr>
+            <w:tcW w:type="dxa" w:w="1181"/>
+          </w:tcPr>
+          <w:p>
+            <w:pPr>
+              <w:pStyle w:val="Compact"/>
+              <w:spacing w:line="240" w:lineRule="auto"/>
+              <w:jc w:val="center"/>
+            </w:pPr>
+            <w:r>
+              <w:rPr>
+                <w:rFonts w:ascii="Times New Roman" w:hAnsi="Times New Roman"/>
+                <w:sz w:val="20"/>
+              </w:rPr>
+              <w:t xml:space="preserve">12</w:t>
+            </w:r>
+          </w:p>
+        </w:tc>
+        <w:tc>
+          <w:tcPr>
+            <w:tcW w:type="dxa" w:w="1181"/>
+          </w:tcPr>
+          <w:p>
+            <w:pPr>
+              <w:pStyle w:val="Compact"/>
+              <w:spacing w:line="240" w:lineRule="auto"/>
+              <w:jc w:val="center"/>
+            </w:pPr>
+            <w:r>
+              <w:rPr>
+                <w:rFonts w:ascii="Times New Roman" w:hAnsi="Times New Roman"/>
+                <w:sz w:val="20"/>
+              </w:rPr>
+              <w:t xml:space="preserve">232</w:t>
+            </w:r>
+          </w:p>
+        </w:tc>
+        <w:tc>
+          <w:tcPr>
+            <w:tcW w:type="dxa" w:w="1181"/>
+          </w:tcPr>
+          <w:p>
+            <w:pPr>
+              <w:pStyle w:val="Compact"/>
+              <w:spacing w:line="240" w:lineRule="auto"/>
+              <w:jc w:val="center"/>
+            </w:pPr>
+            <w:r>
+              <w:rPr>
+                <w:rFonts w:ascii="Times New Roman" w:hAnsi="Times New Roman"/>
+                <w:sz w:val="20"/>
+              </w:rPr>
+              <w:t xml:space="preserve">118 (51%)</w:t>
+            </w:r>
+          </w:p>
+        </w:tc>
+        <w:tc>
+          <w:tcPr>
+            <w:tcW w:type="dxa" w:w="1181"/>
+          </w:tcPr>
+          <w:p>
+            <w:pPr>
+              <w:pStyle w:val="Compact"/>
+              <w:spacing w:line="240" w:lineRule="auto"/>
+              <w:jc w:val="center"/>
+            </w:pPr>
+            <w:r>
+              <w:rPr>
+                <w:rFonts w:ascii="Times New Roman" w:hAnsi="Times New Roman"/>
+                <w:sz w:val="20"/>
+              </w:rPr>
+              <w:t xml:space="preserve">26 (11%)</w:t>
+            </w:r>
+          </w:p>
+        </w:tc>
+        <w:tc>
+          <w:tcPr>
+            <w:tcW w:type="dxa" w:w="1181"/>
+          </w:tcPr>
+          <w:p>
+            <w:pPr>
+              <w:pStyle w:val="Compact"/>
+              <w:spacing w:line="240" w:lineRule="auto"/>
+              <w:jc w:val="center"/>
+            </w:pPr>
+            <w:r>
+              <w:rPr>
+                <w:rFonts w:ascii="Times New Roman" w:hAnsi="Times New Roman"/>
+                <w:sz w:val="20"/>
+              </w:rPr>
+              <w:t xml:space="preserve">88 (38%)</w:t>
+            </w:r>
+          </w:p>
+        </w:tc>
+      </w:tr>
+      <w:tr>
+        <w:tc>
+          <w:tcPr>
+            <w:tcW w:type="dxa" w:w="3456"/>
+          </w:tcPr>
+          <w:p>
+            <w:pPr>
+              <w:pStyle w:val="Compact"/>
+              <w:spacing w:line="240" w:lineRule="auto"/>
+              <w:jc w:val="left"/>
+            </w:pPr>
+            <w:r>
+              <w:rPr>
+                <w:rFonts w:ascii="Times New Roman" w:hAnsi="Times New Roman"/>
+                <w:sz w:val="20"/>
+              </w:rPr>
+              <w:t xml:space="preserve">410M</w:t>
+            </w:r>
+          </w:p>
+        </w:tc>
+        <w:tc>
+          <w:tcPr>
+            <w:tcW w:type="dxa" w:w="1181"/>
+          </w:tcPr>
+          <w:p>
+            <w:pPr>
+              <w:pStyle w:val="Compact"/>
+              <w:spacing w:line="240" w:lineRule="auto"/>
+              <w:jc w:val="center"/>
+            </w:pPr>
+            <w:r>
+              <w:rPr>
+                <w:rFonts w:ascii="Times New Roman" w:hAnsi="Times New Roman"/>
+                <w:sz w:val="20"/>
+              </w:rPr>
+              <w:t xml:space="preserve">24</w:t>
+            </w:r>
+          </w:p>
+        </w:tc>
+        <w:tc>
+          <w:tcPr>
+            <w:tcW w:type="dxa" w:w="1181"/>
+          </w:tcPr>
+          <w:p>
+            <w:pPr>
+              <w:pStyle w:val="Compact"/>
+              <w:spacing w:line="240" w:lineRule="auto"/>
+              <w:jc w:val="center"/>
+            </w:pPr>
+            <w:r>
+              <w:rPr>
+                <w:rFonts w:ascii="Times New Roman" w:hAnsi="Times New Roman"/>
+                <w:sz w:val="20"/>
+              </w:rPr>
+              <w:t xml:space="preserve">823</w:t>
+            </w:r>
+          </w:p>
+        </w:tc>
+        <w:tc>
+          <w:tcPr>
+            <w:tcW w:type="dxa" w:w="1181"/>
+          </w:tcPr>
+          <w:p>
+            <w:pPr>
+              <w:pStyle w:val="Compact"/>
+              <w:spacing w:line="240" w:lineRule="auto"/>
+              <w:jc w:val="center"/>
+            </w:pPr>
+            <w:r>
+              <w:rPr>
+                <w:rFonts w:ascii="Times New Roman" w:hAnsi="Times New Roman"/>
+                <w:sz w:val="20"/>
+              </w:rPr>
+              <w:t xml:space="preserve">494 (60%)</w:t>
+            </w:r>
+          </w:p>
+        </w:tc>
+        <w:tc>
+          <w:tcPr>
+            <w:tcW w:type="dxa" w:w="1181"/>
+          </w:tcPr>
+          <w:p>
+            <w:pPr>
+              <w:pStyle w:val="Compact"/>
+              <w:spacing w:line="240" w:lineRule="auto"/>
+              <w:jc w:val="center"/>
+            </w:pPr>
+            <w:r>
+              <w:rPr>
+                <w:rFonts w:ascii="Times New Roman" w:hAnsi="Times New Roman"/>
+                <w:sz w:val="20"/>
+              </w:rPr>
+              <w:t xml:space="preserve">108 (13%)</w:t>
+            </w:r>
+          </w:p>
+        </w:tc>
+        <w:tc>
+          <w:tcPr>
+            <w:tcW w:type="dxa" w:w="1181"/>
+          </w:tcPr>
+          <w:p>
+            <w:pPr>
+              <w:pStyle w:val="Compact"/>
+              <w:spacing w:line="240" w:lineRule="auto"/>
+              <w:jc w:val="center"/>
+            </w:pPr>
+            <w:r>
+              <w:rPr>
+                <w:rFonts w:ascii="Times New Roman" w:hAnsi="Times New Roman"/>
+                <w:sz w:val="20"/>
+              </w:rPr>
+              <w:t xml:space="preserve">220 (27%)</w:t>
+            </w:r>
+          </w:p>
+        </w:tc>
+      </w:tr>
+    </w:tbl>
+    <w:p>
+      <w:pPr>
+        <w:pStyle w:val="BodyText"/>
+      </w:pPr>
+      <w:r>
+        <w:t xml:space="preserve">The effect is a property of our implementation rather than of the method. Caching the corrected hidden states from layer to layer would remove the repeated passes; we did not implement this, so we cannot say how much it would reduce the cost ratio. The result does show that a transfer method’s gain and its cost have to be measured at the scale at which it will be used. The 410-million run is a single upgrade with a single seed, and its drift (0.46) is lower than that of the 160-million run it is compared with (0.60).</w:t>
       </w:r>
     </w:p>
     <w:bookmarkEnd w:id="26"/>
@@ -14375,7 +14910,7 @@
         <w:pStyle w:val="BodyText"/>
       </w:pPr>
       <w:r>
-        <w:t xml:space="preserve">In simulation ACT keeps a gain of 0.05 to 0.33 under both upgrade types and every task overlap (Table 7), so neither the upgrade type nor the task mismatch explains the exception. Calibrating on prompt and answer tokens leaves ACT level with copy on the smallest Pythia upgrade (</w:t>
+        <w:t xml:space="preserve">In simulation ACT keeps a gain of 0.05 to 0.33 under both upgrade types and every task overlap (Table 8), so neither the upgrade type nor the task mismatch explains the exception. Calibrating on prompt and answer tokens leaves ACT level with copy on the smallest Pythia upgrade (</w:t>
       </w:r>
       <m:oMath>
         <m:sSub>
@@ -16489,7 +17024,7 @@
         <w:t xml:space="preserve"> </w:t>
       </w:r>
       <w:r>
-        <w:t xml:space="preserve">Third, the instruction-tuned pair is an unexplained exception, and we cannot say whether it reflects the upgrade type, the model scale, or something else. The rise of ACT’s relative compute cost with model size is also unexplained, and may reflect our implementation. Fourth, ACT’s gain rises steadily with upgrade size, but it covers ACT’s measured cost only at the largest upgrade, with the next largest narrowly short; the boundary lies between drifts of 0.56 and 0.60 for this implementation and cost, and it would move with a cheaper or better method. Fifth, value follows a stylized diffusion, and recovery is treated as known at the start of an epoch, whereas in</w:t>
+        <w:t xml:space="preserve">Third, the instruction-tuned pair is an unexplained exception, and we cannot say whether it reflects the upgrade type, the model scale, or something else. ACT’s relative compute cost rises with model size mainly because of repeated forward passes in our implementation (Section 7); we did not test whether caching removes the effect. Fourth, ACT’s gain rises steadily with upgrade size, but it covers ACT’s measured cost only at the largest upgrade, with the next largest narrowly short; the boundary lies between drifts of 0.56 and 0.60 for this implementation and cost, and it would move with a cheaper or better method. Fifth, value follows a stylized diffusion, and recovery is treated as known at the start of an epoch, whereas in</w:t>
       </w:r>
       <w:r>
         <w:t xml:space="preserve"> </w:t>

</xml_diff>

<commit_message>
Add 70M cached-ACT run; update manuscripts: caching lowers ACT cost ratio (0.67 to 0.28 at 410M) with identical output
Co-Authored-By: Claude Sonnet 5.5 <noreply@anthropic.com>
Claude-Session: https://claude.ai/code/session_01CmDdfYCJkX1v32uwdfkXMf
</commit_message>
<xml_diff>
--- a/manuscript/dss_manuscript.docx
+++ b/manuscript/dss_manuscript.docx
@@ -1563,13 +1563,7 @@
         <w:t xml:space="preserve"> </w:t>
       </w:r>
       <w:r>
-        <w:t xml:space="preserve">parameters,</w:t>
-      </w:r>
-      <w:r>
-        <w:t xml:space="preserve"> </w:t>
-      </w:r>
-      <w:r>
-        <w:t xml:space="preserve">but</w:t>
+        <w:t xml:space="preserve">parameters.</w:t>
       </w:r>
       <w:r>
         <w:t xml:space="preserve"> </w:t>
@@ -1611,7 +1605,7 @@
         <w:t xml:space="preserve"> </w:t>
       </w:r>
       <w:r>
-        <w:t xml:space="preserve">rises</w:t>
+        <w:t xml:space="preserve">rose</w:t>
       </w:r>
       <w:r>
         <w:t xml:space="preserve"> </w:t>
@@ -1641,6 +1635,24 @@
         <w:t xml:space="preserve"> </w:t>
       </w:r>
       <w:r>
+        <w:t xml:space="preserve">with</w:t>
+      </w:r>
+      <w:r>
+        <w:t xml:space="preserve"> </w:t>
+      </w:r>
+      <w:r>
+        <w:t xml:space="preserve">model</w:t>
+      </w:r>
+      <w:r>
+        <w:t xml:space="preserve"> </w:t>
+      </w:r>
+      <w:r>
+        <w:t xml:space="preserve">size</w:t>
+      </w:r>
+      <w:r>
+        <w:t xml:space="preserve"> </w:t>
+      </w:r>
+      <w:r>
         <w:t xml:space="preserve">in</w:t>
       </w:r>
       <w:r>
@@ -1653,7 +1665,133 @@
         <w:t xml:space="preserve"> </w:t>
       </w:r>
       <w:r>
-        <w:t xml:space="preserve">implementation,</w:t>
+        <w:t xml:space="preserve">first</w:t>
+      </w:r>
+      <w:r>
+        <w:t xml:space="preserve"> </w:t>
+      </w:r>
+      <w:r>
+        <w:t xml:space="preserve">implementation;</w:t>
+      </w:r>
+      <w:r>
+        <w:t xml:space="preserve"> </w:t>
+      </w:r>
+      <w:r>
+        <w:t xml:space="preserve">caching</w:t>
+      </w:r>
+      <w:r>
+        <w:t xml:space="preserve"> </w:t>
+      </w:r>
+      <w:r>
+        <w:t xml:space="preserve">layer</w:t>
+      </w:r>
+      <w:r>
+        <w:t xml:space="preserve"> </w:t>
+      </w:r>
+      <w:r>
+        <w:t xml:space="preserve">inputs,</w:t>
+      </w:r>
+      <w:r>
+        <w:t xml:space="preserve"> </w:t>
+      </w:r>
+      <w:r>
+        <w:t xml:space="preserve">which</w:t>
+      </w:r>
+      <w:r>
+        <w:t xml:space="preserve"> </w:t>
+      </w:r>
+      <w:r>
+        <w:t xml:space="preserve">leaves</w:t>
+      </w:r>
+      <w:r>
+        <w:t xml:space="preserve"> </w:t>
+      </w:r>
+      <w:r>
+        <w:t xml:space="preserve">its</w:t>
+      </w:r>
+      <w:r>
+        <w:t xml:space="preserve"> </w:t>
+      </w:r>
+      <w:r>
+        <w:t xml:space="preserve">output</w:t>
+      </w:r>
+      <w:r>
+        <w:t xml:space="preserve"> </w:t>
+      </w:r>
+      <w:r>
+        <w:t xml:space="preserve">unchanged,</w:t>
+      </w:r>
+      <w:r>
+        <w:t xml:space="preserve"> </w:t>
+      </w:r>
+      <w:r>
+        <w:t xml:space="preserve">lowers</w:t>
+      </w:r>
+      <w:r>
+        <w:t xml:space="preserve"> </w:t>
+      </w:r>
+      <w:r>
+        <w:t xml:space="preserve">the</w:t>
+      </w:r>
+      <w:r>
+        <w:t xml:space="preserve"> </w:t>
+      </w:r>
+      <w:r>
+        <w:t xml:space="preserve">410-million</w:t>
+      </w:r>
+      <w:r>
+        <w:t xml:space="preserve"> </w:t>
+      </w:r>
+      <w:r>
+        <w:t xml:space="preserve">figure</w:t>
+      </w:r>
+      <w:r>
+        <w:t xml:space="preserve"> </w:t>
+      </w:r>
+      <w:r>
+        <w:t xml:space="preserve">to</w:t>
+      </w:r>
+      <w:r>
+        <w:t xml:space="preserve"> </w:t>
+      </w:r>
+      <w:r>
+        <w:t xml:space="preserve">0.28,</w:t>
+      </w:r>
+      <w:r>
+        <w:t xml:space="preserve"> </w:t>
+      </w:r>
+      <w:r>
+        <w:t xml:space="preserve">still</w:t>
+      </w:r>
+      <w:r>
+        <w:t xml:space="preserve"> </w:t>
+      </w:r>
+      <w:r>
+        <w:t xml:space="preserve">above</w:t>
+      </w:r>
+      <w:r>
+        <w:t xml:space="preserve"> </w:t>
+      </w:r>
+      <w:r>
+        <w:t xml:space="preserve">the</w:t>
+      </w:r>
+      <w:r>
+        <w:t xml:space="preserve"> </w:t>
+      </w:r>
+      <w:r>
+        <w:t xml:space="preserve">break-even</w:t>
+      </w:r>
+      <w:r>
+        <w:t xml:space="preserve"> </w:t>
+      </w:r>
+      <w:r>
+        <w:t xml:space="preserve">of</w:t>
+      </w:r>
+      <w:r>
+        <w:t xml:space="preserve"> </w:t>
+      </w:r>
+      <w:r>
+        <w:t xml:space="preserve">0.21,</w:t>
       </w:r>
       <w:r>
         <w:t xml:space="preserve"> </w:t>
@@ -1671,37 +1809,37 @@
         <w:t xml:space="preserve"> </w:t>
       </w:r>
       <w:r>
-        <w:t xml:space="preserve">410</w:t>
-      </w:r>
-      <w:r>
-        <w:t xml:space="preserve"> </w:t>
-      </w:r>
-      <w:r>
-        <w:t xml:space="preserve">million</w:t>
-      </w:r>
-      <w:r>
-        <w:t xml:space="preserve"> </w:t>
-      </w:r>
-      <w:r>
-        <w:t xml:space="preserve">it</w:t>
-      </w:r>
-      <w:r>
-        <w:t xml:space="preserve"> </w:t>
-      </w:r>
-      <w:r>
-        <w:t xml:space="preserve">no</w:t>
-      </w:r>
-      <w:r>
-        <w:t xml:space="preserve"> </w:t>
-      </w:r>
-      <w:r>
-        <w:t xml:space="preserve">longer</w:t>
-      </w:r>
-      <w:r>
-        <w:t xml:space="preserve"> </w:t>
-      </w:r>
-      <w:r>
-        <w:t xml:space="preserve">pays.</w:t>
+        <w:t xml:space="preserve">that</w:t>
+      </w:r>
+      <w:r>
+        <w:t xml:space="preserve"> </w:t>
+      </w:r>
+      <w:r>
+        <w:t xml:space="preserve">size</w:t>
+      </w:r>
+      <w:r>
+        <w:t xml:space="preserve"> </w:t>
+      </w:r>
+      <w:r>
+        <w:t xml:space="preserve">ACT</w:t>
+      </w:r>
+      <w:r>
+        <w:t xml:space="preserve"> </w:t>
+      </w:r>
+      <w:r>
+        <w:t xml:space="preserve">does</w:t>
+      </w:r>
+      <w:r>
+        <w:t xml:space="preserve"> </w:t>
+      </w:r>
+      <w:r>
+        <w:t xml:space="preserve">not</w:t>
+      </w:r>
+      <w:r>
+        <w:t xml:space="preserve"> </w:t>
+      </w:r>
+      <w:r>
+        <w:t xml:space="preserve">pay.</w:t>
       </w:r>
       <w:r>
         <w:t xml:space="preserve"> </w:t>
@@ -2422,7 +2560,7 @@
         <w:t xml:space="preserve"> </w:t>
       </w:r>
       <w:r>
-        <w:t xml:space="preserve">cost-minimizing policy over a bounded range of adapter values. The gain also appears at 70 and 410 million parameters, but ACT’s compute time relative to retraining rises from 0.14 to 0.70 with model size in our implementation, so the same method stops paying at 410 million.</w:t>
+        <w:t xml:space="preserve">cost-minimizing policy over a bounded range of adapter values. The gain also appears at 70 and 410 million parameters. ACT’s compute time relative to retraining rose from 0.14 to 0.70 with model size in our first implementation, and a version that caches layer inputs and leaves the output unchanged lowers the 410-million figure to 0.28, which is still above the break-even of 0.21, so at that size ACT does not pay.</w:t>
       </w:r>
       <w:r>
         <w:t xml:space="preserve"> </w:t>
@@ -12619,7 +12757,7 @@
         </m:r>
       </m:oMath>
       <w:r>
-        <w:t xml:space="preserve">) and ACT is never the cost-minimizing policy.</w:t>
+        <w:t xml:space="preserve">) and ACT is never the cost-minimizing policy. A more efficient implementation, described below, lowers this cost ratio to 0.28 without changing the result, which is closer to the break-even but still above it.</w:t>
       </w:r>
     </w:p>
     <w:p>
@@ -14086,9 +14224,670 @@
         <w:pStyle w:val="BodyText"/>
       </w:pPr>
       <w:r>
-        <w:t xml:space="preserve">The effect is a property of our implementation rather than of the method. Caching the corrected hidden states from layer to layer would remove the repeated passes; we did not implement this, so we cannot say how much it would reduce the cost ratio. The result does show that a transfer method’s gain and its cost have to be measured at the scale at which it will be used. The 410-million run is a single upgrade with a single seed, and its drift (0.46) is lower than that of the 160-million run it is compared with (0.60).</w:t>
+        <w:t xml:space="preserve">The effect is a property of our implementation rather than of the method. We therefore implemented the obvious remedy: the inputs of each layer are cached, so that each layer is run once per model to collect statistics and once more through the corrected target model to produce the next layer’s input, which makes the number of layer passes grow linearly with depth. On the same trained adapters the cached version selects the same anchoring strength for every module and gives the same held-out NLL as the original, to the digits reported, and it is faster by 1.35, 1.62, and 2.37 times at 70, 160, and 410 million parameters, lowering the cost ratio from 0.16, 0.33, and 0.67 to 0.12, 0.21, and 0.28 (Table 8). The speed-up grows with model size, as the profile predicts. At 410 million parameters the cost ratio is still above the break-even of 0.21, so ACT does not pay there, but the gap is 0.07 rather than 0.46. We did not profile the cached version, so we cannot say what dominates its remaining cost.</w:t>
+      </w:r>
+      <w:r>
+        <w:t xml:space="preserve"> </w:t>
+      </w:r>
+      <w:r>
+        <w:t xml:space="preserve">The result also shows that a transfer method’s gain and its cost have to be measured at the scale at which it will be used. The 410-million run is a single upgrade with a single seed, and its drift (0.46) is lower than that of the 160-million run it is compared with (0.60).</w:t>
       </w:r>
     </w:p>
+    <w:p>
+      <w:pPr>
+        <w:pStyle w:val="TableCaption"/>
+      </w:pPr>
+      <w:r>
+        <w:t xml:space="preserve">Original and cached ACT on the same trained adapters (Pythia, step 73k to 143k; new runs, so recoveries differ slightly from Table 6).</w:t>
+      </w:r>
+      <w:r>
+        <w:t xml:space="preserve"> </w:t>
+      </w:r>
+      <m:oMath>
+        <m:r>
+          <m:t>Γ</m:t>
+        </m:r>
+      </m:oMath>
+      <w:r>
+        <w:t xml:space="preserve"> </w:t>
+      </w:r>
+      <w:r>
+        <w:t xml:space="preserve">and the ACT-optimal range use the cached cost ratio.</w:t>
+      </w:r>
+    </w:p>
+    <w:tbl>
+      <w:tblPr>
+        <w:tblStyle w:val="Table"/>
+        <w:tblW w:type="dxa" w:w="9360"/>
+        <w:tblLook w:firstRow="1" w:lastRow="0" w:firstColumn="0" w:lastColumn="0" w:noHBand="0" w:noVBand="0" w:val="0020"/>
+        <w:jc w:val="start"/>
+        <w:tblCaption w:val="Original and cached ACT on the same trained adapters (Pythia, step 73k to 143k; new runs, so recoveries differ slightly from Table 6). \Gamma and the ACT-optimal range use the cached cost ratio."/>
+        <w:tblLayout w:type="fixed"/>
+        <w:tblBorders>
+          <w:top w:val="single" w:sz="12" w:color="000000"/>
+          <w:bottom w:val="single" w:sz="12" w:color="000000"/>
+        </w:tblBorders>
+      </w:tblPr>
+      <w:tblGrid>
+        <w:gridCol w:w="3456"/>
+        <w:gridCol w:w="983"/>
+        <w:gridCol w:w="983"/>
+        <w:gridCol w:w="983"/>
+        <w:gridCol w:w="983"/>
+        <w:gridCol w:w="983"/>
+        <w:gridCol w:w="983"/>
+      </w:tblGrid>
+      <w:tr>
+        <w:trPr>
+          <w:tblHeader w:val="true"/>
+        </w:trPr>
+        <w:tc>
+          <w:tcPr>
+            <w:tcW w:type="dxa" w:w="3456"/>
+            <w:tcBorders>
+              <w:bottom w:val="single" w:sz="6" w:color="000000"/>
+            </w:tcBorders>
+          </w:tcPr>
+          <w:p>
+            <w:pPr>
+              <w:pStyle w:val="Compact"/>
+              <w:spacing w:line="240" w:lineRule="auto"/>
+              <w:jc w:val="left"/>
+            </w:pPr>
+            <w:r>
+              <w:rPr>
+                <w:rFonts w:ascii="Times New Roman" w:hAnsi="Times New Roman"/>
+                <w:sz w:val="20"/>
+              </w:rPr>
+              <w:t xml:space="preserve">Model</w:t>
+            </w:r>
+          </w:p>
+        </w:tc>
+        <w:tc>
+          <w:tcPr>
+            <w:tcW w:type="dxa" w:w="984"/>
+            <w:tcBorders>
+              <w:bottom w:val="single" w:sz="6" w:color="000000"/>
+            </w:tcBorders>
+          </w:tcPr>
+          <w:p>
+            <w:pPr>
+              <w:pStyle w:val="Compact"/>
+              <w:spacing w:line="240" w:lineRule="auto"/>
+              <w:jc w:val="center"/>
+            </w:pPr>
+            <w:r>
+              <w:rPr>
+                <w:rFonts w:ascii="Times New Roman" w:hAnsi="Times New Roman"/>
+                <w:sz w:val="20"/>
+              </w:rPr>
+              <w:t xml:space="preserve">R</w:t>
+            </w:r>
+            <w:r>
+              <w:rPr>
+                <w:rFonts w:ascii="Times New Roman" w:hAnsi="Times New Roman"/>
+                <w:sz w:val="20"/>
+                <w:vertAlign w:val="subscript"/>
+              </w:rPr>
+              <w:t xml:space="preserve">C</w:t>
+            </w:r>
+          </w:p>
+        </w:tc>
+        <w:tc>
+          <w:tcPr>
+            <w:tcW w:type="dxa" w:w="984"/>
+            <w:tcBorders>
+              <w:bottom w:val="single" w:sz="6" w:color="000000"/>
+            </w:tcBorders>
+          </w:tcPr>
+          <w:p>
+            <w:pPr>
+              <w:pStyle w:val="Compact"/>
+              <w:spacing w:line="240" w:lineRule="auto"/>
+              <w:jc w:val="center"/>
+            </w:pPr>
+            <w:r>
+              <w:rPr>
+                <w:rFonts w:ascii="Times New Roman" w:hAnsi="Times New Roman"/>
+                <w:sz w:val="20"/>
+              </w:rPr>
+              <w:t xml:space="preserve">R</w:t>
+            </w:r>
+            <w:r>
+              <w:rPr>
+                <w:rFonts w:ascii="Times New Roman" w:hAnsi="Times New Roman"/>
+                <w:sz w:val="20"/>
+                <w:vertAlign w:val="subscript"/>
+              </w:rPr>
+              <w:t xml:space="preserve">A</w:t>
+            </w:r>
+          </w:p>
+        </w:tc>
+        <w:tc>
+          <w:tcPr>
+            <w:tcW w:type="dxa" w:w="984"/>
+            <w:tcBorders>
+              <w:bottom w:val="single" w:sz="6" w:color="000000"/>
+            </w:tcBorders>
+          </w:tcPr>
+          <w:p>
+            <w:pPr>
+              <w:pStyle w:val="Compact"/>
+              <w:spacing w:line="240" w:lineRule="auto"/>
+              <w:jc w:val="center"/>
+            </w:pPr>
+            <w:r>
+              <w:rPr>
+                <w:rFonts w:ascii="Times New Roman" w:hAnsi="Times New Roman"/>
+                <w:sz w:val="20"/>
+              </w:rPr>
+              <w:t xml:space="preserve">ACT time (s), original / cached</w:t>
+            </w:r>
+          </w:p>
+        </w:tc>
+        <w:tc>
+          <w:tcPr>
+            <w:tcW w:type="dxa" w:w="984"/>
+            <w:tcBorders>
+              <w:bottom w:val="single" w:sz="6" w:color="000000"/>
+            </w:tcBorders>
+          </w:tcPr>
+          <w:p>
+            <w:pPr>
+              <w:pStyle w:val="Compact"/>
+              <w:spacing w:line="240" w:lineRule="auto"/>
+              <w:jc w:val="center"/>
+            </w:pPr>
+            <w:r>
+              <w:rPr>
+                <w:rFonts w:ascii="Times New Roman" w:hAnsi="Times New Roman"/>
+                <w:sz w:val="20"/>
+              </w:rPr>
+              <w:t xml:space="preserve">C</w:t>
+            </w:r>
+            <w:r>
+              <w:rPr>
+                <w:rFonts w:ascii="Times New Roman" w:hAnsi="Times New Roman"/>
+                <w:sz w:val="20"/>
+                <w:vertAlign w:val="subscript"/>
+              </w:rPr>
+              <w:t xml:space="preserve">A</w:t>
+            </w:r>
+            <w:r>
+              <w:rPr>
+                <w:rFonts w:ascii="Times New Roman" w:hAnsi="Times New Roman"/>
+                <w:sz w:val="20"/>
+              </w:rPr>
+              <w:t xml:space="preserve">/C</w:t>
+            </w:r>
+            <w:r>
+              <w:rPr>
+                <w:rFonts w:ascii="Times New Roman" w:hAnsi="Times New Roman"/>
+                <w:sz w:val="20"/>
+                <w:vertAlign w:val="subscript"/>
+              </w:rPr>
+              <w:t xml:space="preserve">N</w:t>
+            </w:r>
+            <w:r>
+              <w:rPr>
+                <w:rFonts w:ascii="Times New Roman" w:hAnsi="Times New Roman"/>
+                <w:sz w:val="20"/>
+              </w:rPr>
+              <w:t xml:space="preserve">, original / cached</w:t>
+            </w:r>
+          </w:p>
+        </w:tc>
+        <w:tc>
+          <w:tcPr>
+            <w:tcW w:type="dxa" w:w="984"/>
+            <w:tcBorders>
+              <w:bottom w:val="single" w:sz="6" w:color="000000"/>
+            </w:tcBorders>
+          </w:tcPr>
+          <w:p>
+            <w:pPr>
+              <w:pStyle w:val="Compact"/>
+              <w:spacing w:line="240" w:lineRule="auto"/>
+              <w:jc w:val="center"/>
+            </w:pPr>
+            <w:r>
+              <w:rPr>
+                <w:rFonts w:ascii="Times New Roman" w:hAnsi="Times New Roman"/>
+                <w:sz w:val="20"/>
+              </w:rPr>
+              <w:t xml:space="preserve">Γ</w:t>
+            </w:r>
+          </w:p>
+        </w:tc>
+        <w:tc>
+          <w:tcPr>
+            <w:tcW w:type="dxa" w:w="984"/>
+            <w:tcBorders>
+              <w:bottom w:val="single" w:sz="6" w:color="000000"/>
+            </w:tcBorders>
+          </w:tcPr>
+          <w:p>
+            <w:pPr>
+              <w:pStyle w:val="Compact"/>
+              <w:spacing w:line="240" w:lineRule="auto"/>
+              <w:jc w:val="center"/>
+            </w:pPr>
+            <w:r>
+              <w:rPr>
+                <w:rFonts w:ascii="Times New Roman" w:hAnsi="Times New Roman"/>
+                <w:sz w:val="20"/>
+              </w:rPr>
+              <w:t xml:space="preserve">ACT optimal for</w:t>
+            </w:r>
+          </w:p>
+        </w:tc>
+      </w:tr>
+      <w:tr>
+        <w:tc>
+          <w:tcPr>
+            <w:tcW w:type="dxa" w:w="3456"/>
+          </w:tcPr>
+          <w:p>
+            <w:pPr>
+              <w:pStyle w:val="Compact"/>
+              <w:spacing w:line="240" w:lineRule="auto"/>
+              <w:jc w:val="left"/>
+            </w:pPr>
+            <w:r>
+              <w:rPr>
+                <w:rFonts w:ascii="Times New Roman" w:hAnsi="Times New Roman"/>
+                <w:sz w:val="20"/>
+              </w:rPr>
+              <w:t xml:space="preserve">70M</w:t>
+            </w:r>
+          </w:p>
+        </w:tc>
+        <w:tc>
+          <w:tcPr>
+            <w:tcW w:type="dxa" w:w="984"/>
+          </w:tcPr>
+          <w:p>
+            <w:pPr>
+              <w:pStyle w:val="Compact"/>
+              <w:spacing w:line="240" w:lineRule="auto"/>
+              <w:jc w:val="center"/>
+            </w:pPr>
+            <w:r>
+              <w:rPr>
+                <w:rFonts w:ascii="Times New Roman" w:hAnsi="Times New Roman"/>
+                <w:sz w:val="20"/>
+              </w:rPr>
+              <w:t xml:space="preserve">0.645</w:t>
+            </w:r>
+          </w:p>
+        </w:tc>
+        <w:tc>
+          <w:tcPr>
+            <w:tcW w:type="dxa" w:w="984"/>
+          </w:tcPr>
+          <w:p>
+            <w:pPr>
+              <w:pStyle w:val="Compact"/>
+              <w:spacing w:line="240" w:lineRule="auto"/>
+              <w:jc w:val="center"/>
+            </w:pPr>
+            <w:r>
+              <w:rPr>
+                <w:rFonts w:ascii="Times New Roman" w:hAnsi="Times New Roman"/>
+                <w:sz w:val="20"/>
+              </w:rPr>
+              <w:t xml:space="preserve">0.809</w:t>
+            </w:r>
+          </w:p>
+        </w:tc>
+        <w:tc>
+          <w:tcPr>
+            <w:tcW w:type="dxa" w:w="984"/>
+          </w:tcPr>
+          <w:p>
+            <w:pPr>
+              <w:pStyle w:val="Compact"/>
+              <w:spacing w:line="240" w:lineRule="auto"/>
+              <w:jc w:val="center"/>
+            </w:pPr>
+            <w:r>
+              <w:rPr>
+                <w:rFonts w:ascii="Times New Roman" w:hAnsi="Times New Roman"/>
+                <w:sz w:val="20"/>
+              </w:rPr>
+              <w:t xml:space="preserve">32 / 23</w:t>
+            </w:r>
+          </w:p>
+        </w:tc>
+        <w:tc>
+          <w:tcPr>
+            <w:tcW w:type="dxa" w:w="984"/>
+          </w:tcPr>
+          <w:p>
+            <w:pPr>
+              <w:pStyle w:val="Compact"/>
+              <w:spacing w:line="240" w:lineRule="auto"/>
+              <w:jc w:val="center"/>
+            </w:pPr>
+            <w:r>
+              <w:rPr>
+                <w:rFonts w:ascii="Times New Roman" w:hAnsi="Times New Roman"/>
+                <w:sz w:val="20"/>
+              </w:rPr>
+              <w:t xml:space="preserve">0.16 / 0.12</w:t>
+            </w:r>
+          </w:p>
+        </w:tc>
+        <w:tc>
+          <w:tcPr>
+            <w:tcW w:type="dxa" w:w="984"/>
+          </w:tcPr>
+          <w:p>
+            <w:pPr>
+              <w:pStyle w:val="Compact"/>
+              <w:spacing w:line="240" w:lineRule="auto"/>
+              <w:jc w:val="center"/>
+            </w:pPr>
+            <w:r>
+              <w:rPr>
+                <w:rFonts w:ascii="Times New Roman" w:hAnsi="Times New Roman"/>
+                <w:sz w:val="20"/>
+              </w:rPr>
+              <w:t xml:space="preserve">0.38</w:t>
+            </w:r>
+          </w:p>
+        </w:tc>
+        <w:tc>
+          <w:tcPr>
+            <w:tcW w:type="dxa" w:w="984"/>
+          </w:tcPr>
+          <w:p>
+            <w:pPr>
+              <w:pStyle w:val="Compact"/>
+              <w:spacing w:line="240" w:lineRule="auto"/>
+              <w:jc w:val="center"/>
+            </w:pPr>
+            <w:r>
+              <w:rPr>
+                <w:rFonts w:ascii="Times New Roman" w:hAnsi="Times New Roman"/>
+                <w:sz w:val="20"/>
+              </w:rPr>
+              <w:t xml:space="preserve">[1.4, 9.6)</w:t>
+            </w:r>
+          </w:p>
+        </w:tc>
+      </w:tr>
+      <w:tr>
+        <w:tc>
+          <w:tcPr>
+            <w:tcW w:type="dxa" w:w="3456"/>
+          </w:tcPr>
+          <w:p>
+            <w:pPr>
+              <w:pStyle w:val="Compact"/>
+              <w:spacing w:line="240" w:lineRule="auto"/>
+              <w:jc w:val="left"/>
+            </w:pPr>
+            <w:r>
+              <w:rPr>
+                <w:rFonts w:ascii="Times New Roman" w:hAnsi="Times New Roman"/>
+                <w:sz w:val="20"/>
+              </w:rPr>
+              <w:t xml:space="preserve">160M</w:t>
+            </w:r>
+          </w:p>
+        </w:tc>
+        <w:tc>
+          <w:tcPr>
+            <w:tcW w:type="dxa" w:w="984"/>
+          </w:tcPr>
+          <w:p>
+            <w:pPr>
+              <w:pStyle w:val="Compact"/>
+              <w:spacing w:line="240" w:lineRule="auto"/>
+              <w:jc w:val="center"/>
+            </w:pPr>
+            <w:r>
+              <w:rPr>
+                <w:rFonts w:ascii="Times New Roman" w:hAnsi="Times New Roman"/>
+                <w:sz w:val="20"/>
+              </w:rPr>
+              <w:t xml:space="preserve">0.390</w:t>
+            </w:r>
+          </w:p>
+        </w:tc>
+        <w:tc>
+          <w:tcPr>
+            <w:tcW w:type="dxa" w:w="984"/>
+          </w:tcPr>
+          <w:p>
+            <w:pPr>
+              <w:pStyle w:val="Compact"/>
+              <w:spacing w:line="240" w:lineRule="auto"/>
+              <w:jc w:val="center"/>
+            </w:pPr>
+            <w:r>
+              <w:rPr>
+                <w:rFonts w:ascii="Times New Roman" w:hAnsi="Times New Roman"/>
+                <w:sz w:val="20"/>
+              </w:rPr>
+              <w:t xml:space="preserve">0.768</w:t>
+            </w:r>
+          </w:p>
+        </w:tc>
+        <w:tc>
+          <w:tcPr>
+            <w:tcW w:type="dxa" w:w="984"/>
+          </w:tcPr>
+          <w:p>
+            <w:pPr>
+              <w:pStyle w:val="Compact"/>
+              <w:spacing w:line="240" w:lineRule="auto"/>
+              <w:jc w:val="center"/>
+            </w:pPr>
+            <w:r>
+              <w:rPr>
+                <w:rFonts w:ascii="Times New Roman" w:hAnsi="Times New Roman"/>
+                <w:sz w:val="20"/>
+              </w:rPr>
+              <w:t xml:space="preserve">151 / 94</w:t>
+            </w:r>
+          </w:p>
+        </w:tc>
+        <w:tc>
+          <w:tcPr>
+            <w:tcW w:type="dxa" w:w="984"/>
+          </w:tcPr>
+          <w:p>
+            <w:pPr>
+              <w:pStyle w:val="Compact"/>
+              <w:spacing w:line="240" w:lineRule="auto"/>
+              <w:jc w:val="center"/>
+            </w:pPr>
+            <w:r>
+              <w:rPr>
+                <w:rFonts w:ascii="Times New Roman" w:hAnsi="Times New Roman"/>
+                <w:sz w:val="20"/>
+              </w:rPr>
+              <w:t xml:space="preserve">0.33 / 0.21</w:t>
+            </w:r>
+          </w:p>
+        </w:tc>
+        <w:tc>
+          <w:tcPr>
+            <w:tcW w:type="dxa" w:w="984"/>
+          </w:tcPr>
+          <w:p>
+            <w:pPr>
+              <w:pStyle w:val="Compact"/>
+              <w:spacing w:line="240" w:lineRule="auto"/>
+              <w:jc w:val="center"/>
+            </w:pPr>
+            <w:r>
+              <w:rPr>
+                <w:rFonts w:ascii="Times New Roman" w:hAnsi="Times New Roman"/>
+                <w:sz w:val="20"/>
+              </w:rPr>
+              <w:t xml:space="preserve">0.54</w:t>
+            </w:r>
+          </w:p>
+        </w:tc>
+        <w:tc>
+          <w:tcPr>
+            <w:tcW w:type="dxa" w:w="984"/>
+          </w:tcPr>
+          <w:p>
+            <w:pPr>
+              <w:pStyle w:val="Compact"/>
+              <w:spacing w:line="240" w:lineRule="auto"/>
+              <w:jc w:val="center"/>
+            </w:pPr>
+            <w:r>
+              <w:rPr>
+                <w:rFonts w:ascii="Times New Roman" w:hAnsi="Times New Roman"/>
+                <w:sz w:val="20"/>
+              </w:rPr>
+              <w:t xml:space="preserve">[1.0, 6.9)</w:t>
+            </w:r>
+          </w:p>
+        </w:tc>
+      </w:tr>
+      <w:tr>
+        <w:tc>
+          <w:tcPr>
+            <w:tcW w:type="dxa" w:w="3456"/>
+          </w:tcPr>
+          <w:p>
+            <w:pPr>
+              <w:pStyle w:val="Compact"/>
+              <w:spacing w:line="240" w:lineRule="auto"/>
+              <w:jc w:val="left"/>
+            </w:pPr>
+            <w:r>
+              <w:rPr>
+                <w:rFonts w:ascii="Times New Roman" w:hAnsi="Times New Roman"/>
+                <w:sz w:val="20"/>
+              </w:rPr>
+              <w:t xml:space="preserve">410M</w:t>
+            </w:r>
+          </w:p>
+        </w:tc>
+        <w:tc>
+          <w:tcPr>
+            <w:tcW w:type="dxa" w:w="984"/>
+          </w:tcPr>
+          <w:p>
+            <w:pPr>
+              <w:pStyle w:val="Compact"/>
+              <w:spacing w:line="240" w:lineRule="auto"/>
+              <w:jc w:val="center"/>
+            </w:pPr>
+            <w:r>
+              <w:rPr>
+                <w:rFonts w:ascii="Times New Roman" w:hAnsi="Times New Roman"/>
+                <w:sz w:val="20"/>
+              </w:rPr>
+              <w:t xml:space="preserve">0.492</w:t>
+            </w:r>
+          </w:p>
+        </w:tc>
+        <w:tc>
+          <w:tcPr>
+            <w:tcW w:type="dxa" w:w="984"/>
+          </w:tcPr>
+          <w:p>
+            <w:pPr>
+              <w:pStyle w:val="Compact"/>
+              <w:spacing w:line="240" w:lineRule="auto"/>
+              <w:jc w:val="center"/>
+            </w:pPr>
+            <w:r>
+              <w:rPr>
+                <w:rFonts w:ascii="Times New Roman" w:hAnsi="Times New Roman"/>
+                <w:sz w:val="20"/>
+              </w:rPr>
+              <w:t xml:space="preserve">0.637</w:t>
+            </w:r>
+          </w:p>
+        </w:tc>
+        <w:tc>
+          <w:tcPr>
+            <w:tcW w:type="dxa" w:w="984"/>
+          </w:tcPr>
+          <w:p>
+            <w:pPr>
+              <w:pStyle w:val="Compact"/>
+              <w:spacing w:line="240" w:lineRule="auto"/>
+              <w:jc w:val="center"/>
+            </w:pPr>
+            <w:r>
+              <w:rPr>
+                <w:rFonts w:ascii="Times New Roman" w:hAnsi="Times New Roman"/>
+                <w:sz w:val="20"/>
+              </w:rPr>
+              <w:t xml:space="preserve">763 / 322</w:t>
+            </w:r>
+          </w:p>
+        </w:tc>
+        <w:tc>
+          <w:tcPr>
+            <w:tcW w:type="dxa" w:w="984"/>
+          </w:tcPr>
+          <w:p>
+            <w:pPr>
+              <w:pStyle w:val="Compact"/>
+              <w:spacing w:line="240" w:lineRule="auto"/>
+              <w:jc w:val="center"/>
+            </w:pPr>
+            <w:r>
+              <w:rPr>
+                <w:rFonts w:ascii="Times New Roman" w:hAnsi="Times New Roman"/>
+                <w:sz w:val="20"/>
+              </w:rPr>
+              <w:t xml:space="preserve">0.67 / 0.28</w:t>
+            </w:r>
+          </w:p>
+        </w:tc>
+        <w:tc>
+          <w:tcPr>
+            <w:tcW w:type="dxa" w:w="984"/>
+          </w:tcPr>
+          <w:p>
+            <w:pPr>
+              <w:pStyle w:val="Compact"/>
+              <w:spacing w:line="240" w:lineRule="auto"/>
+              <w:jc w:val="center"/>
+            </w:pPr>
+            <w:r>
+              <w:rPr>
+                <w:rFonts w:ascii="Times New Roman" w:hAnsi="Times New Roman"/>
+                <w:sz w:val="20"/>
+              </w:rPr>
+              <w:t xml:space="preserve">0.21</w:t>
+            </w:r>
+          </w:p>
+        </w:tc>
+        <w:tc>
+          <w:tcPr>
+            <w:tcW w:type="dxa" w:w="984"/>
+          </w:tcPr>
+          <w:p>
+            <w:pPr>
+              <w:pStyle w:val="Compact"/>
+              <w:spacing w:line="240" w:lineRule="auto"/>
+              <w:jc w:val="center"/>
+            </w:pPr>
+            <w:r>
+              <w:rPr>
+                <w:rFonts w:ascii="Times New Roman" w:hAnsi="Times New Roman"/>
+                <w:sz w:val="20"/>
+              </w:rPr>
+              <w:t xml:space="preserve">never</w:t>
+            </w:r>
+          </w:p>
+        </w:tc>
+      </w:tr>
+    </w:tbl>
     <w:bookmarkEnd w:id="26"/>
     <w:bookmarkStart w:id="27" w:name="where-does-act-help"/>
     <w:p>
@@ -14910,7 +15709,7 @@
         <w:pStyle w:val="BodyText"/>
       </w:pPr>
       <w:r>
-        <w:t xml:space="preserve">In simulation ACT keeps a gain of 0.05 to 0.33 under both upgrade types and every task overlap (Table 8), so neither the upgrade type nor the task mismatch explains the exception. Calibrating on prompt and answer tokens leaves ACT level with copy on the smallest Pythia upgrade (</w:t>
+        <w:t xml:space="preserve">In simulation ACT keeps a gain of 0.05 to 0.33 under both upgrade types and every task overlap (Table 9), so neither the upgrade type nor the task mismatch explains the exception. Calibrating on prompt and answer tokens leaves ACT level with copy on the smallest Pythia upgrade (</w:t>
       </w:r>
       <m:oMath>
         <m:sSub>
@@ -16887,7 +17686,7 @@
         <w:t xml:space="preserve"> </w:t>
       </w:r>
       <w:r>
-        <w:t xml:space="preserve">is task-specific: the same upgrade can leave a summarization adapter nearly intact and a reasoning adapter badly degraded, so the measurement in step 1 should be repeated for each adapter that matters. Finally, a transfer method’s cost ratio depends on model scale and implementation (in our runs ACT’s rose from 0.14 to 0.70 between 70 and 410 million parameters), so</w:t>
+        <w:t xml:space="preserve">is task-specific: the same upgrade can leave a summarization adapter nearly intact and a reasoning adapter badly degraded, so the measurement in step 1 should be repeated for each adapter that matters. Finally, a transfer method’s cost ratio depends on model scale and implementation (in our first implementation ACT’s rose from 0.14 to 0.70 between 70 and 410 million parameters, and with cached layer inputs from 0.12 to 0.28), so</w:t>
       </w:r>
       <w:r>
         <w:t xml:space="preserve"> </w:t>
@@ -16934,7 +17733,7 @@
         <w:t xml:space="preserve"> </w:t>
       </w:r>
       <w:r>
-        <w:t xml:space="preserve">Our measurements suggest a practical default that depends on the size of the upgrade: when the model moved little, copying the old adapter restores most of the retraining benefit, the retraining threshold is high, and a transfer method must beat copying by only a few points, but at a cost it rarely does; when the model moved a lot, copying collapses, and a cheap closed-form transfer such as ACT can be the cheapest policy over a middle range of adapter values, although in our series its gain covered its cost only at the largest upgrade, and at 410 million parameters, where its compute cost relative to retraining rose to 0.70, not even there.</w:t>
+        <w:t xml:space="preserve">Our measurements suggest a practical default that depends on the size of the upgrade: when the model moved little, copying the old adapter restores most of the retraining benefit, the retraining threshold is high, and a transfer method must beat copying by only a few points, but at a cost it rarely does; when the model moved a lot, copying collapses, and a cheap closed-form transfer such as ACT can be the cheapest policy over a middle range of adapter values, although in our series its gain covered its cost only at the largest upgrade, and at 410 million parameters, where its compute cost relative to retraining was 0.70 (0.28 with cached layer inputs, still above its break-even of 0.21), not even there.</w:t>
       </w:r>
       <w:r>
         <w:t xml:space="preserve"> </w:t>
@@ -17024,7 +17823,7 @@
         <w:t xml:space="preserve"> </w:t>
       </w:r>
       <w:r>
-        <w:t xml:space="preserve">Third, the instruction-tuned pair is an unexplained exception, and we cannot say whether it reflects the upgrade type, the model scale, or something else. ACT’s relative compute cost rises with model size mainly because of repeated forward passes in our implementation (Section 7); we did not test whether caching removes the effect. Fourth, ACT’s gain rises steadily with upgrade size, but it covers ACT’s measured cost only at the largest upgrade, with the next largest narrowly short; the boundary lies between drifts of 0.56 and 0.60 for this implementation and cost, and it would move with a cheaper or better method. Fifth, value follows a stylized diffusion, and recovery is treated as known at the start of an epoch, whereas in</w:t>
+        <w:t xml:space="preserve">Third, the instruction-tuned pair is an unexplained exception, and we cannot say whether it reflects the upgrade type, the model scale, or something else. ACT’s relative compute cost rises with model size, mainly because of repeated forward passes in our first implementation; caching layer inputs reduces the rise (0.12, 0.21, and 0.28 at 70, 160, and 410 million parameters) but does not remove it (Section 7). Fourth, ACT’s gain rises steadily with upgrade size, but it covers ACT’s measured cost only at the largest upgrade, with the next largest narrowly short; the boundary lies between drifts of 0.56 and 0.60 for this implementation and cost, and it would move with a cheaper or better method. Fifth, value follows a stylized diffusion, and recovery is treated as known at the start of an epoch, whereas in</w:t>
       </w:r>
       <w:r>
         <w:t xml:space="preserve"> </w:t>

</xml_diff>